<commit_message>
feat: Actualización de la Hoja de Vida y componentes
</commit_message>
<xml_diff>
--- a/public/templates/hoja_de_vida_template.docx
+++ b/public/templates/hoja_de_vida_template.docx
@@ -156,7 +156,7 @@
           <w:lang w:val="es-CO" w:eastAsia="es-CO"/>
         </w:rPr>
         <w:drawing>
-          <wp:anchor distT="0" distB="0" distL="114300" distR="114300" simplePos="0" relativeHeight="251692544" behindDoc="1" locked="0" layoutInCell="1" allowOverlap="1" wp14:anchorId="0E1B33CF" wp14:editId="3F2E20EA">
+          <wp:anchor distT="0" distB="0" distL="114300" distR="114300" simplePos="0" relativeHeight="251692544" behindDoc="1" locked="0" layoutInCell="1" allowOverlap="1" wp14:anchorId="0E1B33CF" wp14:editId="3085C15B">
             <wp:simplePos x="0" y="0"/>
             <wp:positionH relativeFrom="column">
               <wp:posOffset>4093845</wp:posOffset>
@@ -493,8 +493,39 @@
                 <w:noProof/>
                 <w:sz w:val="26"/>
                 <w:szCs w:val="26"/>
-              </w:rPr>
-            </w:pPr>
+                <w:lang w:val="es-AR"/>
+              </w:rPr>
+            </w:pPr>
+            <w:r>
+              <w:rPr>
+                <w:rFonts w:ascii="Trebuchet MS" w:hAnsi="Trebuchet MS" w:cs="Arial"/>
+                <w:noProof/>
+                <w:sz w:val="26"/>
+                <w:szCs w:val="26"/>
+                <w:lang w:val="es-AR"/>
+              </w:rPr>
+              <w:t>{</w:t>
+            </w:r>
+            <w:r>
+              <w:rPr>
+                <w:rFonts w:ascii="Trebuchet MS" w:hAnsi="Trebuchet MS" w:cs="Arial"/>
+                <w:noProof/>
+                <w:sz w:val="26"/>
+                <w:szCs w:val="26"/>
+                <w:lang w:val="es-AR"/>
+              </w:rPr>
+              <w:t>documento_num</w:t>
+            </w:r>
+            <w:r>
+              <w:rPr>
+                <w:rFonts w:ascii="Trebuchet MS" w:hAnsi="Trebuchet MS" w:cs="Arial"/>
+                <w:noProof/>
+                <w:sz w:val="26"/>
+                <w:szCs w:val="26"/>
+                <w:lang w:val="es-AR"/>
+              </w:rPr>
+              <w:t>}</w:t>
+            </w:r>
           </w:p>
         </w:tc>
       </w:tr>
@@ -570,6 +601,15 @@
                 <w:szCs w:val="26"/>
               </w:rPr>
             </w:pPr>
+            <w:r>
+              <w:rPr>
+                <w:rFonts w:ascii="Trebuchet MS" w:hAnsi="Trebuchet MS" w:cs="Arial"/>
+                <w:noProof/>
+                <w:sz w:val="26"/>
+                <w:szCs w:val="26"/>
+              </w:rPr>
+              <w:t>{}</w:t>
+            </w:r>
           </w:p>
         </w:tc>
       </w:tr>
@@ -625,8 +665,37 @@
                 <w:noProof/>
                 <w:sz w:val="26"/>
                 <w:szCs w:val="26"/>
-              </w:rPr>
-            </w:pPr>
+                <w:lang w:val="es-AR"/>
+              </w:rPr>
+            </w:pPr>
+            <w:r>
+              <w:rPr>
+                <w:rFonts w:ascii="Trebuchet MS" w:hAnsi="Trebuchet MS" w:cs="Arial"/>
+                <w:noProof/>
+                <w:sz w:val="26"/>
+                <w:szCs w:val="26"/>
+              </w:rPr>
+              <w:t>{</w:t>
+            </w:r>
+            <w:r>
+              <w:rPr>
+                <w:rFonts w:ascii="Trebuchet MS" w:hAnsi="Trebuchet MS" w:cs="Arial"/>
+                <w:noProof/>
+                <w:sz w:val="26"/>
+                <w:szCs w:val="26"/>
+                <w:lang w:val="es-AR"/>
+              </w:rPr>
+              <w:t>fecha_nacimiento</w:t>
+            </w:r>
+            <w:r>
+              <w:rPr>
+                <w:rFonts w:ascii="Trebuchet MS" w:hAnsi="Trebuchet MS" w:cs="Arial"/>
+                <w:noProof/>
+                <w:sz w:val="26"/>
+                <w:szCs w:val="26"/>
+              </w:rPr>
+              <w:t>}</w:t>
+            </w:r>
           </w:p>
         </w:tc>
       </w:tr>
@@ -1058,8 +1127,38 @@
                 <w:noProof/>
                 <w:sz w:val="26"/>
                 <w:szCs w:val="26"/>
-              </w:rPr>
-            </w:pPr>
+                <w:lang w:val="es-AR"/>
+              </w:rPr>
+            </w:pPr>
+            <w:r>
+              <w:rPr>
+                <w:rFonts w:ascii="Trebuchet MS" w:hAnsi="Trebuchet MS" w:cs="Arial"/>
+                <w:noProof/>
+                <w:sz w:val="26"/>
+                <w:szCs w:val="26"/>
+              </w:rPr>
+              <w:t>{</w:t>
+            </w:r>
+            <w:r>
+              <w:rPr>
+                <w:rFonts w:ascii="Trebuchet MS" w:hAnsi="Trebuchet MS" w:cs="Arial"/>
+                <w:noProof/>
+                <w:sz w:val="26"/>
+                <w:szCs w:val="26"/>
+                <w:lang w:val="es-AR"/>
+              </w:rPr>
+              <w:t>direccion</w:t>
+            </w:r>
+            <w:r>
+              <w:rPr>
+                <w:rFonts w:ascii="Trebuchet MS" w:hAnsi="Trebuchet MS" w:cs="Arial"/>
+                <w:noProof/>
+                <w:sz w:val="26"/>
+                <w:szCs w:val="26"/>
+                <w:lang w:val="es-AR"/>
+              </w:rPr>
+              <w:t>}</w:t>
+            </w:r>
           </w:p>
         </w:tc>
       </w:tr>
@@ -1117,8 +1216,38 @@
                 <w:noProof/>
                 <w:sz w:val="26"/>
                 <w:szCs w:val="26"/>
-              </w:rPr>
-            </w:pPr>
+                <w:lang w:val="es-AR"/>
+              </w:rPr>
+            </w:pPr>
+            <w:r>
+              <w:rPr>
+                <w:rFonts w:ascii="Trebuchet MS" w:hAnsi="Trebuchet MS" w:cs="Arial"/>
+                <w:noProof/>
+                <w:sz w:val="26"/>
+                <w:szCs w:val="26"/>
+              </w:rPr>
+              <w:t>{</w:t>
+            </w:r>
+            <w:r>
+              <w:rPr>
+                <w:rFonts w:ascii="Trebuchet MS" w:hAnsi="Trebuchet MS" w:cs="Arial"/>
+                <w:noProof/>
+                <w:sz w:val="26"/>
+                <w:szCs w:val="26"/>
+                <w:lang w:val="es-AR"/>
+              </w:rPr>
+              <w:t>telefono</w:t>
+            </w:r>
+            <w:r>
+              <w:rPr>
+                <w:rFonts w:ascii="Trebuchet MS" w:hAnsi="Trebuchet MS" w:cs="Arial"/>
+                <w:noProof/>
+                <w:sz w:val="26"/>
+                <w:szCs w:val="26"/>
+                <w:lang w:val="es-AR"/>
+              </w:rPr>
+              <w:t>}</w:t>
+            </w:r>
           </w:p>
         </w:tc>
       </w:tr>
@@ -1175,8 +1304,37 @@
                 <w:noProof/>
                 <w:sz w:val="26"/>
                 <w:szCs w:val="26"/>
-              </w:rPr>
-            </w:pPr>
+                <w:lang w:val="es-AR"/>
+              </w:rPr>
+            </w:pPr>
+            <w:r>
+              <w:rPr>
+                <w:rFonts w:ascii="Trebuchet MS" w:hAnsi="Trebuchet MS" w:cs="Arial"/>
+                <w:noProof/>
+                <w:sz w:val="26"/>
+                <w:szCs w:val="26"/>
+              </w:rPr>
+              <w:t>{</w:t>
+            </w:r>
+            <w:r>
+              <w:rPr>
+                <w:rFonts w:ascii="Trebuchet MS" w:hAnsi="Trebuchet MS" w:cs="Arial"/>
+                <w:noProof/>
+                <w:sz w:val="26"/>
+                <w:szCs w:val="26"/>
+                <w:lang w:val="es-AR"/>
+              </w:rPr>
+              <w:t>email</w:t>
+            </w:r>
+            <w:r>
+              <w:rPr>
+                <w:rFonts w:ascii="Trebuchet MS" w:hAnsi="Trebuchet MS" w:cs="Arial"/>
+                <w:noProof/>
+                <w:sz w:val="26"/>
+                <w:szCs w:val="26"/>
+              </w:rPr>
+              <w:t>}</w:t>
+            </w:r>
           </w:p>
         </w:tc>
       </w:tr>
@@ -9876,7 +10034,7 @@
                       <a:effectLst/>
                       <a:extLst>
                         <a:ext uri="{C572A759-6A51-4108-AA02-DFA0A04FC94B}">
-                          <ma14:wrappingTextBoxFlag xmlns:arto="http://schemas.microsoft.com/office/word/2006/arto" xmlns="" xmlns:mo="http://schemas.microsoft.com/office/mac/office/2008/main" xmlns:mv="urn:schemas-microsoft-com:mac:vml" xmlns:o="urn:schemas-microsoft-com:office:office" xmlns:v="urn:schemas-microsoft-com:vml" xmlns:w10="urn:schemas-microsoft-com:office:word" xmlns:w="http://schemas.openxmlformats.org/wordprocessingml/2006/main" xmlns:ma14="http://schemas.microsoft.com/office/mac/drawingml/2011/main"/>
+                          <ma14:wrappingTextBoxFlag xmlns:ma14="http://schemas.microsoft.com/office/mac/drawingml/2011/main" xmlns:w="http://schemas.openxmlformats.org/wordprocessingml/2006/main" xmlns:w10="urn:schemas-microsoft-com:office:word" xmlns:v="urn:schemas-microsoft-com:vml" xmlns:o="urn:schemas-microsoft-com:office:office" xmlns:mv="urn:schemas-microsoft-com:mac:vml" xmlns:mo="http://schemas.microsoft.com/office/mac/office/2008/main" xmlns="" xmlns:arto="http://schemas.microsoft.com/office/word/2006/arto"/>
                         </a:ext>
                       </a:extLst>
                     </wps:spPr>

</xml_diff>

<commit_message>
feat: Sincronización final de Hoja de Vida con soporte de imagen y etiquetas actualizadas
</commit_message>
<xml_diff>
--- a/public/templates/hoja_de_vida_template.docx
+++ b/public/templates/hoja_de_vida_template.docx
@@ -19,12 +19,127 @@
           <w:noProof/>
           <w:sz w:val="26"/>
           <w:szCs w:val="26"/>
+        </w:rPr>
+        <mc:AlternateContent>
+          <mc:Choice Requires="wps">
+            <w:drawing>
+              <wp:anchor distT="45720" distB="45720" distL="114300" distR="114300" simplePos="0" relativeHeight="251701760" behindDoc="0" locked="0" layoutInCell="1" allowOverlap="1" wp14:anchorId="7743C4BB" wp14:editId="30724B93">
+                <wp:simplePos x="0" y="0"/>
+                <wp:positionH relativeFrom="column">
+                  <wp:posOffset>3766185</wp:posOffset>
+                </wp:positionH>
+                <wp:positionV relativeFrom="paragraph">
+                  <wp:posOffset>39370</wp:posOffset>
+                </wp:positionV>
+                <wp:extent cx="2705100" cy="2156460"/>
+                <wp:effectExtent l="0" t="0" r="19050" b="15240"/>
+                <wp:wrapNone/>
+                <wp:docPr id="1" name="Cuadro de texto 2"/>
+                <wp:cNvGraphicFramePr>
+                  <a:graphicFrameLocks xmlns:a="http://schemas.openxmlformats.org/drawingml/2006/main"/>
+                </wp:cNvGraphicFramePr>
+                <a:graphic xmlns:a="http://schemas.openxmlformats.org/drawingml/2006/main">
+                  <a:graphicData uri="http://schemas.microsoft.com/office/word/2010/wordprocessingShape">
+                    <wps:wsp>
+                      <wps:cNvSpPr txBox="1">
+                        <a:spLocks noChangeArrowheads="1"/>
+                      </wps:cNvSpPr>
+                      <wps:spPr bwMode="auto">
+                        <a:xfrm>
+                          <a:off x="0" y="0"/>
+                          <a:ext cx="2705100" cy="2156460"/>
+                        </a:xfrm>
+                        <a:prstGeom prst="rect">
+                          <a:avLst/>
+                        </a:prstGeom>
+                        <a:solidFill>
+                          <a:srgbClr val="FFFFFF"/>
+                        </a:solidFill>
+                        <a:ln w="9525">
+                          <a:solidFill>
+                            <a:srgbClr val="000000"/>
+                          </a:solidFill>
+                          <a:miter lim="800000"/>
+                          <a:headEnd/>
+                          <a:tailEnd/>
+                        </a:ln>
+                      </wps:spPr>
+                      <wps:txbx>
+                        <w:txbxContent>
+                          <w:p>
+                            <w:r>
+                              <w:t>{%</w:t>
+                            </w:r>
+                            <w:proofErr w:type="spellStart"/>
+                            <w:r>
+                              <w:t>foto_perfil</w:t>
+                            </w:r>
+                            <w:proofErr w:type="spellEnd"/>
+                            <w:r>
+                              <w:t>}</w:t>
+                            </w:r>
+                          </w:p>
+                          <w:p/>
+                        </w:txbxContent>
+                      </wps:txbx>
+                      <wps:bodyPr rot="0" vert="horz" wrap="square" lIns="91440" tIns="45720" rIns="91440" bIns="45720" anchor="t" anchorCtr="0">
+                        <a:noAutofit/>
+                      </wps:bodyPr>
+                    </wps:wsp>
+                  </a:graphicData>
+                </a:graphic>
+                <wp14:sizeRelH relativeFrom="margin">
+                  <wp14:pctWidth>0</wp14:pctWidth>
+                </wp14:sizeRelH>
+                <wp14:sizeRelV relativeFrom="margin">
+                  <wp14:pctHeight>0</wp14:pctHeight>
+                </wp14:sizeRelV>
+              </wp:anchor>
+            </w:drawing>
+          </mc:Choice>
+          <mc:Fallback>
+            <w:pict>
+              <v:shapetype w14:anchorId="7743C4BB" id="_x0000_t202" coordsize="21600,21600" o:spt="202" path="m,l,21600r21600,l21600,xe">
+                <v:stroke joinstyle="miter"/>
+                <v:path gradientshapeok="t" o:connecttype="rect"/>
+              </v:shapetype>
+              <v:shape id="Cuadro de texto 2" o:spid="_x0000_s1026" type="#_x0000_t202" style="position:absolute;margin-left:296.55pt;margin-top:3.1pt;width:213pt;height:169.8pt;z-index:251701760;visibility:visible;mso-wrap-style:square;mso-width-percent:0;mso-height-percent:0;mso-wrap-distance-left:9pt;mso-wrap-distance-top:3.6pt;mso-wrap-distance-right:9pt;mso-wrap-distance-bottom:3.6pt;mso-position-horizontal:absolute;mso-position-horizontal-relative:text;mso-position-vertical:absolute;mso-position-vertical-relative:text;mso-width-percent:0;mso-height-percent:0;mso-width-relative:margin;mso-height-relative:margin;v-text-anchor:top" o:gfxdata="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">
+                <v:textbox>
+                  <w:txbxContent>
+                    <w:p>
+                      <w:r>
+                        <w:t>{%</w:t>
+                      </w:r>
+                      <w:proofErr w:type="spellStart"/>
+                      <w:r>
+                        <w:t>foto_perfil</w:t>
+                      </w:r>
+                      <w:proofErr w:type="spellEnd"/>
+                      <w:r>
+                        <w:t>}</w:t>
+                      </w:r>
+                    </w:p>
+                    <w:p/>
+                  </w:txbxContent>
+                </v:textbox>
+              </v:shape>
+            </w:pict>
+          </mc:Fallback>
+        </mc:AlternateContent>
+      </w:r>
+      <w:r>
+        <w:rPr>
+          <w:rFonts w:ascii="Calibri Light" w:hAnsi="Calibri Light" w:cs="Calibri Light"/>
+          <w:i/>
+          <w:noProof/>
+          <w:sz w:val="26"/>
+          <w:szCs w:val="26"/>
           <w:lang w:val="es-CO" w:eastAsia="es-CO"/>
         </w:rPr>
         <mc:AlternateContent>
           <mc:Choice Requires="wps">
             <w:drawing>
-              <wp:anchor distT="45720" distB="45720" distL="114300" distR="114300" simplePos="0" relativeHeight="251691520" behindDoc="0" locked="0" layoutInCell="1" allowOverlap="1" wp14:anchorId="5EFEE21D" wp14:editId="3B9B3FAB">
+              <wp:anchor distT="45720" distB="45720" distL="114300" distR="114300" simplePos="0" relativeHeight="251691520" behindDoc="0" locked="0" layoutInCell="1" allowOverlap="1" wp14:anchorId="5EFEE21D" wp14:editId="6C238620">
                 <wp:simplePos x="0" y="0"/>
                 <wp:positionH relativeFrom="margin">
                   <wp:posOffset>-318135</wp:posOffset>
@@ -111,11 +226,7 @@
           </mc:Choice>
           <mc:Fallback>
             <w:pict>
-              <v:shapetype w14:anchorId="5EFEE21D" id="_x0000_t202" coordsize="21600,21600" o:spt="202" path="m,l,21600r21600,l21600,xe">
-                <v:stroke joinstyle="miter"/>
-                <v:path gradientshapeok="t" o:connecttype="rect"/>
-              </v:shapetype>
-              <v:shape id="Cuadro de texto 2" o:spid="_x0000_s1026" type="#_x0000_t202" style="position:absolute;margin-left:-25.05pt;margin-top:17.65pt;width:314.4pt;height:155.25pt;z-index:251691520;visibility:visible;mso-wrap-style:square;mso-width-percent:0;mso-height-percent:0;mso-wrap-distance-left:9pt;mso-wrap-distance-top:3.6pt;mso-wrap-distance-right:9pt;mso-wrap-distance-bottom:3.6pt;mso-position-horizontal:absolute;mso-position-horizontal-relative:margin;mso-position-vertical:absolute;mso-position-vertical-relative:text;mso-width-percent:0;mso-height-percent:0;mso-width-relative:margin;mso-height-relative:margin;v-text-anchor:top" o:gfxdata="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" filled="f" strokecolor="#548dd4 [1951]">
+              <v:shape w14:anchorId="5EFEE21D" id="_x0000_s1027" type="#_x0000_t202" style="position:absolute;margin-left:-25.05pt;margin-top:17.65pt;width:314.4pt;height:155.25pt;z-index:251691520;visibility:visible;mso-wrap-style:square;mso-width-percent:0;mso-height-percent:0;mso-wrap-distance-left:9pt;mso-wrap-distance-top:3.6pt;mso-wrap-distance-right:9pt;mso-wrap-distance-bottom:3.6pt;mso-position-horizontal:absolute;mso-position-horizontal-relative:margin;mso-position-vertical:absolute;mso-position-vertical-relative:text;mso-width-percent:0;mso-height-percent:0;mso-width-relative:margin;mso-height-relative:margin;v-text-anchor:top" o:gfxdata="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" filled="f" strokecolor="#548dd4 [1951]">
                 <v:textbox>
                   <w:txbxContent>
                     <w:p>
@@ -149,68 +260,6 @@
             </w:pict>
           </mc:Fallback>
         </mc:AlternateContent>
-      </w:r>
-      <w:r>
-        <w:rPr>
-          <w:noProof/>
-          <w:lang w:val="es-CO" w:eastAsia="es-CO"/>
-        </w:rPr>
-        <w:drawing>
-          <wp:anchor distT="0" distB="0" distL="114300" distR="114300" simplePos="0" relativeHeight="251692544" behindDoc="1" locked="0" layoutInCell="1" allowOverlap="1" wp14:anchorId="0E1B33CF" wp14:editId="3085C15B">
-            <wp:simplePos x="0" y="0"/>
-            <wp:positionH relativeFrom="column">
-              <wp:posOffset>4093845</wp:posOffset>
-            </wp:positionH>
-            <wp:positionV relativeFrom="paragraph">
-              <wp:posOffset>-6350</wp:posOffset>
-            </wp:positionV>
-            <wp:extent cx="1988820" cy="1988820"/>
-            <wp:effectExtent l="0" t="0" r="0" b="0"/>
-            <wp:wrapNone/>
-            <wp:docPr id="2" name="Imagen 2" descr="User - Free social media icons"/>
-            <wp:cNvGraphicFramePr>
-              <a:graphicFrameLocks xmlns:a="http://schemas.openxmlformats.org/drawingml/2006/main" noChangeAspect="1"/>
-            </wp:cNvGraphicFramePr>
-            <a:graphic xmlns:a="http://schemas.openxmlformats.org/drawingml/2006/main">
-              <a:graphicData uri="http://schemas.openxmlformats.org/drawingml/2006/picture">
-                <pic:pic xmlns:pic="http://schemas.openxmlformats.org/drawingml/2006/picture">
-                  <pic:nvPicPr>
-                    <pic:cNvPr id="0" name="Picture 1" descr="User - Free social media icons"/>
-                    <pic:cNvPicPr>
-                      <a:picLocks noChangeAspect="1" noChangeArrowheads="1"/>
-                    </pic:cNvPicPr>
-                  </pic:nvPicPr>
-                  <pic:blipFill>
-                    <a:blip r:embed="rId8" cstate="print">
-                      <a:extLst>
-                        <a:ext uri="{28A0092B-C50C-407E-A947-70E740481C1C}">
-                          <a14:useLocalDpi xmlns:a14="http://schemas.microsoft.com/office/drawing/2010/main" val="0"/>
-                        </a:ext>
-                      </a:extLst>
-                    </a:blip>
-                    <a:srcRect/>
-                    <a:stretch>
-                      <a:fillRect/>
-                    </a:stretch>
-                  </pic:blipFill>
-                  <pic:spPr bwMode="auto">
-                    <a:xfrm>
-                      <a:off x="0" y="0"/>
-                      <a:ext cx="1988820" cy="1988820"/>
-                    </a:xfrm>
-                    <a:prstGeom prst="rect">
-                      <a:avLst/>
-                    </a:prstGeom>
-                    <a:noFill/>
-                    <a:ln>
-                      <a:noFill/>
-                    </a:ln>
-                  </pic:spPr>
-                </pic:pic>
-              </a:graphicData>
-            </a:graphic>
-          </wp:anchor>
-        </w:drawing>
       </w:r>
       <w:r>
         <w:rPr>
@@ -9580,8 +9629,8 @@
       </w:r>
     </w:p>
     <w:sectPr>
-      <w:headerReference w:type="default" r:id="rId9"/>
-      <w:footerReference w:type="default" r:id="rId10"/>
+      <w:headerReference w:type="default" r:id="rId8"/>
+      <w:footerReference w:type="default" r:id="rId9"/>
       <w:pgSz w:w="12240" w:h="15840"/>
       <w:pgMar w:top="1702" w:right="1701" w:bottom="993" w:left="1701" w:header="426" w:footer="708" w:gutter="0"/>
       <w:cols w:space="708"/>
@@ -10034,7 +10083,7 @@
                       <a:effectLst/>
                       <a:extLst>
                         <a:ext uri="{C572A759-6A51-4108-AA02-DFA0A04FC94B}">
-                          <ma14:wrappingTextBoxFlag xmlns:ma14="http://schemas.microsoft.com/office/mac/drawingml/2011/main" xmlns:w="http://schemas.openxmlformats.org/wordprocessingml/2006/main" xmlns:w10="urn:schemas-microsoft-com:office:word" xmlns:v="urn:schemas-microsoft-com:vml" xmlns:o="urn:schemas-microsoft-com:office:office" xmlns:mv="urn:schemas-microsoft-com:mac:vml" xmlns:mo="http://schemas.microsoft.com/office/mac/office/2008/main" xmlns="" xmlns:arto="http://schemas.microsoft.com/office/word/2006/arto"/>
+                          <ma14:wrappingTextBoxFlag xmlns:arto="http://schemas.microsoft.com/office/word/2006/arto" xmlns="" xmlns:mo="http://schemas.microsoft.com/office/mac/office/2008/main" xmlns:mv="urn:schemas-microsoft-com:mac:vml" xmlns:o="urn:schemas-microsoft-com:office:office" xmlns:v="urn:schemas-microsoft-com:vml" xmlns:w10="urn:schemas-microsoft-com:office:word" xmlns:w="http://schemas.openxmlformats.org/wordprocessingml/2006/main" xmlns:ma14="http://schemas.microsoft.com/office/mac/drawingml/2011/main"/>
                         </a:ext>
                       </a:extLst>
                     </wps:spPr>
@@ -10754,6 +10803,7 @@
   <w:style w:type="character" w:default="1" w:styleId="Fuentedeprrafopredeter">
     <w:name w:val="Default Paragraph Font"/>
     <w:uiPriority w:val="1"/>
+    <w:semiHidden/>
     <w:unhideWhenUsed/>
   </w:style>
   <w:style w:type="table" w:default="1" w:styleId="Tablanormal">

</xml_diff>

<commit_message>
docs: update hoja de vida template with the latest version
</commit_message>
<xml_diff>
--- a/public/templates/hoja_de_vida_template.docx
+++ b/public/templates/hoja_de_vida_template.docx
@@ -8633,7 +8633,7 @@
           </mc:Choice>
           <mc:Fallback>
             <w:pict>
-              <v:rect w14:anchorId="12CC099D" id="Rectángulo 4" o:spid="_x0000_s1027" style="position:absolute;margin-left:-22.8pt;margin-top:18.55pt;width:509.25pt;height:161.25pt;z-index:251697664;visibility:visible;mso-wrap-style:square;mso-width-percent:0;mso-height-percent:0;mso-wrap-distance-left:9pt;mso-wrap-distance-top:0;mso-wrap-distance-right:9pt;mso-wrap-distance-bottom:0;mso-position-horizontal:absolute;mso-position-horizontal-relative:text;mso-position-vertical:absolute;mso-position-vertical-relative:text;mso-width-percent:0;mso-height-percent:0;mso-width-relative:margin;mso-height-relative:margin;v-text-anchor:top" o:gfxdata="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" filled="f" strokecolor="#31849b [2408]">
+              <v:rect w14:anchorId="12CC099D" id="Rectángulo 4" o:spid="_x0000_s1028" style="position:absolute;margin-left:-22.8pt;margin-top:18.55pt;width:509.25pt;height:161.25pt;z-index:251697664;visibility:visible;mso-wrap-style:square;mso-width-percent:0;mso-height-percent:0;mso-wrap-distance-left:9pt;mso-wrap-distance-top:0;mso-wrap-distance-right:9pt;mso-wrap-distance-bottom:0;mso-position-horizontal:absolute;mso-position-horizontal-relative:text;mso-position-vertical:absolute;mso-position-vertical-relative:text;mso-width-percent:0;mso-height-percent:0;mso-width-relative:margin;mso-height-relative:margin;v-text-anchor:top" o:gfxdata="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" filled="f" strokecolor="#31849b [2408]">
                 <v:textbox>
                   <w:txbxContent>
                     <w:p>
@@ -9537,7 +9537,7 @@
           </mc:Choice>
           <mc:Fallback>
             <w:pict>
-              <v:rect w14:anchorId="45FEC26B" id="Rectángulo 7" o:spid="_x0000_s1028" style="position:absolute;margin-left:195.45pt;margin-top:6.45pt;width:20.25pt;height:15pt;z-index:251698688;visibility:visible;mso-wrap-style:square;mso-width-percent:0;mso-height-percent:0;mso-wrap-distance-left:9pt;mso-wrap-distance-top:0;mso-wrap-distance-right:9pt;mso-wrap-distance-bottom:0;mso-position-horizontal:absolute;mso-position-horizontal-relative:text;mso-position-vertical:absolute;mso-position-vertical-relative:text;mso-width-percent:0;mso-height-percent:0;mso-width-relative:margin;mso-height-relative:margin;v-text-anchor:middle" o:gfxdata="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" fillcolor="white [3201]" strokecolor="black [3200]" strokeweight=".25pt">
+              <v:rect w14:anchorId="45FEC26B" id="Rectángulo 7" o:spid="_x0000_s1029" style="position:absolute;margin-left:195.45pt;margin-top:6.45pt;width:20.25pt;height:15pt;z-index:251698688;visibility:visible;mso-wrap-style:square;mso-width-percent:0;mso-height-percent:0;mso-wrap-distance-left:9pt;mso-wrap-distance-top:0;mso-wrap-distance-right:9pt;mso-wrap-distance-bottom:0;mso-position-horizontal:absolute;mso-position-horizontal-relative:text;mso-position-vertical:absolute;mso-position-vertical-relative:text;mso-width-percent:0;mso-height-percent:0;mso-width-relative:margin;mso-height-relative:margin;v-text-anchor:middle" o:gfxdata="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" fillcolor="white [3201]" strokecolor="black [3200]" strokeweight=".25pt">
                 <v:textbox>
                   <w:txbxContent>
                     <w:p>
@@ -9629,8 +9629,12 @@
       </w:r>
     </w:p>
     <w:sectPr>
-      <w:headerReference w:type="default" r:id="rId8"/>
-      <w:footerReference w:type="default" r:id="rId9"/>
+      <w:headerReference w:type="even" r:id="rId8"/>
+      <w:headerReference w:type="default" r:id="rId9"/>
+      <w:footerReference w:type="even" r:id="rId10"/>
+      <w:footerReference w:type="default" r:id="rId11"/>
+      <w:headerReference w:type="first" r:id="rId12"/>
+      <w:footerReference w:type="first" r:id="rId13"/>
       <w:pgSz w:w="12240" w:h="15840"/>
       <w:pgMar w:top="1702" w:right="1701" w:bottom="993" w:left="1701" w:header="426" w:footer="708" w:gutter="0"/>
       <w:cols w:space="708"/>
@@ -9660,6 +9664,16 @@
 </file>
 
 <file path=word/footer1.xml><?xml version="1.0" encoding="utf-8"?>
+<w:ftr xmlns:wpc="http://schemas.microsoft.com/office/word/2010/wordprocessingCanvas" xmlns:cx="http://schemas.microsoft.com/office/drawing/2014/chartex" xmlns:cx1="http://schemas.microsoft.com/office/drawing/2015/9/8/chartex" xmlns:cx2="http://schemas.microsoft.com/office/drawing/2015/10/21/chartex" xmlns:cx3="http://schemas.microsoft.com/office/drawing/2016/5/9/chartex" xmlns:cx4="http://schemas.microsoft.com/office/drawing/2016/5/10/chartex" xmlns:cx5="http://schemas.microsoft.com/office/drawing/2016/5/11/chartex" xmlns:cx6="http://schemas.microsoft.com/office/drawing/2016/5/12/chartex" xmlns:cx7="http://schemas.microsoft.com/office/drawing/2016/5/13/chartex" xmlns:cx8="http://schemas.microsoft.com/office/drawing/2016/5/14/chartex" xmlns:mc="http://schemas.openxmlformats.org/markup-compatibility/2006" xmlns:aink="http://schemas.microsoft.com/office/drawing/2016/ink" xmlns:am3d="http://schemas.microsoft.com/office/drawing/2017/model3d" xmlns:o="urn:schemas-microsoft-com:office:office" xmlns:oel="http://schemas.microsoft.com/office/2019/extlst" xmlns:r="http://schemas.openxmlformats.org/officeDocument/2006/relationships" xmlns:m="http://schemas.openxmlformats.org/officeDocument/2006/math" xmlns:v="urn:schemas-microsoft-com:vml" xmlns:wp14="http://schemas.microsoft.com/office/word/2010/wordprocessingDrawing" xmlns:wp="http://schemas.openxmlformats.org/drawingml/2006/wordprocessingDrawing" xmlns:w10="urn:schemas-microsoft-com:office:word" xmlns:w="http://schemas.openxmlformats.org/wordprocessingml/2006/main" xmlns:w14="http://schemas.microsoft.com/office/word/2010/wordml" xmlns:w15="http://schemas.microsoft.com/office/word/2012/wordml" xmlns:w16cex="http://schemas.microsoft.com/office/word/2018/wordml/cex" xmlns:w16cid="http://schemas.microsoft.com/office/word/2016/wordml/cid" xmlns:w16="http://schemas.microsoft.com/office/word/2018/wordml" xmlns:w16sdtdh="http://schemas.microsoft.com/office/word/2020/wordml/sdtdatahash" xmlns:w16se="http://schemas.microsoft.com/office/word/2015/wordml/symex" xmlns:wpg="http://schemas.microsoft.com/office/word/2010/wordprocessingGroup" xmlns:wpi="http://schemas.microsoft.com/office/word/2010/wordprocessingInk" xmlns:wne="http://schemas.microsoft.com/office/word/2006/wordml" xmlns:wps="http://schemas.microsoft.com/office/word/2010/wordprocessingShape" mc:Ignorable="w14 w15 w16se w16cid w16 w16cex w16sdtdh wp14">
+  <w:p>
+    <w:pPr>
+      <w:pStyle w:val="Piedepgina"/>
+    </w:pPr>
+  </w:p>
+</w:ftr>
+</file>
+
+<file path=word/footer2.xml><?xml version="1.0" encoding="utf-8"?>
 <w:ftr xmlns:wpc="http://schemas.microsoft.com/office/word/2010/wordprocessingCanvas" xmlns:cx="http://schemas.microsoft.com/office/drawing/2014/chartex" xmlns:cx1="http://schemas.microsoft.com/office/drawing/2015/9/8/chartex" xmlns:cx2="http://schemas.microsoft.com/office/drawing/2015/10/21/chartex" xmlns:cx3="http://schemas.microsoft.com/office/drawing/2016/5/9/chartex" xmlns:cx4="http://schemas.microsoft.com/office/drawing/2016/5/10/chartex" xmlns:cx5="http://schemas.microsoft.com/office/drawing/2016/5/11/chartex" xmlns:cx6="http://schemas.microsoft.com/office/drawing/2016/5/12/chartex" xmlns:cx7="http://schemas.microsoft.com/office/drawing/2016/5/13/chartex" xmlns:cx8="http://schemas.microsoft.com/office/drawing/2016/5/14/chartex" xmlns:mc="http://schemas.openxmlformats.org/markup-compatibility/2006" xmlns:aink="http://schemas.microsoft.com/office/drawing/2016/ink" xmlns:am3d="http://schemas.microsoft.com/office/drawing/2017/model3d" xmlns:o="urn:schemas-microsoft-com:office:office" xmlns:oel="http://schemas.microsoft.com/office/2019/extlst" xmlns:r="http://schemas.openxmlformats.org/officeDocument/2006/relationships" xmlns:m="http://schemas.openxmlformats.org/officeDocument/2006/math" xmlns:v="urn:schemas-microsoft-com:vml" xmlns:wp14="http://schemas.microsoft.com/office/word/2010/wordprocessingDrawing" xmlns:wp="http://schemas.openxmlformats.org/drawingml/2006/wordprocessingDrawing" xmlns:w10="urn:schemas-microsoft-com:office:word" xmlns:w="http://schemas.openxmlformats.org/wordprocessingml/2006/main" xmlns:w14="http://schemas.microsoft.com/office/word/2010/wordml" xmlns:w15="http://schemas.microsoft.com/office/word/2012/wordml" xmlns:w16cex="http://schemas.microsoft.com/office/word/2018/wordml/cex" xmlns:w16cid="http://schemas.microsoft.com/office/word/2016/wordml/cid" xmlns:w16="http://schemas.microsoft.com/office/word/2018/wordml" xmlns:w16sdtdh="http://schemas.microsoft.com/office/word/2020/wordml/sdtdatahash" xmlns:w16se="http://schemas.microsoft.com/office/word/2015/wordml/symex" xmlns:wpg="http://schemas.microsoft.com/office/word/2010/wordprocessingGroup" xmlns:wpi="http://schemas.microsoft.com/office/word/2010/wordprocessingInk" xmlns:wne="http://schemas.microsoft.com/office/word/2006/wordml" xmlns:wps="http://schemas.microsoft.com/office/word/2010/wordprocessingShape" mc:Ignorable="w14 w15 w16se w16cid w16 w16cex w16sdtdh wp14">
   <w:p>
     <w:pPr>
@@ -9734,6 +9748,16 @@
 </w:ftr>
 </file>
 
+<file path=word/footer3.xml><?xml version="1.0" encoding="utf-8"?>
+<w:ftr xmlns:wpc="http://schemas.microsoft.com/office/word/2010/wordprocessingCanvas" xmlns:cx="http://schemas.microsoft.com/office/drawing/2014/chartex" xmlns:cx1="http://schemas.microsoft.com/office/drawing/2015/9/8/chartex" xmlns:cx2="http://schemas.microsoft.com/office/drawing/2015/10/21/chartex" xmlns:cx3="http://schemas.microsoft.com/office/drawing/2016/5/9/chartex" xmlns:cx4="http://schemas.microsoft.com/office/drawing/2016/5/10/chartex" xmlns:cx5="http://schemas.microsoft.com/office/drawing/2016/5/11/chartex" xmlns:cx6="http://schemas.microsoft.com/office/drawing/2016/5/12/chartex" xmlns:cx7="http://schemas.microsoft.com/office/drawing/2016/5/13/chartex" xmlns:cx8="http://schemas.microsoft.com/office/drawing/2016/5/14/chartex" xmlns:mc="http://schemas.openxmlformats.org/markup-compatibility/2006" xmlns:aink="http://schemas.microsoft.com/office/drawing/2016/ink" xmlns:am3d="http://schemas.microsoft.com/office/drawing/2017/model3d" xmlns:o="urn:schemas-microsoft-com:office:office" xmlns:oel="http://schemas.microsoft.com/office/2019/extlst" xmlns:r="http://schemas.openxmlformats.org/officeDocument/2006/relationships" xmlns:m="http://schemas.openxmlformats.org/officeDocument/2006/math" xmlns:v="urn:schemas-microsoft-com:vml" xmlns:wp14="http://schemas.microsoft.com/office/word/2010/wordprocessingDrawing" xmlns:wp="http://schemas.openxmlformats.org/drawingml/2006/wordprocessingDrawing" xmlns:w10="urn:schemas-microsoft-com:office:word" xmlns:w="http://schemas.openxmlformats.org/wordprocessingml/2006/main" xmlns:w14="http://schemas.microsoft.com/office/word/2010/wordml" xmlns:w15="http://schemas.microsoft.com/office/word/2012/wordml" xmlns:w16cex="http://schemas.microsoft.com/office/word/2018/wordml/cex" xmlns:w16cid="http://schemas.microsoft.com/office/word/2016/wordml/cid" xmlns:w16="http://schemas.microsoft.com/office/word/2018/wordml" xmlns:w16sdtdh="http://schemas.microsoft.com/office/word/2020/wordml/sdtdatahash" xmlns:w16se="http://schemas.microsoft.com/office/word/2015/wordml/symex" xmlns:wpg="http://schemas.microsoft.com/office/word/2010/wordprocessingGroup" xmlns:wpi="http://schemas.microsoft.com/office/word/2010/wordprocessingInk" xmlns:wne="http://schemas.microsoft.com/office/word/2006/wordml" xmlns:wps="http://schemas.microsoft.com/office/word/2010/wordprocessingShape" mc:Ignorable="w14 w15 w16se w16cid w16 w16cex w16sdtdh wp14">
+  <w:p>
+    <w:pPr>
+      <w:pStyle w:val="Piedepgina"/>
+    </w:pPr>
+  </w:p>
+</w:ftr>
+</file>
+
 <file path=word/footnotes.xml><?xml version="1.0" encoding="utf-8"?>
 <w:footnotes xmlns:wpc="http://schemas.microsoft.com/office/word/2010/wordprocessingCanvas" xmlns:cx="http://schemas.microsoft.com/office/drawing/2014/chartex" xmlns:cx1="http://schemas.microsoft.com/office/drawing/2015/9/8/chartex" xmlns:cx2="http://schemas.microsoft.com/office/drawing/2015/10/21/chartex" xmlns:cx3="http://schemas.microsoft.com/office/drawing/2016/5/9/chartex" xmlns:cx4="http://schemas.microsoft.com/office/drawing/2016/5/10/chartex" xmlns:cx5="http://schemas.microsoft.com/office/drawing/2016/5/11/chartex" xmlns:cx6="http://schemas.microsoft.com/office/drawing/2016/5/12/chartex" xmlns:cx7="http://schemas.microsoft.com/office/drawing/2016/5/13/chartex" xmlns:cx8="http://schemas.microsoft.com/office/drawing/2016/5/14/chartex" xmlns:mc="http://schemas.openxmlformats.org/markup-compatibility/2006" xmlns:aink="http://schemas.microsoft.com/office/drawing/2016/ink" xmlns:am3d="http://schemas.microsoft.com/office/drawing/2017/model3d" xmlns:o="urn:schemas-microsoft-com:office:office" xmlns:oel="http://schemas.microsoft.com/office/2019/extlst" xmlns:r="http://schemas.openxmlformats.org/officeDocument/2006/relationships" xmlns:m="http://schemas.openxmlformats.org/officeDocument/2006/math" xmlns:v="urn:schemas-microsoft-com:vml" xmlns:wp14="http://schemas.microsoft.com/office/word/2010/wordprocessingDrawing" xmlns:wp="http://schemas.openxmlformats.org/drawingml/2006/wordprocessingDrawing" xmlns:w10="urn:schemas-microsoft-com:office:word" xmlns:w="http://schemas.openxmlformats.org/wordprocessingml/2006/main" xmlns:w14="http://schemas.microsoft.com/office/word/2010/wordml" xmlns:w15="http://schemas.microsoft.com/office/word/2012/wordml" xmlns:w16cex="http://schemas.microsoft.com/office/word/2018/wordml/cex" xmlns:w16cid="http://schemas.microsoft.com/office/word/2016/wordml/cid" xmlns:w16="http://schemas.microsoft.com/office/word/2018/wordml" xmlns:w16sdtdh="http://schemas.microsoft.com/office/word/2020/wordml/sdtdatahash" xmlns:w16se="http://schemas.microsoft.com/office/word/2015/wordml/symex" xmlns:wpg="http://schemas.microsoft.com/office/word/2010/wordprocessingGroup" xmlns:wpi="http://schemas.microsoft.com/office/word/2010/wordprocessingInk" xmlns:wne="http://schemas.microsoft.com/office/word/2006/wordml" xmlns:wps="http://schemas.microsoft.com/office/word/2010/wordprocessingShape" mc:Ignorable="w14 w15 w16se w16cid w16 w16cex w16sdtdh wp14">
   <w:footnote w:type="separator" w:id="-1">
@@ -9757,6 +9781,16 @@
 <w:hdr xmlns:wpc="http://schemas.microsoft.com/office/word/2010/wordprocessingCanvas" xmlns:cx="http://schemas.microsoft.com/office/drawing/2014/chartex" xmlns:cx1="http://schemas.microsoft.com/office/drawing/2015/9/8/chartex" xmlns:cx2="http://schemas.microsoft.com/office/drawing/2015/10/21/chartex" xmlns:cx3="http://schemas.microsoft.com/office/drawing/2016/5/9/chartex" xmlns:cx4="http://schemas.microsoft.com/office/drawing/2016/5/10/chartex" xmlns:cx5="http://schemas.microsoft.com/office/drawing/2016/5/11/chartex" xmlns:cx6="http://schemas.microsoft.com/office/drawing/2016/5/12/chartex" xmlns:cx7="http://schemas.microsoft.com/office/drawing/2016/5/13/chartex" xmlns:cx8="http://schemas.microsoft.com/office/drawing/2016/5/14/chartex" xmlns:mc="http://schemas.openxmlformats.org/markup-compatibility/2006" xmlns:aink="http://schemas.microsoft.com/office/drawing/2016/ink" xmlns:am3d="http://schemas.microsoft.com/office/drawing/2017/model3d" xmlns:o="urn:schemas-microsoft-com:office:office" xmlns:oel="http://schemas.microsoft.com/office/2019/extlst" xmlns:r="http://schemas.openxmlformats.org/officeDocument/2006/relationships" xmlns:m="http://schemas.openxmlformats.org/officeDocument/2006/math" xmlns:v="urn:schemas-microsoft-com:vml" xmlns:wp14="http://schemas.microsoft.com/office/word/2010/wordprocessingDrawing" xmlns:wp="http://schemas.openxmlformats.org/drawingml/2006/wordprocessingDrawing" xmlns:w10="urn:schemas-microsoft-com:office:word" xmlns:w="http://schemas.openxmlformats.org/wordprocessingml/2006/main" xmlns:w14="http://schemas.microsoft.com/office/word/2010/wordml" xmlns:w15="http://schemas.microsoft.com/office/word/2012/wordml" xmlns:w16cex="http://schemas.microsoft.com/office/word/2018/wordml/cex" xmlns:w16cid="http://schemas.microsoft.com/office/word/2016/wordml/cid" xmlns:w16="http://schemas.microsoft.com/office/word/2018/wordml" xmlns:w16sdtdh="http://schemas.microsoft.com/office/word/2020/wordml/sdtdatahash" xmlns:w16se="http://schemas.microsoft.com/office/word/2015/wordml/symex" xmlns:wpg="http://schemas.microsoft.com/office/word/2010/wordprocessingGroup" xmlns:wpi="http://schemas.microsoft.com/office/word/2010/wordprocessingInk" xmlns:wne="http://schemas.microsoft.com/office/word/2006/wordml" xmlns:wps="http://schemas.microsoft.com/office/word/2010/wordprocessingShape" mc:Ignorable="w14 w15 w16se w16cid w16 w16cex w16sdtdh wp14">
   <w:p>
     <w:pPr>
+      <w:pStyle w:val="Encabezado"/>
+    </w:pPr>
+  </w:p>
+</w:hdr>
+</file>
+
+<file path=word/header2.xml><?xml version="1.0" encoding="utf-8"?>
+<w:hdr xmlns:wpc="http://schemas.microsoft.com/office/word/2010/wordprocessingCanvas" xmlns:cx="http://schemas.microsoft.com/office/drawing/2014/chartex" xmlns:cx1="http://schemas.microsoft.com/office/drawing/2015/9/8/chartex" xmlns:cx2="http://schemas.microsoft.com/office/drawing/2015/10/21/chartex" xmlns:cx3="http://schemas.microsoft.com/office/drawing/2016/5/9/chartex" xmlns:cx4="http://schemas.microsoft.com/office/drawing/2016/5/10/chartex" xmlns:cx5="http://schemas.microsoft.com/office/drawing/2016/5/11/chartex" xmlns:cx6="http://schemas.microsoft.com/office/drawing/2016/5/12/chartex" xmlns:cx7="http://schemas.microsoft.com/office/drawing/2016/5/13/chartex" xmlns:cx8="http://schemas.microsoft.com/office/drawing/2016/5/14/chartex" xmlns:mc="http://schemas.openxmlformats.org/markup-compatibility/2006" xmlns:aink="http://schemas.microsoft.com/office/drawing/2016/ink" xmlns:am3d="http://schemas.microsoft.com/office/drawing/2017/model3d" xmlns:o="urn:schemas-microsoft-com:office:office" xmlns:oel="http://schemas.microsoft.com/office/2019/extlst" xmlns:r="http://schemas.openxmlformats.org/officeDocument/2006/relationships" xmlns:m="http://schemas.openxmlformats.org/officeDocument/2006/math" xmlns:v="urn:schemas-microsoft-com:vml" xmlns:wp14="http://schemas.microsoft.com/office/word/2010/wordprocessingDrawing" xmlns:wp="http://schemas.openxmlformats.org/drawingml/2006/wordprocessingDrawing" xmlns:w10="urn:schemas-microsoft-com:office:word" xmlns:w="http://schemas.openxmlformats.org/wordprocessingml/2006/main" xmlns:w14="http://schemas.microsoft.com/office/word/2010/wordml" xmlns:w15="http://schemas.microsoft.com/office/word/2012/wordml" xmlns:w16cex="http://schemas.microsoft.com/office/word/2018/wordml/cex" xmlns:w16cid="http://schemas.microsoft.com/office/word/2016/wordml/cid" xmlns:w16="http://schemas.microsoft.com/office/word/2018/wordml" xmlns:w16sdtdh="http://schemas.microsoft.com/office/word/2020/wordml/sdtdatahash" xmlns:w16se="http://schemas.microsoft.com/office/word/2015/wordml/symex" xmlns:wpg="http://schemas.microsoft.com/office/word/2010/wordprocessingGroup" xmlns:wpi="http://schemas.microsoft.com/office/word/2010/wordprocessingInk" xmlns:wne="http://schemas.microsoft.com/office/word/2006/wordml" xmlns:wps="http://schemas.microsoft.com/office/word/2010/wordprocessingShape" mc:Ignorable="w14 w15 w16se w16cid w16 w16cex w16sdtdh wp14">
+  <w:p>
+    <w:pPr>
       <w:ind w:right="-516" w:firstLine="4536"/>
       <w:rPr>
         <w:rFonts w:ascii="Batang" w:eastAsia="Batang" w:hAnsi="Batang" w:cs="Arial"/>
@@ -9768,10 +9802,245 @@
     </w:pPr>
     <w:r>
       <w:rPr>
+        <w:rFonts w:ascii="Baskerville Old Face" w:eastAsia="Batang" w:hAnsi="Baskerville Old Face" w:cs="Arabic Typesetting"/>
+        <w:b/>
+        <w:noProof/>
+        <w:sz w:val="26"/>
+        <w:szCs w:val="26"/>
+        <w:lang w:val="es-CO"/>
+      </w:rPr>
+      <mc:AlternateContent>
+        <mc:Choice Requires="wps">
+          <w:drawing>
+            <wp:anchor distT="45720" distB="45720" distL="114300" distR="114300" simplePos="0" relativeHeight="251673600" behindDoc="0" locked="0" layoutInCell="1" allowOverlap="1" wp14:anchorId="243472CC" wp14:editId="05FE77BF">
+              <wp:simplePos x="0" y="0"/>
+              <wp:positionH relativeFrom="margin">
+                <wp:align>left</wp:align>
+              </wp:positionH>
+              <wp:positionV relativeFrom="paragraph">
+                <wp:posOffset>234315</wp:posOffset>
+              </wp:positionV>
+              <wp:extent cx="3248025" cy="266700"/>
+              <wp:effectExtent l="0" t="0" r="28575" b="19050"/>
+              <wp:wrapNone/>
+              <wp:docPr id="2" name="Cuadro de texto 2"/>
+              <wp:cNvGraphicFramePr>
+                <a:graphicFrameLocks xmlns:a="http://schemas.openxmlformats.org/drawingml/2006/main"/>
+              </wp:cNvGraphicFramePr>
+              <a:graphic xmlns:a="http://schemas.openxmlformats.org/drawingml/2006/main">
+                <a:graphicData uri="http://schemas.microsoft.com/office/word/2010/wordprocessingShape">
+                  <wps:wsp>
+                    <wps:cNvSpPr txBox="1">
+                      <a:spLocks noChangeArrowheads="1"/>
+                    </wps:cNvSpPr>
+                    <wps:spPr bwMode="auto">
+                      <a:xfrm>
+                        <a:off x="0" y="0"/>
+                        <a:ext cx="3248025" cy="266700"/>
+                      </a:xfrm>
+                      <a:prstGeom prst="rect">
+                        <a:avLst/>
+                      </a:prstGeom>
+                      <a:solidFill>
+                        <a:srgbClr val="FFFFFF"/>
+                      </a:solidFill>
+                      <a:ln w="9525">
+                        <a:solidFill>
+                          <a:srgbClr val="000000"/>
+                        </a:solidFill>
+                        <a:miter lim="800000"/>
+                        <a:headEnd/>
+                        <a:tailEnd/>
+                      </a:ln>
+                    </wps:spPr>
+                    <wps:txbx>
+                      <w:txbxContent>
+                        <w:p>
+                          <w:r>
+                            <w:t>{</w:t>
+                          </w:r>
+                          <w:proofErr w:type="spellStart"/>
+                          <w:r>
+                            <w:t>nombre_completo</w:t>
+                          </w:r>
+                          <w:proofErr w:type="spellEnd"/>
+                          <w:r>
+                            <w:t>}</w:t>
+                          </w:r>
+                        </w:p>
+                      </w:txbxContent>
+                    </wps:txbx>
+                    <wps:bodyPr rot="0" vert="horz" wrap="square" lIns="91440" tIns="45720" rIns="91440" bIns="45720" anchor="t" anchorCtr="0">
+                      <a:noAutofit/>
+                    </wps:bodyPr>
+                  </wps:wsp>
+                </a:graphicData>
+              </a:graphic>
+              <wp14:sizeRelH relativeFrom="margin">
+                <wp14:pctWidth>0</wp14:pctWidth>
+              </wp14:sizeRelH>
+              <wp14:sizeRelV relativeFrom="margin">
+                <wp14:pctHeight>0</wp14:pctHeight>
+              </wp14:sizeRelV>
+            </wp:anchor>
+          </w:drawing>
+        </mc:Choice>
+        <mc:Fallback>
+          <w:pict>
+            <v:shapetype w14:anchorId="243472CC" id="_x0000_t202" coordsize="21600,21600" o:spt="202" path="m,l,21600r21600,l21600,xe">
+              <v:stroke joinstyle="miter"/>
+              <v:path gradientshapeok="t" o:connecttype="rect"/>
+            </v:shapetype>
+            <v:shape id="_x0000_s1030" type="#_x0000_t202" style="position:absolute;left:0;text-align:left;margin-left:0;margin-top:18.45pt;width:255.75pt;height:21pt;z-index:251673600;visibility:visible;mso-wrap-style:square;mso-width-percent:0;mso-height-percent:0;mso-wrap-distance-left:9pt;mso-wrap-distance-top:3.6pt;mso-wrap-distance-right:9pt;mso-wrap-distance-bottom:3.6pt;mso-position-horizontal:left;mso-position-horizontal-relative:margin;mso-position-vertical:absolute;mso-position-vertical-relative:text;mso-width-percent:0;mso-height-percent:0;mso-width-relative:margin;mso-height-relative:margin;v-text-anchor:top" o:gfxdata="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">
+              <v:textbox>
+                <w:txbxContent>
+                  <w:p>
+                    <w:r>
+                      <w:t>{</w:t>
+                    </w:r>
+                    <w:proofErr w:type="spellStart"/>
+                    <w:r>
+                      <w:t>nombre_completo</w:t>
+                    </w:r>
+                    <w:proofErr w:type="spellEnd"/>
+                    <w:r>
+                      <w:t>}</w:t>
+                    </w:r>
+                  </w:p>
+                </w:txbxContent>
+              </v:textbox>
+              <w10:wrap anchorx="margin"/>
+            </v:shape>
+          </w:pict>
+        </mc:Fallback>
+      </mc:AlternateContent>
+    </w:r>
+    <w:r>
+      <w:rPr>
+        <w:rFonts w:ascii="Baskerville Old Face" w:eastAsia="Batang" w:hAnsi="Baskerville Old Face" w:cs="Arabic Typesetting"/>
+        <w:b/>
+        <w:noProof/>
+        <w:sz w:val="40"/>
+        <w:szCs w:val="26"/>
+        <w:lang w:val="es-CO" w:eastAsia="es-CO"/>
+      </w:rPr>
+      <mc:AlternateContent>
+        <mc:Choice Requires="wps">
+          <w:drawing>
+            <wp:anchor distT="45720" distB="45720" distL="114300" distR="114300" simplePos="0" relativeHeight="251653632" behindDoc="0" locked="0" layoutInCell="1" allowOverlap="1" wp14:anchorId="52114CD8" wp14:editId="287553AF">
+              <wp:simplePos x="0" y="0"/>
+              <wp:positionH relativeFrom="column">
+                <wp:posOffset>-251460</wp:posOffset>
+              </wp:positionH>
+              <wp:positionV relativeFrom="paragraph">
+                <wp:posOffset>-118110</wp:posOffset>
+              </wp:positionV>
+              <wp:extent cx="2438400" cy="679450"/>
+              <wp:effectExtent l="0" t="0" r="0" b="6350"/>
+              <wp:wrapNone/>
+              <wp:docPr id="217" name="Cuadro de texto 2"/>
+              <wp:cNvGraphicFramePr>
+                <a:graphicFrameLocks xmlns:a="http://schemas.openxmlformats.org/drawingml/2006/main"/>
+              </wp:cNvGraphicFramePr>
+              <a:graphic xmlns:a="http://schemas.openxmlformats.org/drawingml/2006/main">
+                <a:graphicData uri="http://schemas.microsoft.com/office/word/2010/wordprocessingShape">
+                  <wps:wsp>
+                    <wps:cNvSpPr txBox="1">
+                      <a:spLocks noChangeArrowheads="1"/>
+                    </wps:cNvSpPr>
+                    <wps:spPr bwMode="auto">
+                      <a:xfrm>
+                        <a:off x="0" y="0"/>
+                        <a:ext cx="2438400" cy="679450"/>
+                      </a:xfrm>
+                      <a:prstGeom prst="rect">
+                        <a:avLst/>
+                      </a:prstGeom>
+                      <a:noFill/>
+                      <a:ln w="9525">
+                        <a:noFill/>
+                        <a:miter lim="800000"/>
+                        <a:headEnd/>
+                        <a:tailEnd/>
+                      </a:ln>
+                    </wps:spPr>
+                    <wps:txbx>
+                      <w:txbxContent>
+                        <w:p>
+                          <w:pPr>
+                            <w:jc w:val="center"/>
+                            <w:rPr>
+                              <w:rFonts w:ascii="Lucida Calligraphy" w:hAnsi="Lucida Calligraphy" w:cs="Segoe UI"/>
+                              <w:sz w:val="36"/>
+                              <w:szCs w:val="28"/>
+                              <w:lang w:val="es-CO"/>
+                            </w:rPr>
+                          </w:pPr>
+                          <w:r>
+                            <w:rPr>
+                              <w:rFonts w:ascii="Lucida Calligraphy" w:hAnsi="Lucida Calligraphy" w:cs="Segoe UI"/>
+                              <w:sz w:val="36"/>
+                              <w:szCs w:val="28"/>
+                              <w:lang w:val="es-CO"/>
+                            </w:rPr>
+                            <w:t>Nombre completo</w:t>
+                          </w:r>
+                        </w:p>
+                      </w:txbxContent>
+                    </wps:txbx>
+                    <wps:bodyPr rot="0" vert="horz" wrap="square" lIns="91440" tIns="45720" rIns="91440" bIns="45720" anchor="t" anchorCtr="0">
+                      <a:noAutofit/>
+                    </wps:bodyPr>
+                  </wps:wsp>
+                </a:graphicData>
+              </a:graphic>
+              <wp14:sizeRelH relativeFrom="margin">
+                <wp14:pctWidth>0</wp14:pctWidth>
+              </wp14:sizeRelH>
+              <wp14:sizeRelV relativeFrom="margin">
+                <wp14:pctHeight>0</wp14:pctHeight>
+              </wp14:sizeRelV>
+            </wp:anchor>
+          </w:drawing>
+        </mc:Choice>
+        <mc:Fallback>
+          <w:pict>
+            <v:shape w14:anchorId="52114CD8" id="_x0000_s1031" type="#_x0000_t202" style="position:absolute;left:0;text-align:left;margin-left:-19.8pt;margin-top:-9.3pt;width:192pt;height:53.5pt;z-index:251653632;visibility:visible;mso-wrap-style:square;mso-width-percent:0;mso-height-percent:0;mso-wrap-distance-left:9pt;mso-wrap-distance-top:3.6pt;mso-wrap-distance-right:9pt;mso-wrap-distance-bottom:3.6pt;mso-position-horizontal:absolute;mso-position-horizontal-relative:text;mso-position-vertical:absolute;mso-position-vertical-relative:text;mso-width-percent:0;mso-height-percent:0;mso-width-relative:margin;mso-height-relative:margin;v-text-anchor:top" o:gfxdata="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" filled="f" stroked="f">
+              <v:textbox>
+                <w:txbxContent>
+                  <w:p>
+                    <w:pPr>
+                      <w:jc w:val="center"/>
+                      <w:rPr>
+                        <w:rFonts w:ascii="Lucida Calligraphy" w:hAnsi="Lucida Calligraphy" w:cs="Segoe UI"/>
+                        <w:sz w:val="36"/>
+                        <w:szCs w:val="28"/>
+                        <w:lang w:val="es-CO"/>
+                      </w:rPr>
+                    </w:pPr>
+                    <w:r>
+                      <w:rPr>
+                        <w:rFonts w:ascii="Lucida Calligraphy" w:hAnsi="Lucida Calligraphy" w:cs="Segoe UI"/>
+                        <w:sz w:val="36"/>
+                        <w:szCs w:val="28"/>
+                        <w:lang w:val="es-CO"/>
+                      </w:rPr>
+                      <w:t>Nombre completo</w:t>
+                    </w:r>
+                  </w:p>
+                </w:txbxContent>
+              </v:textbox>
+            </v:shape>
+          </w:pict>
+        </mc:Fallback>
+      </mc:AlternateContent>
+    </w:r>
+    <w:r>
+      <w:rPr>
         <w:noProof/>
       </w:rPr>
       <w:drawing>
-        <wp:anchor distT="0" distB="0" distL="114300" distR="114300" simplePos="0" relativeHeight="251662848" behindDoc="1" locked="0" layoutInCell="1" allowOverlap="1" wp14:anchorId="318DCC0F" wp14:editId="5B2BB955">
+        <wp:anchor distT="0" distB="0" distL="114300" distR="114300" simplePos="0" relativeHeight="251662848" behindDoc="1" locked="0" layoutInCell="1" allowOverlap="1" wp14:anchorId="318DCC0F" wp14:editId="14189254">
           <wp:simplePos x="0" y="0"/>
           <wp:positionH relativeFrom="page">
             <wp:posOffset>-180948</wp:posOffset>
@@ -9843,7 +10112,7 @@
         <w:lang w:val="es-CO" w:eastAsia="es-CO"/>
       </w:rPr>
       <w:drawing>
-        <wp:anchor distT="0" distB="0" distL="114300" distR="114300" simplePos="0" relativeHeight="251655680" behindDoc="1" locked="0" layoutInCell="1" allowOverlap="1" wp14:anchorId="43C89928" wp14:editId="6EDE4997">
+        <wp:anchor distT="0" distB="0" distL="114300" distR="114300" simplePos="0" relativeHeight="251655680" behindDoc="1" locked="0" layoutInCell="1" allowOverlap="1" wp14:anchorId="43C89928" wp14:editId="50C79460">
           <wp:simplePos x="0" y="0"/>
           <wp:positionH relativeFrom="column">
             <wp:posOffset>-1061085</wp:posOffset>
@@ -9902,130 +10171,6 @@
         </wp:anchor>
       </w:drawing>
     </w:r>
-    <w:r>
-      <w:rPr>
-        <w:rFonts w:ascii="Baskerville Old Face" w:eastAsia="Batang" w:hAnsi="Baskerville Old Face" w:cs="Arabic Typesetting"/>
-        <w:b/>
-        <w:noProof/>
-        <w:sz w:val="40"/>
-        <w:szCs w:val="26"/>
-        <w:lang w:val="es-CO" w:eastAsia="es-CO"/>
-      </w:rPr>
-      <mc:AlternateContent>
-        <mc:Choice Requires="wps">
-          <w:drawing>
-            <wp:anchor distT="45720" distB="45720" distL="114300" distR="114300" simplePos="0" relativeHeight="251653632" behindDoc="0" locked="0" layoutInCell="1" allowOverlap="1" wp14:anchorId="52114CD8" wp14:editId="4D7F106B">
-              <wp:simplePos x="0" y="0"/>
-              <wp:positionH relativeFrom="column">
-                <wp:posOffset>-248285</wp:posOffset>
-              </wp:positionH>
-              <wp:positionV relativeFrom="paragraph">
-                <wp:posOffset>-118110</wp:posOffset>
-              </wp:positionV>
-              <wp:extent cx="2217420" cy="679450"/>
-              <wp:effectExtent l="0" t="0" r="0" b="6350"/>
-              <wp:wrapNone/>
-              <wp:docPr id="217" name="Cuadro de texto 2"/>
-              <wp:cNvGraphicFramePr>
-                <a:graphicFrameLocks xmlns:a="http://schemas.openxmlformats.org/drawingml/2006/main"/>
-              </wp:cNvGraphicFramePr>
-              <a:graphic xmlns:a="http://schemas.openxmlformats.org/drawingml/2006/main">
-                <a:graphicData uri="http://schemas.microsoft.com/office/word/2010/wordprocessingShape">
-                  <wps:wsp>
-                    <wps:cNvSpPr txBox="1">
-                      <a:spLocks noChangeArrowheads="1"/>
-                    </wps:cNvSpPr>
-                    <wps:spPr bwMode="auto">
-                      <a:xfrm>
-                        <a:off x="0" y="0"/>
-                        <a:ext cx="2217420" cy="679450"/>
-                      </a:xfrm>
-                      <a:prstGeom prst="rect">
-                        <a:avLst/>
-                      </a:prstGeom>
-                      <a:noFill/>
-                      <a:ln w="9525">
-                        <a:noFill/>
-                        <a:miter lim="800000"/>
-                        <a:headEnd/>
-                        <a:tailEnd/>
-                      </a:ln>
-                    </wps:spPr>
-                    <wps:txbx>
-                      <w:txbxContent>
-                        <w:p>
-                          <w:pPr>
-                            <w:jc w:val="center"/>
-                            <w:rPr>
-                              <w:rFonts w:ascii="Lucida Calligraphy" w:hAnsi="Lucida Calligraphy" w:cs="Segoe UI"/>
-                              <w:sz w:val="36"/>
-                              <w:szCs w:val="28"/>
-                              <w:lang w:val="es-CO"/>
-                            </w:rPr>
-                          </w:pPr>
-                          <w:r>
-                            <w:rPr>
-                              <w:rFonts w:ascii="Lucida Calligraphy" w:hAnsi="Lucida Calligraphy" w:cs="Segoe UI"/>
-                              <w:sz w:val="36"/>
-                              <w:szCs w:val="28"/>
-                              <w:lang w:val="es-CO"/>
-                            </w:rPr>
-                            <w:t>Nombre completo</w:t>
-                          </w:r>
-                        </w:p>
-                      </w:txbxContent>
-                    </wps:txbx>
-                    <wps:bodyPr rot="0" vert="horz" wrap="square" lIns="91440" tIns="45720" rIns="91440" bIns="45720" anchor="t" anchorCtr="0">
-                      <a:noAutofit/>
-                    </wps:bodyPr>
-                  </wps:wsp>
-                </a:graphicData>
-              </a:graphic>
-              <wp14:sizeRelH relativeFrom="margin">
-                <wp14:pctWidth>0</wp14:pctWidth>
-              </wp14:sizeRelH>
-              <wp14:sizeRelV relativeFrom="margin">
-                <wp14:pctHeight>0</wp14:pctHeight>
-              </wp14:sizeRelV>
-            </wp:anchor>
-          </w:drawing>
-        </mc:Choice>
-        <mc:Fallback>
-          <w:pict>
-            <v:shapetype w14:anchorId="52114CD8" id="_x0000_t202" coordsize="21600,21600" o:spt="202" path="m,l,21600r21600,l21600,xe">
-              <v:stroke joinstyle="miter"/>
-              <v:path gradientshapeok="t" o:connecttype="rect"/>
-            </v:shapetype>
-            <v:shape id="_x0000_s1029" type="#_x0000_t202" style="position:absolute;left:0;text-align:left;margin-left:-19.55pt;margin-top:-9.3pt;width:174.6pt;height:53.5pt;z-index:251653632;visibility:visible;mso-wrap-style:square;mso-width-percent:0;mso-height-percent:0;mso-wrap-distance-left:9pt;mso-wrap-distance-top:3.6pt;mso-wrap-distance-right:9pt;mso-wrap-distance-bottom:3.6pt;mso-position-horizontal:absolute;mso-position-horizontal-relative:text;mso-position-vertical:absolute;mso-position-vertical-relative:text;mso-width-percent:0;mso-height-percent:0;mso-width-relative:margin;mso-height-relative:margin;v-text-anchor:top" o:gfxdata="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" filled="f" stroked="f">
-              <v:textbox>
-                <w:txbxContent>
-                  <w:p>
-                    <w:pPr>
-                      <w:jc w:val="center"/>
-                      <w:rPr>
-                        <w:rFonts w:ascii="Lucida Calligraphy" w:hAnsi="Lucida Calligraphy" w:cs="Segoe UI"/>
-                        <w:sz w:val="36"/>
-                        <w:szCs w:val="28"/>
-                        <w:lang w:val="es-CO"/>
-                      </w:rPr>
-                    </w:pPr>
-                    <w:r>
-                      <w:rPr>
-                        <w:rFonts w:ascii="Lucida Calligraphy" w:hAnsi="Lucida Calligraphy" w:cs="Segoe UI"/>
-                        <w:sz w:val="36"/>
-                        <w:szCs w:val="28"/>
-                        <w:lang w:val="es-CO"/>
-                      </w:rPr>
-                      <w:t>Nombre completo</w:t>
-                    </w:r>
-                  </w:p>
-                </w:txbxContent>
-              </v:textbox>
-            </v:shape>
-          </w:pict>
-        </mc:Fallback>
-      </mc:AlternateContent>
-    </w:r>
   </w:p>
   <w:p>
     <w:pPr>
@@ -10051,7 +10196,7 @@
       <mc:AlternateContent>
         <mc:Choice Requires="wps">
           <w:drawing>
-            <wp:anchor distT="0" distB="0" distL="114300" distR="114300" simplePos="0" relativeHeight="251662336" behindDoc="0" locked="0" layoutInCell="1" allowOverlap="1" wp14:anchorId="17FFBDF6" wp14:editId="76DFBBB6">
+            <wp:anchor distT="0" distB="0" distL="114300" distR="114300" simplePos="0" relativeHeight="251662336" behindDoc="0" locked="0" layoutInCell="1" allowOverlap="1" wp14:anchorId="17FFBDF6" wp14:editId="4E85E858">
               <wp:simplePos x="0" y="0"/>
               <wp:positionH relativeFrom="column">
                 <wp:posOffset>-419735</wp:posOffset>
@@ -10083,7 +10228,7 @@
                       <a:effectLst/>
                       <a:extLst>
                         <a:ext uri="{C572A759-6A51-4108-AA02-DFA0A04FC94B}">
-                          <ma14:wrappingTextBoxFlag xmlns:arto="http://schemas.microsoft.com/office/word/2006/arto" xmlns="" xmlns:mo="http://schemas.microsoft.com/office/mac/office/2008/main" xmlns:mv="urn:schemas-microsoft-com:mac:vml" xmlns:o="urn:schemas-microsoft-com:office:office" xmlns:v="urn:schemas-microsoft-com:vml" xmlns:w10="urn:schemas-microsoft-com:office:word" xmlns:w="http://schemas.openxmlformats.org/wordprocessingml/2006/main" xmlns:ma14="http://schemas.microsoft.com/office/mac/drawingml/2011/main"/>
+                          <ma14:wrappingTextBoxFlag xmlns:ma14="http://schemas.microsoft.com/office/mac/drawingml/2011/main" xmlns:w="http://schemas.openxmlformats.org/wordprocessingml/2006/main" xmlns:w10="urn:schemas-microsoft-com:office:word" xmlns:v="urn:schemas-microsoft-com:vml" xmlns:o="urn:schemas-microsoft-com:office:office" xmlns:mv="urn:schemas-microsoft-com:mac:vml" xmlns:mo="http://schemas.microsoft.com/office/mac/office/2008/main" xmlns="" xmlns:arto="http://schemas.microsoft.com/office/word/2006/arto"/>
                         </a:ext>
                       </a:extLst>
                     </wps:spPr>
@@ -10150,7 +10295,7 @@
         </mc:Choice>
         <mc:Fallback>
           <w:pict>
-            <v:shape w14:anchorId="17FFBDF6" id="_x0000_s1030" type="#_x0000_t202" style="position:absolute;left:0;text-align:left;margin-left:-33.05pt;margin-top:17.2pt;width:209.5pt;height:37.5pt;z-index:251662336;visibility:visible;mso-wrap-style:square;mso-width-percent:0;mso-height-percent:0;mso-wrap-distance-left:9pt;mso-wrap-distance-top:0;mso-wrap-distance-right:9pt;mso-wrap-distance-bottom:0;mso-position-horizontal:absolute;mso-position-horizontal-relative:text;mso-position-vertical:absolute;mso-position-vertical-relative:text;mso-width-percent:0;mso-height-percent:0;mso-width-relative:margin;mso-height-relative:margin;v-text-anchor:top" o:gfxdata="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" filled="f" stroked="f">
+            <v:shape w14:anchorId="17FFBDF6" id="_x0000_s1032" type="#_x0000_t202" style="position:absolute;left:0;text-align:left;margin-left:-33.05pt;margin-top:17.2pt;width:209.5pt;height:37.5pt;z-index:251662336;visibility:visible;mso-wrap-style:square;mso-width-percent:0;mso-height-percent:0;mso-wrap-distance-left:9pt;mso-wrap-distance-top:0;mso-wrap-distance-right:9pt;mso-wrap-distance-bottom:0;mso-position-horizontal:absolute;mso-position-horizontal-relative:text;mso-position-vertical:absolute;mso-position-vertical-relative:text;mso-width-percent:0;mso-height-percent:0;mso-width-relative:margin;mso-height-relative:margin;v-text-anchor:top" o:gfxdata="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" filled="f" stroked="f">
               <v:textbox>
                 <w:txbxContent>
                   <w:p>
@@ -10263,6 +10408,16 @@
         </mc:Fallback>
       </mc:AlternateContent>
     </w:r>
+  </w:p>
+</w:hdr>
+</file>
+
+<file path=word/header3.xml><?xml version="1.0" encoding="utf-8"?>
+<w:hdr xmlns:wpc="http://schemas.microsoft.com/office/word/2010/wordprocessingCanvas" xmlns:cx="http://schemas.microsoft.com/office/drawing/2014/chartex" xmlns:cx1="http://schemas.microsoft.com/office/drawing/2015/9/8/chartex" xmlns:cx2="http://schemas.microsoft.com/office/drawing/2015/10/21/chartex" xmlns:cx3="http://schemas.microsoft.com/office/drawing/2016/5/9/chartex" xmlns:cx4="http://schemas.microsoft.com/office/drawing/2016/5/10/chartex" xmlns:cx5="http://schemas.microsoft.com/office/drawing/2016/5/11/chartex" xmlns:cx6="http://schemas.microsoft.com/office/drawing/2016/5/12/chartex" xmlns:cx7="http://schemas.microsoft.com/office/drawing/2016/5/13/chartex" xmlns:cx8="http://schemas.microsoft.com/office/drawing/2016/5/14/chartex" xmlns:mc="http://schemas.openxmlformats.org/markup-compatibility/2006" xmlns:aink="http://schemas.microsoft.com/office/drawing/2016/ink" xmlns:am3d="http://schemas.microsoft.com/office/drawing/2017/model3d" xmlns:o="urn:schemas-microsoft-com:office:office" xmlns:oel="http://schemas.microsoft.com/office/2019/extlst" xmlns:r="http://schemas.openxmlformats.org/officeDocument/2006/relationships" xmlns:m="http://schemas.openxmlformats.org/officeDocument/2006/math" xmlns:v="urn:schemas-microsoft-com:vml" xmlns:wp14="http://schemas.microsoft.com/office/word/2010/wordprocessingDrawing" xmlns:wp="http://schemas.openxmlformats.org/drawingml/2006/wordprocessingDrawing" xmlns:w10="urn:schemas-microsoft-com:office:word" xmlns:w="http://schemas.openxmlformats.org/wordprocessingml/2006/main" xmlns:w14="http://schemas.microsoft.com/office/word/2010/wordml" xmlns:w15="http://schemas.microsoft.com/office/word/2012/wordml" xmlns:w16cex="http://schemas.microsoft.com/office/word/2018/wordml/cex" xmlns:w16cid="http://schemas.microsoft.com/office/word/2016/wordml/cid" xmlns:w16="http://schemas.microsoft.com/office/word/2018/wordml" xmlns:w16sdtdh="http://schemas.microsoft.com/office/word/2020/wordml/sdtdatahash" xmlns:w16se="http://schemas.microsoft.com/office/word/2015/wordml/symex" xmlns:wpg="http://schemas.microsoft.com/office/word/2010/wordprocessingGroup" xmlns:wpi="http://schemas.microsoft.com/office/word/2010/wordprocessingInk" xmlns:wne="http://schemas.microsoft.com/office/word/2006/wordml" xmlns:wps="http://schemas.microsoft.com/office/word/2010/wordprocessingShape" mc:Ignorable="w14 w15 w16se w16cid w16 w16cex w16sdtdh wp14">
+  <w:p>
+    <w:pPr>
+      <w:pStyle w:val="Encabezado"/>
+    </w:pPr>
   </w:p>
 </w:hdr>
 </file>

</xml_diff>

<commit_message>
chore: actualizar plantilla de hoja de vida
</commit_message>
<xml_diff>
--- a/public/templates/hoja_de_vida_template.docx
+++ b/public/templates/hoja_de_vida_template.docx
@@ -2167,23 +2167,7 @@
                 <w:sz w:val="26"/>
                 <w:szCs w:val="26"/>
               </w:rPr>
-              <w:t>fecha_</w:t>
-            </w:r>
-            <w:r>
-              <w:rPr>
-                <w:rFonts w:ascii="Trebuchet MS" w:hAnsi="Trebuchet MS"/>
-                <w:sz w:val="26"/>
-                <w:szCs w:val="26"/>
-              </w:rPr>
-              <w:t>año</w:t>
-            </w:r>
-            <w:r>
-              <w:rPr>
-                <w:rFonts w:ascii="Trebuchet MS" w:hAnsi="Trebuchet MS"/>
-                <w:sz w:val="26"/>
-                <w:szCs w:val="26"/>
-              </w:rPr>
-              <w:t>_grado</w:t>
+              <w:t>fecha_año_grado</w:t>
             </w:r>
             <w:proofErr w:type="spellEnd"/>
             <w:r>
@@ -2811,27 +2795,7 @@
                 <w:szCs w:val="28"/>
                 <w:lang w:val="es-CO"/>
               </w:rPr>
-              <w:t>{graduado</w:t>
-            </w:r>
-            <w:r>
-              <w:rPr>
-                <w:rFonts w:asciiTheme="majorHAnsi" w:eastAsia="Batang" w:hAnsiTheme="majorHAnsi" w:cs="Arabic Typesetting"/>
-                <w:b/>
-                <w:sz w:val="28"/>
-                <w:szCs w:val="28"/>
-                <w:lang w:val="es-CO"/>
-              </w:rPr>
-              <w:t>No</w:t>
-            </w:r>
-            <w:r>
-              <w:rPr>
-                <w:rFonts w:asciiTheme="majorHAnsi" w:eastAsia="Batang" w:hAnsiTheme="majorHAnsi" w:cs="Arabic Typesetting"/>
-                <w:b/>
-                <w:sz w:val="28"/>
-                <w:szCs w:val="28"/>
-                <w:lang w:val="es-CO"/>
-              </w:rPr>
-              <w:t>_1}</w:t>
+              <w:t>{graduadoNo_1}</w:t>
             </w:r>
           </w:p>
         </w:tc>
@@ -3029,27 +2993,7 @@
                 <w:szCs w:val="28"/>
                 <w:lang w:val="es-CO"/>
               </w:rPr>
-              <w:t>{nombreTitulo_</w:t>
-            </w:r>
-            <w:r>
-              <w:rPr>
-                <w:rFonts w:ascii="Baskerville Old Face" w:eastAsia="Batang" w:hAnsi="Baskerville Old Face" w:cs="Arabic Typesetting"/>
-                <w:b/>
-                <w:sz w:val="28"/>
-                <w:szCs w:val="28"/>
-                <w:lang w:val="es-CO"/>
-              </w:rPr>
-              <w:t>2</w:t>
-            </w:r>
-            <w:r>
-              <w:rPr>
-                <w:rFonts w:ascii="Baskerville Old Face" w:eastAsia="Batang" w:hAnsi="Baskerville Old Face" w:cs="Arabic Typesetting"/>
-                <w:b/>
-                <w:sz w:val="28"/>
-                <w:szCs w:val="28"/>
-                <w:lang w:val="es-CO"/>
-              </w:rPr>
-              <w:t>}</w:t>
+              <w:t>{nombreTitulo_2}</w:t>
             </w:r>
           </w:p>
         </w:tc>
@@ -3219,27 +3163,7 @@
                 <w:szCs w:val="28"/>
                 <w:lang w:val="es-CO"/>
               </w:rPr>
-              <w:t>{nombreTitulo_</w:t>
-            </w:r>
-            <w:r>
-              <w:rPr>
-                <w:rFonts w:ascii="Baskerville Old Face" w:eastAsia="Batang" w:hAnsi="Baskerville Old Face" w:cs="Arabic Typesetting"/>
-                <w:b/>
-                <w:sz w:val="28"/>
-                <w:szCs w:val="28"/>
-                <w:lang w:val="es-CO"/>
-              </w:rPr>
-              <w:t>3</w:t>
-            </w:r>
-            <w:r>
-              <w:rPr>
-                <w:rFonts w:ascii="Baskerville Old Face" w:eastAsia="Batang" w:hAnsi="Baskerville Old Face" w:cs="Arabic Typesetting"/>
-                <w:b/>
-                <w:sz w:val="28"/>
-                <w:szCs w:val="28"/>
-                <w:lang w:val="es-CO"/>
-              </w:rPr>
-              <w:t>}</w:t>
+              <w:t>{nombreTitulo_3}</w:t>
             </w:r>
           </w:p>
         </w:tc>
@@ -4625,8 +4549,9 @@
                 <w:szCs w:val="26"/>
                 <w:lang w:val="es-CO"/>
               </w:rPr>
-              <w:t>mes</w:t>
-            </w:r>
+              <w:t>mes_fin</w:t>
+            </w:r>
+            <w:proofErr w:type="spellEnd"/>
             <w:r>
               <w:rPr>
                 <w:rFonts w:asciiTheme="majorHAnsi" w:hAnsiTheme="majorHAnsi" w:cs="Arial"/>
@@ -4634,9 +4559,8 @@
                 <w:szCs w:val="26"/>
                 <w:lang w:val="es-CO"/>
               </w:rPr>
-              <w:t>_fin</w:t>
-            </w:r>
-            <w:proofErr w:type="spellEnd"/>
+              <w:t>}</w:t>
+            </w:r>
             <w:r>
               <w:rPr>
                 <w:rFonts w:asciiTheme="majorHAnsi" w:hAnsiTheme="majorHAnsi" w:cs="Arial"/>
@@ -4644,7 +4568,7 @@
                 <w:szCs w:val="26"/>
                 <w:lang w:val="es-CO"/>
               </w:rPr>
-              <w:t>}</w:t>
+              <w:t xml:space="preserve">    </w:t>
             </w:r>
             <w:r>
               <w:rPr>
@@ -4653,7 +4577,7 @@
                 <w:szCs w:val="26"/>
                 <w:lang w:val="es-CO"/>
               </w:rPr>
-              <w:t xml:space="preserve">    </w:t>
+              <w:t xml:space="preserve">  </w:t>
             </w:r>
             <w:r>
               <w:rPr>
@@ -4662,7 +4586,7 @@
                 <w:szCs w:val="26"/>
                 <w:lang w:val="es-CO"/>
               </w:rPr>
-              <w:t xml:space="preserve">  </w:t>
+              <w:t xml:space="preserve"> </w:t>
             </w:r>
             <w:r>
               <w:rPr>
@@ -4680,7 +4604,7 @@
                 <w:szCs w:val="26"/>
                 <w:lang w:val="es-CO"/>
               </w:rPr>
-              <w:t xml:space="preserve"> </w:t>
+              <w:t>AÑO:</w:t>
             </w:r>
             <w:r>
               <w:rPr>
@@ -4689,8 +4613,9 @@
                 <w:szCs w:val="26"/>
                 <w:lang w:val="es-CO"/>
               </w:rPr>
-              <w:t>AÑO:</w:t>
-            </w:r>
+              <w:t>{</w:t>
+            </w:r>
+            <w:proofErr w:type="spellStart"/>
             <w:r>
               <w:rPr>
                 <w:rFonts w:asciiTheme="majorHAnsi" w:hAnsiTheme="majorHAnsi" w:cs="Arial"/>
@@ -4698,26 +4623,7 @@
                 <w:szCs w:val="26"/>
                 <w:lang w:val="es-CO"/>
               </w:rPr>
-              <w:t>{</w:t>
-            </w:r>
-            <w:proofErr w:type="spellStart"/>
-            <w:r>
-              <w:rPr>
-                <w:rFonts w:asciiTheme="majorHAnsi" w:hAnsiTheme="majorHAnsi" w:cs="Arial"/>
-                <w:sz w:val="20"/>
-                <w:szCs w:val="26"/>
-                <w:lang w:val="es-CO"/>
-              </w:rPr>
-              <w:t>año</w:t>
-            </w:r>
-            <w:r>
-              <w:rPr>
-                <w:rFonts w:asciiTheme="majorHAnsi" w:hAnsiTheme="majorHAnsi" w:cs="Arial"/>
-                <w:sz w:val="20"/>
-                <w:szCs w:val="26"/>
-                <w:lang w:val="es-CO"/>
-              </w:rPr>
-              <w:t>_fin</w:t>
+              <w:t>año_fin</w:t>
             </w:r>
             <w:proofErr w:type="spellEnd"/>
             <w:r>
@@ -5001,16 +4907,7 @@
                 <w:szCs w:val="26"/>
                 <w:lang w:val="es-CO"/>
               </w:rPr>
-              <w:t>empresa_</w:t>
-            </w:r>
-            <w:r>
-              <w:rPr>
-                <w:rFonts w:ascii="Trebuchet MS" w:hAnsi="Trebuchet MS" w:cs="Arial"/>
-                <w:sz w:val="26"/>
-                <w:szCs w:val="26"/>
-                <w:lang w:val="es-CO"/>
-              </w:rPr>
-              <w:t>dos</w:t>
+              <w:t>empresa_dos</w:t>
             </w:r>
             <w:proofErr w:type="spellEnd"/>
             <w:r>
@@ -5201,16 +5098,7 @@
                 <w:szCs w:val="26"/>
                 <w:lang w:val="es-CO"/>
               </w:rPr>
-              <w:t>{departamento_empresa</w:t>
-            </w:r>
-            <w:r>
-              <w:rPr>
-                <w:rFonts w:ascii="Trebuchet MS" w:hAnsi="Trebuchet MS" w:cs="Arial"/>
-                <w:sz w:val="26"/>
-                <w:szCs w:val="26"/>
-                <w:lang w:val="es-CO"/>
-              </w:rPr>
-              <w:t>2}</w:t>
+              <w:t>{departamento_empresa2}</w:t>
             </w:r>
           </w:p>
         </w:tc>
@@ -5262,25 +5150,7 @@
                 <w:szCs w:val="26"/>
                 <w:lang w:val="es-CO"/>
               </w:rPr>
-              <w:t>{municipio_empresa</w:t>
-            </w:r>
-            <w:r>
-              <w:rPr>
-                <w:rFonts w:asciiTheme="majorHAnsi" w:hAnsiTheme="majorHAnsi" w:cs="Arial"/>
-                <w:sz w:val="26"/>
-                <w:szCs w:val="26"/>
-                <w:lang w:val="es-CO"/>
-              </w:rPr>
-              <w:t>2</w:t>
-            </w:r>
-            <w:r>
-              <w:rPr>
-                <w:rFonts w:asciiTheme="majorHAnsi" w:hAnsiTheme="majorHAnsi" w:cs="Arial"/>
-                <w:sz w:val="26"/>
-                <w:szCs w:val="26"/>
-                <w:lang w:val="es-CO"/>
-              </w:rPr>
-              <w:t>}</w:t>
+              <w:t>{municipio_empresa2}</w:t>
             </w:r>
           </w:p>
         </w:tc>
@@ -5333,25 +5203,7 @@
                 <w:szCs w:val="26"/>
                 <w:lang w:val="es-CO"/>
               </w:rPr>
-              <w:t>{email_empresa</w:t>
-            </w:r>
-            <w:r>
-              <w:rPr>
-                <w:rFonts w:asciiTheme="majorHAnsi" w:hAnsiTheme="majorHAnsi" w:cs="Arial"/>
-                <w:sz w:val="26"/>
-                <w:szCs w:val="26"/>
-                <w:lang w:val="es-CO"/>
-              </w:rPr>
-              <w:t>2</w:t>
-            </w:r>
-            <w:r>
-              <w:rPr>
-                <w:rFonts w:asciiTheme="majorHAnsi" w:hAnsiTheme="majorHAnsi" w:cs="Arial"/>
-                <w:sz w:val="26"/>
-                <w:szCs w:val="26"/>
-                <w:lang w:val="es-CO"/>
-              </w:rPr>
-              <w:t>}</w:t>
+              <w:t>{email_empresa2}</w:t>
             </w:r>
           </w:p>
         </w:tc>
@@ -5419,16 +5271,7 @@
                 <w:szCs w:val="26"/>
                 <w:lang w:val="es-CO"/>
               </w:rPr>
-              <w:t>{teléfono_emrpesa</w:t>
-            </w:r>
-            <w:r>
-              <w:rPr>
-                <w:rFonts w:ascii="Trebuchet MS" w:hAnsi="Trebuchet MS" w:cs="Arial"/>
-                <w:sz w:val="26"/>
-                <w:szCs w:val="26"/>
-                <w:lang w:val="es-CO"/>
-              </w:rPr>
-              <w:t>2}</w:t>
+              <w:t>{teléfono_emrpesa2}</w:t>
             </w:r>
           </w:p>
         </w:tc>
@@ -5490,7 +5333,7 @@
                 <w:szCs w:val="26"/>
                 <w:lang w:val="es-CO"/>
               </w:rPr>
-              <w:t>{dia_inicio</w:t>
+              <w:t>{dia_inicio2}</w:t>
             </w:r>
             <w:r>
               <w:rPr>
@@ -5499,7 +5342,7 @@
                 <w:szCs w:val="26"/>
                 <w:lang w:val="es-CO"/>
               </w:rPr>
-              <w:t>2</w:t>
+              <w:t xml:space="preserve">      MES:</w:t>
             </w:r>
             <w:r>
               <w:rPr>
@@ -5508,7 +5351,7 @@
                 <w:szCs w:val="26"/>
                 <w:lang w:val="es-CO"/>
               </w:rPr>
-              <w:t>}</w:t>
+              <w:t>{mes_inicio2}</w:t>
             </w:r>
             <w:r>
               <w:rPr>
@@ -5517,42 +5360,6 @@
                 <w:szCs w:val="26"/>
                 <w:lang w:val="es-CO"/>
               </w:rPr>
-              <w:t xml:space="preserve">      MES:</w:t>
-            </w:r>
-            <w:r>
-              <w:rPr>
-                <w:rFonts w:asciiTheme="majorHAnsi" w:hAnsiTheme="majorHAnsi" w:cs="Arial"/>
-                <w:sz w:val="20"/>
-                <w:szCs w:val="26"/>
-                <w:lang w:val="es-CO"/>
-              </w:rPr>
-              <w:t>{mes_inicio</w:t>
-            </w:r>
-            <w:r>
-              <w:rPr>
-                <w:rFonts w:asciiTheme="majorHAnsi" w:hAnsiTheme="majorHAnsi" w:cs="Arial"/>
-                <w:sz w:val="20"/>
-                <w:szCs w:val="26"/>
-                <w:lang w:val="es-CO"/>
-              </w:rPr>
-              <w:t>2</w:t>
-            </w:r>
-            <w:r>
-              <w:rPr>
-                <w:rFonts w:asciiTheme="majorHAnsi" w:hAnsiTheme="majorHAnsi" w:cs="Arial"/>
-                <w:sz w:val="20"/>
-                <w:szCs w:val="26"/>
-                <w:lang w:val="es-CO"/>
-              </w:rPr>
-              <w:t>}</w:t>
-            </w:r>
-            <w:r>
-              <w:rPr>
-                <w:rFonts w:asciiTheme="majorHAnsi" w:hAnsiTheme="majorHAnsi" w:cs="Arial"/>
-                <w:sz w:val="20"/>
-                <w:szCs w:val="26"/>
-                <w:lang w:val="es-CO"/>
-              </w:rPr>
               <w:t xml:space="preserve">       AÑO</w:t>
             </w:r>
             <w:r>
@@ -5571,25 +5378,7 @@
                 <w:szCs w:val="26"/>
                 <w:lang w:val="es-CO"/>
               </w:rPr>
-              <w:t>{año_inicio</w:t>
-            </w:r>
-            <w:r>
-              <w:rPr>
-                <w:rFonts w:asciiTheme="majorHAnsi" w:hAnsiTheme="majorHAnsi" w:cs="Arial"/>
-                <w:sz w:val="22"/>
-                <w:szCs w:val="26"/>
-                <w:lang w:val="es-CO"/>
-              </w:rPr>
-              <w:t>2</w:t>
-            </w:r>
-            <w:r>
-              <w:rPr>
-                <w:rFonts w:asciiTheme="majorHAnsi" w:hAnsiTheme="majorHAnsi" w:cs="Arial"/>
-                <w:sz w:val="22"/>
-                <w:szCs w:val="26"/>
-                <w:lang w:val="es-CO"/>
-              </w:rPr>
-              <w:t>}</w:t>
+              <w:t>{año_inicio2}</w:t>
             </w:r>
           </w:p>
         </w:tc>
@@ -5651,7 +5440,7 @@
                 <w:szCs w:val="26"/>
                 <w:lang w:val="es-CO"/>
               </w:rPr>
-              <w:t>{dia_fin</w:t>
+              <w:t>{dia_fin2}</w:t>
             </w:r>
             <w:r>
               <w:rPr>
@@ -5660,7 +5449,7 @@
                 <w:szCs w:val="26"/>
                 <w:lang w:val="es-CO"/>
               </w:rPr>
-              <w:t>2</w:t>
+              <w:t xml:space="preserve">     </w:t>
             </w:r>
             <w:r>
               <w:rPr>
@@ -5669,7 +5458,7 @@
                 <w:szCs w:val="26"/>
                 <w:lang w:val="es-CO"/>
               </w:rPr>
-              <w:t>}</w:t>
+              <w:t xml:space="preserve"> </w:t>
             </w:r>
             <w:r>
               <w:rPr>
@@ -5678,7 +5467,7 @@
                 <w:szCs w:val="26"/>
                 <w:lang w:val="es-CO"/>
               </w:rPr>
-              <w:t xml:space="preserve">     </w:t>
+              <w:t xml:space="preserve"> MES:</w:t>
             </w:r>
             <w:r>
               <w:rPr>
@@ -5687,6 +5476,24 @@
                 <w:szCs w:val="26"/>
                 <w:lang w:val="es-CO"/>
               </w:rPr>
+              <w:t>{mes_fin2}</w:t>
+            </w:r>
+            <w:r>
+              <w:rPr>
+                <w:rFonts w:asciiTheme="majorHAnsi" w:hAnsiTheme="majorHAnsi" w:cs="Arial"/>
+                <w:sz w:val="20"/>
+                <w:szCs w:val="26"/>
+                <w:lang w:val="es-CO"/>
+              </w:rPr>
+              <w:t xml:space="preserve">       </w:t>
+            </w:r>
+            <w:r>
+              <w:rPr>
+                <w:rFonts w:asciiTheme="majorHAnsi" w:hAnsiTheme="majorHAnsi" w:cs="Arial"/>
+                <w:sz w:val="20"/>
+                <w:szCs w:val="26"/>
+                <w:lang w:val="es-CO"/>
+              </w:rPr>
               <w:t xml:space="preserve"> </w:t>
             </w:r>
             <w:r>
@@ -5696,7 +5503,7 @@
                 <w:szCs w:val="26"/>
                 <w:lang w:val="es-CO"/>
               </w:rPr>
-              <w:t xml:space="preserve"> MES:</w:t>
+              <w:t>AÑO:</w:t>
             </w:r>
             <w:r>
               <w:rPr>
@@ -5705,79 +5512,7 @@
                 <w:szCs w:val="26"/>
                 <w:lang w:val="es-CO"/>
               </w:rPr>
-              <w:t>{mes_fin</w:t>
-            </w:r>
-            <w:r>
-              <w:rPr>
-                <w:rFonts w:asciiTheme="majorHAnsi" w:hAnsiTheme="majorHAnsi" w:cs="Arial"/>
-                <w:sz w:val="20"/>
-                <w:szCs w:val="26"/>
-                <w:lang w:val="es-CO"/>
-              </w:rPr>
-              <w:t>2</w:t>
-            </w:r>
-            <w:r>
-              <w:rPr>
-                <w:rFonts w:asciiTheme="majorHAnsi" w:hAnsiTheme="majorHAnsi" w:cs="Arial"/>
-                <w:sz w:val="20"/>
-                <w:szCs w:val="26"/>
-                <w:lang w:val="es-CO"/>
-              </w:rPr>
-              <w:t>}</w:t>
-            </w:r>
-            <w:r>
-              <w:rPr>
-                <w:rFonts w:asciiTheme="majorHAnsi" w:hAnsiTheme="majorHAnsi" w:cs="Arial"/>
-                <w:sz w:val="20"/>
-                <w:szCs w:val="26"/>
-                <w:lang w:val="es-CO"/>
-              </w:rPr>
-              <w:t xml:space="preserve">       </w:t>
-            </w:r>
-            <w:r>
-              <w:rPr>
-                <w:rFonts w:asciiTheme="majorHAnsi" w:hAnsiTheme="majorHAnsi" w:cs="Arial"/>
-                <w:sz w:val="20"/>
-                <w:szCs w:val="26"/>
-                <w:lang w:val="es-CO"/>
-              </w:rPr>
-              <w:t xml:space="preserve"> </w:t>
-            </w:r>
-            <w:r>
-              <w:rPr>
-                <w:rFonts w:asciiTheme="majorHAnsi" w:hAnsiTheme="majorHAnsi" w:cs="Arial"/>
-                <w:sz w:val="20"/>
-                <w:szCs w:val="26"/>
-                <w:lang w:val="es-CO"/>
-              </w:rPr>
-              <w:t>AÑO:</w:t>
-            </w:r>
-            <w:r>
-              <w:rPr>
-                <w:rFonts w:asciiTheme="majorHAnsi" w:hAnsiTheme="majorHAnsi" w:cs="Arial"/>
-                <w:sz w:val="20"/>
-                <w:szCs w:val="26"/>
-                <w:lang w:val="es-CO"/>
-              </w:rPr>
-              <w:t>{año_fin</w:t>
-            </w:r>
-            <w:r>
-              <w:rPr>
-                <w:rFonts w:asciiTheme="majorHAnsi" w:hAnsiTheme="majorHAnsi" w:cs="Arial"/>
-                <w:sz w:val="20"/>
-                <w:szCs w:val="26"/>
-                <w:lang w:val="es-CO"/>
-              </w:rPr>
-              <w:t>2</w:t>
-            </w:r>
-            <w:r>
-              <w:rPr>
-                <w:rFonts w:asciiTheme="majorHAnsi" w:hAnsiTheme="majorHAnsi" w:cs="Arial"/>
-                <w:sz w:val="20"/>
-                <w:szCs w:val="26"/>
-                <w:lang w:val="es-CO"/>
-              </w:rPr>
-              <w:t>}</w:t>
+              <w:t>{año_fin2}</w:t>
             </w:r>
           </w:p>
         </w:tc>
@@ -5845,25 +5580,7 @@
                 <w:szCs w:val="26"/>
                 <w:lang w:val="es-CO"/>
               </w:rPr>
-              <w:t>{cargo_empresa</w:t>
-            </w:r>
-            <w:r>
-              <w:rPr>
-                <w:rFonts w:ascii="Trebuchet MS" w:hAnsi="Trebuchet MS" w:cs="Arial"/>
-                <w:sz w:val="26"/>
-                <w:szCs w:val="26"/>
-                <w:lang w:val="es-CO"/>
-              </w:rPr>
-              <w:t>2</w:t>
-            </w:r>
-            <w:r>
-              <w:rPr>
-                <w:rFonts w:ascii="Trebuchet MS" w:hAnsi="Trebuchet MS" w:cs="Arial"/>
-                <w:sz w:val="26"/>
-                <w:szCs w:val="26"/>
-                <w:lang w:val="es-CO"/>
-              </w:rPr>
-              <w:t>}</w:t>
+              <w:t>{cargo_empresa2}</w:t>
             </w:r>
           </w:p>
         </w:tc>
@@ -5916,25 +5633,7 @@
                 <w:szCs w:val="26"/>
                 <w:lang w:val="es-CO"/>
               </w:rPr>
-              <w:t>{dirección_empresa</w:t>
-            </w:r>
-            <w:r>
-              <w:rPr>
-                <w:rFonts w:asciiTheme="majorHAnsi" w:hAnsiTheme="majorHAnsi" w:cs="Arial"/>
-                <w:sz w:val="26"/>
-                <w:szCs w:val="26"/>
-                <w:lang w:val="es-CO"/>
-              </w:rPr>
-              <w:t>2</w:t>
-            </w:r>
-            <w:r>
-              <w:rPr>
-                <w:rFonts w:asciiTheme="majorHAnsi" w:hAnsiTheme="majorHAnsi" w:cs="Arial"/>
-                <w:sz w:val="26"/>
-                <w:szCs w:val="26"/>
-                <w:lang w:val="es-CO"/>
-              </w:rPr>
-              <w:t>}</w:t>
+              <w:t>{dirección_empresa2}</w:t>
             </w:r>
           </w:p>
         </w:tc>
@@ -6047,16 +5746,7 @@
                 <w:szCs w:val="26"/>
                 <w:lang w:val="es-CO"/>
               </w:rPr>
-              <w:t>empresa_</w:t>
-            </w:r>
-            <w:r>
-              <w:rPr>
-                <w:rFonts w:ascii="Trebuchet MS" w:hAnsi="Trebuchet MS" w:cs="Arial"/>
-                <w:sz w:val="26"/>
-                <w:szCs w:val="26"/>
-                <w:lang w:val="es-CO"/>
-              </w:rPr>
-              <w:t>tres</w:t>
+              <w:t>empresa_tres</w:t>
             </w:r>
             <w:proofErr w:type="spellEnd"/>
             <w:r>
@@ -6236,25 +5926,7 @@
                 <w:szCs w:val="26"/>
                 <w:lang w:val="es-CO"/>
               </w:rPr>
-              <w:t>{departamento_empresa</w:t>
-            </w:r>
-            <w:r>
-              <w:rPr>
-                <w:rFonts w:ascii="Trebuchet MS" w:hAnsi="Trebuchet MS" w:cs="Arial"/>
-                <w:sz w:val="26"/>
-                <w:szCs w:val="26"/>
-                <w:lang w:val="es-CO"/>
-              </w:rPr>
-              <w:t>3</w:t>
-            </w:r>
-            <w:r>
-              <w:rPr>
-                <w:rFonts w:ascii="Trebuchet MS" w:hAnsi="Trebuchet MS" w:cs="Arial"/>
-                <w:sz w:val="26"/>
-                <w:szCs w:val="26"/>
-                <w:lang w:val="es-CO"/>
-              </w:rPr>
-              <w:t>}</w:t>
+              <w:t>{departamento_empresa3}</w:t>
             </w:r>
           </w:p>
         </w:tc>
@@ -6306,25 +5978,7 @@
                 <w:szCs w:val="26"/>
                 <w:lang w:val="es-CO"/>
               </w:rPr>
-              <w:t>{municipio_empresa</w:t>
-            </w:r>
-            <w:r>
-              <w:rPr>
-                <w:rFonts w:asciiTheme="majorHAnsi" w:hAnsiTheme="majorHAnsi" w:cs="Arial"/>
-                <w:sz w:val="26"/>
-                <w:szCs w:val="26"/>
-                <w:lang w:val="es-CO"/>
-              </w:rPr>
-              <w:t>3</w:t>
-            </w:r>
-            <w:r>
-              <w:rPr>
-                <w:rFonts w:asciiTheme="majorHAnsi" w:hAnsiTheme="majorHAnsi" w:cs="Arial"/>
-                <w:sz w:val="26"/>
-                <w:szCs w:val="26"/>
-                <w:lang w:val="es-CO"/>
-              </w:rPr>
-              <w:t>}</w:t>
+              <w:t>{municipio_empresa3}</w:t>
             </w:r>
           </w:p>
         </w:tc>
@@ -6377,25 +6031,7 @@
                 <w:szCs w:val="26"/>
                 <w:lang w:val="es-CO"/>
               </w:rPr>
-              <w:t>{email_empresa</w:t>
-            </w:r>
-            <w:r>
-              <w:rPr>
-                <w:rFonts w:asciiTheme="majorHAnsi" w:hAnsiTheme="majorHAnsi" w:cs="Arial"/>
-                <w:sz w:val="26"/>
-                <w:szCs w:val="26"/>
-                <w:lang w:val="es-CO"/>
-              </w:rPr>
-              <w:t>3</w:t>
-            </w:r>
-            <w:r>
-              <w:rPr>
-                <w:rFonts w:asciiTheme="majorHAnsi" w:hAnsiTheme="majorHAnsi" w:cs="Arial"/>
-                <w:sz w:val="26"/>
-                <w:szCs w:val="26"/>
-                <w:lang w:val="es-CO"/>
-              </w:rPr>
-              <w:t>}</w:t>
+              <w:t>{email_empresa3}</w:t>
             </w:r>
           </w:p>
         </w:tc>
@@ -6462,25 +6098,7 @@
                 <w:szCs w:val="26"/>
                 <w:lang w:val="es-CO"/>
               </w:rPr>
-              <w:t>{teléfono_emrpesa</w:t>
-            </w:r>
-            <w:r>
-              <w:rPr>
-                <w:rFonts w:ascii="Trebuchet MS" w:hAnsi="Trebuchet MS" w:cs="Arial"/>
-                <w:sz w:val="26"/>
-                <w:szCs w:val="26"/>
-                <w:lang w:val="es-CO"/>
-              </w:rPr>
-              <w:t>3</w:t>
-            </w:r>
-            <w:r>
-              <w:rPr>
-                <w:rFonts w:ascii="Trebuchet MS" w:hAnsi="Trebuchet MS" w:cs="Arial"/>
-                <w:sz w:val="26"/>
-                <w:szCs w:val="26"/>
-                <w:lang w:val="es-CO"/>
-              </w:rPr>
-              <w:t>}</w:t>
+              <w:t>{teléfono_emrpesa3}</w:t>
             </w:r>
           </w:p>
         </w:tc>
@@ -6542,7 +6160,7 @@
                 <w:szCs w:val="26"/>
                 <w:lang w:val="es-CO"/>
               </w:rPr>
-              <w:t>{dia_inicio</w:t>
+              <w:t>{dia_inicio3}</w:t>
             </w:r>
             <w:r>
               <w:rPr>
@@ -6551,7 +6169,7 @@
                 <w:szCs w:val="26"/>
                 <w:lang w:val="es-CO"/>
               </w:rPr>
-              <w:t>3</w:t>
+              <w:t xml:space="preserve">      MES:</w:t>
             </w:r>
             <w:r>
               <w:rPr>
@@ -6560,7 +6178,7 @@
                 <w:szCs w:val="26"/>
                 <w:lang w:val="es-CO"/>
               </w:rPr>
-              <w:t>}</w:t>
+              <w:t>{mes_inicio3}</w:t>
             </w:r>
             <w:r>
               <w:rPr>
@@ -6569,42 +6187,6 @@
                 <w:szCs w:val="26"/>
                 <w:lang w:val="es-CO"/>
               </w:rPr>
-              <w:t xml:space="preserve">      MES:</w:t>
-            </w:r>
-            <w:r>
-              <w:rPr>
-                <w:rFonts w:asciiTheme="majorHAnsi" w:hAnsiTheme="majorHAnsi" w:cs="Arial"/>
-                <w:sz w:val="20"/>
-                <w:szCs w:val="26"/>
-                <w:lang w:val="es-CO"/>
-              </w:rPr>
-              <w:t>{mes_inicio</w:t>
-            </w:r>
-            <w:r>
-              <w:rPr>
-                <w:rFonts w:asciiTheme="majorHAnsi" w:hAnsiTheme="majorHAnsi" w:cs="Arial"/>
-                <w:sz w:val="20"/>
-                <w:szCs w:val="26"/>
-                <w:lang w:val="es-CO"/>
-              </w:rPr>
-              <w:t>3</w:t>
-            </w:r>
-            <w:r>
-              <w:rPr>
-                <w:rFonts w:asciiTheme="majorHAnsi" w:hAnsiTheme="majorHAnsi" w:cs="Arial"/>
-                <w:sz w:val="20"/>
-                <w:szCs w:val="26"/>
-                <w:lang w:val="es-CO"/>
-              </w:rPr>
-              <w:t>}</w:t>
-            </w:r>
-            <w:r>
-              <w:rPr>
-                <w:rFonts w:asciiTheme="majorHAnsi" w:hAnsiTheme="majorHAnsi" w:cs="Arial"/>
-                <w:sz w:val="20"/>
-                <w:szCs w:val="26"/>
-                <w:lang w:val="es-CO"/>
-              </w:rPr>
               <w:t xml:space="preserve">       AÑO</w:t>
             </w:r>
             <w:r>
@@ -6623,25 +6205,7 @@
                 <w:szCs w:val="26"/>
                 <w:lang w:val="es-CO"/>
               </w:rPr>
-              <w:t>{año_inicio</w:t>
-            </w:r>
-            <w:r>
-              <w:rPr>
-                <w:rFonts w:asciiTheme="majorHAnsi" w:hAnsiTheme="majorHAnsi" w:cs="Arial"/>
-                <w:sz w:val="22"/>
-                <w:szCs w:val="26"/>
-                <w:lang w:val="es-CO"/>
-              </w:rPr>
-              <w:t>3</w:t>
-            </w:r>
-            <w:r>
-              <w:rPr>
-                <w:rFonts w:asciiTheme="majorHAnsi" w:hAnsiTheme="majorHAnsi" w:cs="Arial"/>
-                <w:sz w:val="22"/>
-                <w:szCs w:val="26"/>
-                <w:lang w:val="es-CO"/>
-              </w:rPr>
-              <w:t>}</w:t>
+              <w:t>{año_inicio3}</w:t>
             </w:r>
           </w:p>
         </w:tc>
@@ -6703,7 +6267,7 @@
                 <w:szCs w:val="26"/>
                 <w:lang w:val="es-CO"/>
               </w:rPr>
-              <w:t>{dia_fin</w:t>
+              <w:t>{dia_fin3}</w:t>
             </w:r>
             <w:r>
               <w:rPr>
@@ -6712,7 +6276,7 @@
                 <w:szCs w:val="26"/>
                 <w:lang w:val="es-CO"/>
               </w:rPr>
-              <w:t>3</w:t>
+              <w:t xml:space="preserve">     </w:t>
             </w:r>
             <w:r>
               <w:rPr>
@@ -6721,7 +6285,7 @@
                 <w:szCs w:val="26"/>
                 <w:lang w:val="es-CO"/>
               </w:rPr>
-              <w:t>}</w:t>
+              <w:t xml:space="preserve"> </w:t>
             </w:r>
             <w:r>
               <w:rPr>
@@ -6730,7 +6294,7 @@
                 <w:szCs w:val="26"/>
                 <w:lang w:val="es-CO"/>
               </w:rPr>
-              <w:t xml:space="preserve">     </w:t>
+              <w:t xml:space="preserve"> MES:</w:t>
             </w:r>
             <w:r>
               <w:rPr>
@@ -6739,6 +6303,24 @@
                 <w:szCs w:val="26"/>
                 <w:lang w:val="es-CO"/>
               </w:rPr>
+              <w:t>{mes_fin3}</w:t>
+            </w:r>
+            <w:r>
+              <w:rPr>
+                <w:rFonts w:asciiTheme="majorHAnsi" w:hAnsiTheme="majorHAnsi" w:cs="Arial"/>
+                <w:sz w:val="20"/>
+                <w:szCs w:val="26"/>
+                <w:lang w:val="es-CO"/>
+              </w:rPr>
+              <w:t xml:space="preserve">       </w:t>
+            </w:r>
+            <w:r>
+              <w:rPr>
+                <w:rFonts w:asciiTheme="majorHAnsi" w:hAnsiTheme="majorHAnsi" w:cs="Arial"/>
+                <w:sz w:val="20"/>
+                <w:szCs w:val="26"/>
+                <w:lang w:val="es-CO"/>
+              </w:rPr>
               <w:t xml:space="preserve"> </w:t>
             </w:r>
             <w:r>
@@ -6748,7 +6330,7 @@
                 <w:szCs w:val="26"/>
                 <w:lang w:val="es-CO"/>
               </w:rPr>
-              <w:t xml:space="preserve"> MES:</w:t>
+              <w:t>AÑO:</w:t>
             </w:r>
             <w:r>
               <w:rPr>
@@ -6757,79 +6339,7 @@
                 <w:szCs w:val="26"/>
                 <w:lang w:val="es-CO"/>
               </w:rPr>
-              <w:t>{mes_fin</w:t>
-            </w:r>
-            <w:r>
-              <w:rPr>
-                <w:rFonts w:asciiTheme="majorHAnsi" w:hAnsiTheme="majorHAnsi" w:cs="Arial"/>
-                <w:sz w:val="20"/>
-                <w:szCs w:val="26"/>
-                <w:lang w:val="es-CO"/>
-              </w:rPr>
-              <w:t>3</w:t>
-            </w:r>
-            <w:r>
-              <w:rPr>
-                <w:rFonts w:asciiTheme="majorHAnsi" w:hAnsiTheme="majorHAnsi" w:cs="Arial"/>
-                <w:sz w:val="20"/>
-                <w:szCs w:val="26"/>
-                <w:lang w:val="es-CO"/>
-              </w:rPr>
-              <w:t>}</w:t>
-            </w:r>
-            <w:r>
-              <w:rPr>
-                <w:rFonts w:asciiTheme="majorHAnsi" w:hAnsiTheme="majorHAnsi" w:cs="Arial"/>
-                <w:sz w:val="20"/>
-                <w:szCs w:val="26"/>
-                <w:lang w:val="es-CO"/>
-              </w:rPr>
-              <w:t xml:space="preserve">       </w:t>
-            </w:r>
-            <w:r>
-              <w:rPr>
-                <w:rFonts w:asciiTheme="majorHAnsi" w:hAnsiTheme="majorHAnsi" w:cs="Arial"/>
-                <w:sz w:val="20"/>
-                <w:szCs w:val="26"/>
-                <w:lang w:val="es-CO"/>
-              </w:rPr>
-              <w:t xml:space="preserve"> </w:t>
-            </w:r>
-            <w:r>
-              <w:rPr>
-                <w:rFonts w:asciiTheme="majorHAnsi" w:hAnsiTheme="majorHAnsi" w:cs="Arial"/>
-                <w:sz w:val="20"/>
-                <w:szCs w:val="26"/>
-                <w:lang w:val="es-CO"/>
-              </w:rPr>
-              <w:t>AÑO:</w:t>
-            </w:r>
-            <w:r>
-              <w:rPr>
-                <w:rFonts w:asciiTheme="majorHAnsi" w:hAnsiTheme="majorHAnsi" w:cs="Arial"/>
-                <w:sz w:val="20"/>
-                <w:szCs w:val="26"/>
-                <w:lang w:val="es-CO"/>
-              </w:rPr>
-              <w:t>{año_fin</w:t>
-            </w:r>
-            <w:r>
-              <w:rPr>
-                <w:rFonts w:asciiTheme="majorHAnsi" w:hAnsiTheme="majorHAnsi" w:cs="Arial"/>
-                <w:sz w:val="20"/>
-                <w:szCs w:val="26"/>
-                <w:lang w:val="es-CO"/>
-              </w:rPr>
-              <w:t>3</w:t>
-            </w:r>
-            <w:r>
-              <w:rPr>
-                <w:rFonts w:asciiTheme="majorHAnsi" w:hAnsiTheme="majorHAnsi" w:cs="Arial"/>
-                <w:sz w:val="20"/>
-                <w:szCs w:val="26"/>
-                <w:lang w:val="es-CO"/>
-              </w:rPr>
-              <w:t>}</w:t>
+              <w:t>{año_fin3}</w:t>
             </w:r>
           </w:p>
         </w:tc>
@@ -6897,25 +6407,7 @@
                 <w:szCs w:val="26"/>
                 <w:lang w:val="es-CO"/>
               </w:rPr>
-              <w:t>{cargo_empresa</w:t>
-            </w:r>
-            <w:r>
-              <w:rPr>
-                <w:rFonts w:ascii="Trebuchet MS" w:hAnsi="Trebuchet MS" w:cs="Arial"/>
-                <w:sz w:val="26"/>
-                <w:szCs w:val="26"/>
-                <w:lang w:val="es-CO"/>
-              </w:rPr>
-              <w:t>3</w:t>
-            </w:r>
-            <w:r>
-              <w:rPr>
-                <w:rFonts w:ascii="Trebuchet MS" w:hAnsi="Trebuchet MS" w:cs="Arial"/>
-                <w:sz w:val="26"/>
-                <w:szCs w:val="26"/>
-                <w:lang w:val="es-CO"/>
-              </w:rPr>
-              <w:t>}</w:t>
+              <w:t>{cargo_empresa3}</w:t>
             </w:r>
           </w:p>
         </w:tc>
@@ -6968,25 +6460,7 @@
                 <w:szCs w:val="26"/>
                 <w:lang w:val="es-CO"/>
               </w:rPr>
-              <w:t>{dirección_empresa</w:t>
-            </w:r>
-            <w:r>
-              <w:rPr>
-                <w:rFonts w:asciiTheme="majorHAnsi" w:hAnsiTheme="majorHAnsi" w:cs="Arial"/>
-                <w:sz w:val="26"/>
-                <w:szCs w:val="26"/>
-                <w:lang w:val="es-CO"/>
-              </w:rPr>
-              <w:t>3</w:t>
-            </w:r>
-            <w:r>
-              <w:rPr>
-                <w:rFonts w:asciiTheme="majorHAnsi" w:hAnsiTheme="majorHAnsi" w:cs="Arial"/>
-                <w:sz w:val="26"/>
-                <w:szCs w:val="26"/>
-                <w:lang w:val="es-CO"/>
-              </w:rPr>
-              <w:t>}</w:t>
+              <w:t>{dirección_empresa3}</w:t>
             </w:r>
           </w:p>
         </w:tc>
@@ -7967,31 +7441,39 @@
                 <w:szCs w:val="26"/>
                 <w:lang w:val="en-US"/>
               </w:rPr>
-              <w:t>{academia_</w:t>
-            </w:r>
-            <w:r>
+              <w:t>{academia_2}</w:t>
+            </w:r>
+          </w:p>
+        </w:tc>
+        <w:tc>
+          <w:tcPr>
+            <w:tcW w:w="2978" w:type="dxa"/>
+            <w:vAlign w:val="center"/>
+          </w:tcPr>
+          <w:p>
+            <w:pPr>
+              <w:jc w:val="center"/>
               <w:rPr>
                 <w:rFonts w:ascii="Trebuchet MS" w:hAnsi="Trebuchet MS"/>
                 <w:sz w:val="26"/>
                 <w:szCs w:val="26"/>
-                <w:lang w:val="en-US"/>
-              </w:rPr>
-              <w:t>2</w:t>
-            </w:r>
+                <w:lang w:val="es-MX"/>
+              </w:rPr>
+            </w:pPr>
             <w:r>
               <w:rPr>
                 <w:rFonts w:ascii="Trebuchet MS" w:hAnsi="Trebuchet MS"/>
                 <w:sz w:val="26"/>
                 <w:szCs w:val="26"/>
-                <w:lang w:val="en-US"/>
-              </w:rPr>
-              <w:t>}</w:t>
-            </w:r>
-          </w:p>
-        </w:tc>
-        <w:tc>
-          <w:tcPr>
-            <w:tcW w:w="2978" w:type="dxa"/>
+                <w:lang w:val="es-MX"/>
+              </w:rPr>
+              <w:t>{titulo_obtenido2}</w:t>
+            </w:r>
+          </w:p>
+        </w:tc>
+        <w:tc>
+          <w:tcPr>
+            <w:tcW w:w="2872" w:type="dxa"/>
             <w:vAlign w:val="center"/>
           </w:tcPr>
           <w:p>
@@ -8011,17 +7493,25 @@
                 <w:szCs w:val="26"/>
                 <w:lang w:val="es-MX"/>
               </w:rPr>
-              <w:t>{titulo_obtenido</w:t>
-            </w:r>
-            <w:r>
+              <w:t>{intensidad_horaria2}</w:t>
+            </w:r>
+          </w:p>
+        </w:tc>
+        <w:tc>
+          <w:tcPr>
+            <w:tcW w:w="1646" w:type="dxa"/>
+            <w:vAlign w:val="center"/>
+          </w:tcPr>
+          <w:p>
+            <w:pPr>
+              <w:jc w:val="center"/>
               <w:rPr>
                 <w:rFonts w:ascii="Trebuchet MS" w:hAnsi="Trebuchet MS"/>
                 <w:sz w:val="26"/>
                 <w:szCs w:val="26"/>
                 <w:lang w:val="es-MX"/>
               </w:rPr>
-              <w:t>2</w:t>
-            </w:r>
+            </w:pPr>
             <w:r>
               <w:rPr>
                 <w:rFonts w:ascii="Trebuchet MS" w:hAnsi="Trebuchet MS"/>
@@ -8029,95 +7519,7 @@
                 <w:szCs w:val="26"/>
                 <w:lang w:val="es-MX"/>
               </w:rPr>
-              <w:t>}</w:t>
-            </w:r>
-          </w:p>
-        </w:tc>
-        <w:tc>
-          <w:tcPr>
-            <w:tcW w:w="2872" w:type="dxa"/>
-            <w:vAlign w:val="center"/>
-          </w:tcPr>
-          <w:p>
-            <w:pPr>
-              <w:jc w:val="center"/>
-              <w:rPr>
-                <w:rFonts w:ascii="Trebuchet MS" w:hAnsi="Trebuchet MS"/>
-                <w:sz w:val="26"/>
-                <w:szCs w:val="26"/>
-                <w:lang w:val="es-MX"/>
-              </w:rPr>
-            </w:pPr>
-            <w:r>
-              <w:rPr>
-                <w:rFonts w:ascii="Trebuchet MS" w:hAnsi="Trebuchet MS"/>
-                <w:sz w:val="26"/>
-                <w:szCs w:val="26"/>
-                <w:lang w:val="es-MX"/>
-              </w:rPr>
-              <w:t>{intensidad_horaria</w:t>
-            </w:r>
-            <w:r>
-              <w:rPr>
-                <w:rFonts w:ascii="Trebuchet MS" w:hAnsi="Trebuchet MS"/>
-                <w:sz w:val="26"/>
-                <w:szCs w:val="26"/>
-                <w:lang w:val="es-MX"/>
-              </w:rPr>
-              <w:t>2</w:t>
-            </w:r>
-            <w:r>
-              <w:rPr>
-                <w:rFonts w:ascii="Trebuchet MS" w:hAnsi="Trebuchet MS"/>
-                <w:sz w:val="26"/>
-                <w:szCs w:val="26"/>
-                <w:lang w:val="es-MX"/>
-              </w:rPr>
-              <w:t>}</w:t>
-            </w:r>
-          </w:p>
-        </w:tc>
-        <w:tc>
-          <w:tcPr>
-            <w:tcW w:w="1646" w:type="dxa"/>
-            <w:vAlign w:val="center"/>
-          </w:tcPr>
-          <w:p>
-            <w:pPr>
-              <w:jc w:val="center"/>
-              <w:rPr>
-                <w:rFonts w:ascii="Trebuchet MS" w:hAnsi="Trebuchet MS"/>
-                <w:sz w:val="26"/>
-                <w:szCs w:val="26"/>
-                <w:lang w:val="es-MX"/>
-              </w:rPr>
-            </w:pPr>
-            <w:r>
-              <w:rPr>
-                <w:rFonts w:ascii="Trebuchet MS" w:hAnsi="Trebuchet MS"/>
-                <w:sz w:val="26"/>
-                <w:szCs w:val="26"/>
-                <w:lang w:val="es-MX"/>
-              </w:rPr>
-              <w:t>{añoTaller</w:t>
-            </w:r>
-            <w:r>
-              <w:rPr>
-                <w:rFonts w:ascii="Trebuchet MS" w:hAnsi="Trebuchet MS"/>
-                <w:sz w:val="26"/>
-                <w:szCs w:val="26"/>
-                <w:lang w:val="es-MX"/>
-              </w:rPr>
-              <w:t>2</w:t>
-            </w:r>
-            <w:r>
-              <w:rPr>
-                <w:rFonts w:ascii="Trebuchet MS" w:hAnsi="Trebuchet MS"/>
-                <w:sz w:val="26"/>
-                <w:szCs w:val="26"/>
-                <w:lang w:val="es-MX"/>
-              </w:rPr>
-              <w:t>}</w:t>
+              <w:t>{añoTaller2}</w:t>
             </w:r>
           </w:p>
         </w:tc>
@@ -8148,31 +7550,39 @@
                 <w:szCs w:val="26"/>
                 <w:lang w:val="en-US"/>
               </w:rPr>
-              <w:t>{academia_</w:t>
-            </w:r>
-            <w:r>
+              <w:t>{academia_3}</w:t>
+            </w:r>
+          </w:p>
+        </w:tc>
+        <w:tc>
+          <w:tcPr>
+            <w:tcW w:w="2978" w:type="dxa"/>
+            <w:vAlign w:val="center"/>
+          </w:tcPr>
+          <w:p>
+            <w:pPr>
+              <w:jc w:val="center"/>
               <w:rPr>
                 <w:rFonts w:ascii="Trebuchet MS" w:hAnsi="Trebuchet MS"/>
                 <w:sz w:val="26"/>
                 <w:szCs w:val="26"/>
-                <w:lang w:val="en-US"/>
-              </w:rPr>
-              <w:t>3</w:t>
-            </w:r>
+                <w:lang w:val="es-MX"/>
+              </w:rPr>
+            </w:pPr>
             <w:r>
               <w:rPr>
                 <w:rFonts w:ascii="Trebuchet MS" w:hAnsi="Trebuchet MS"/>
                 <w:sz w:val="26"/>
                 <w:szCs w:val="26"/>
-                <w:lang w:val="en-US"/>
-              </w:rPr>
-              <w:t>}</w:t>
-            </w:r>
-          </w:p>
-        </w:tc>
-        <w:tc>
-          <w:tcPr>
-            <w:tcW w:w="2978" w:type="dxa"/>
+                <w:lang w:val="es-MX"/>
+              </w:rPr>
+              <w:t>{titulo_obtenido3}</w:t>
+            </w:r>
+          </w:p>
+        </w:tc>
+        <w:tc>
+          <w:tcPr>
+            <w:tcW w:w="2872" w:type="dxa"/>
             <w:vAlign w:val="center"/>
           </w:tcPr>
           <w:p>
@@ -8192,17 +7602,25 @@
                 <w:szCs w:val="26"/>
                 <w:lang w:val="es-MX"/>
               </w:rPr>
-              <w:t>{titulo_obtenido</w:t>
-            </w:r>
-            <w:r>
+              <w:t>{intensidad_horaria3}</w:t>
+            </w:r>
+          </w:p>
+        </w:tc>
+        <w:tc>
+          <w:tcPr>
+            <w:tcW w:w="1646" w:type="dxa"/>
+            <w:vAlign w:val="center"/>
+          </w:tcPr>
+          <w:p>
+            <w:pPr>
+              <w:jc w:val="center"/>
               <w:rPr>
                 <w:rFonts w:ascii="Trebuchet MS" w:hAnsi="Trebuchet MS"/>
                 <w:sz w:val="26"/>
                 <w:szCs w:val="26"/>
                 <w:lang w:val="es-MX"/>
               </w:rPr>
-              <w:t>3</w:t>
-            </w:r>
+            </w:pPr>
             <w:r>
               <w:rPr>
                 <w:rFonts w:ascii="Trebuchet MS" w:hAnsi="Trebuchet MS"/>
@@ -8210,95 +7628,7 @@
                 <w:szCs w:val="26"/>
                 <w:lang w:val="es-MX"/>
               </w:rPr>
-              <w:t>}</w:t>
-            </w:r>
-          </w:p>
-        </w:tc>
-        <w:tc>
-          <w:tcPr>
-            <w:tcW w:w="2872" w:type="dxa"/>
-            <w:vAlign w:val="center"/>
-          </w:tcPr>
-          <w:p>
-            <w:pPr>
-              <w:jc w:val="center"/>
-              <w:rPr>
-                <w:rFonts w:ascii="Trebuchet MS" w:hAnsi="Trebuchet MS"/>
-                <w:sz w:val="26"/>
-                <w:szCs w:val="26"/>
-                <w:lang w:val="es-MX"/>
-              </w:rPr>
-            </w:pPr>
-            <w:r>
-              <w:rPr>
-                <w:rFonts w:ascii="Trebuchet MS" w:hAnsi="Trebuchet MS"/>
-                <w:sz w:val="26"/>
-                <w:szCs w:val="26"/>
-                <w:lang w:val="es-MX"/>
-              </w:rPr>
-              <w:t>{intensidad_horaria</w:t>
-            </w:r>
-            <w:r>
-              <w:rPr>
-                <w:rFonts w:ascii="Trebuchet MS" w:hAnsi="Trebuchet MS"/>
-                <w:sz w:val="26"/>
-                <w:szCs w:val="26"/>
-                <w:lang w:val="es-MX"/>
-              </w:rPr>
-              <w:t>3</w:t>
-            </w:r>
-            <w:r>
-              <w:rPr>
-                <w:rFonts w:ascii="Trebuchet MS" w:hAnsi="Trebuchet MS"/>
-                <w:sz w:val="26"/>
-                <w:szCs w:val="26"/>
-                <w:lang w:val="es-MX"/>
-              </w:rPr>
-              <w:t>}</w:t>
-            </w:r>
-          </w:p>
-        </w:tc>
-        <w:tc>
-          <w:tcPr>
-            <w:tcW w:w="1646" w:type="dxa"/>
-            <w:vAlign w:val="center"/>
-          </w:tcPr>
-          <w:p>
-            <w:pPr>
-              <w:jc w:val="center"/>
-              <w:rPr>
-                <w:rFonts w:ascii="Trebuchet MS" w:hAnsi="Trebuchet MS"/>
-                <w:sz w:val="26"/>
-                <w:szCs w:val="26"/>
-                <w:lang w:val="es-MX"/>
-              </w:rPr>
-            </w:pPr>
-            <w:r>
-              <w:rPr>
-                <w:rFonts w:ascii="Trebuchet MS" w:hAnsi="Trebuchet MS"/>
-                <w:sz w:val="26"/>
-                <w:szCs w:val="26"/>
-                <w:lang w:val="es-MX"/>
-              </w:rPr>
-              <w:t>{añoTaller</w:t>
-            </w:r>
-            <w:r>
-              <w:rPr>
-                <w:rFonts w:ascii="Trebuchet MS" w:hAnsi="Trebuchet MS"/>
-                <w:sz w:val="26"/>
-                <w:szCs w:val="26"/>
-                <w:lang w:val="es-MX"/>
-              </w:rPr>
-              <w:t>3</w:t>
-            </w:r>
-            <w:r>
-              <w:rPr>
-                <w:rFonts w:ascii="Trebuchet MS" w:hAnsi="Trebuchet MS"/>
-                <w:sz w:val="26"/>
-                <w:szCs w:val="26"/>
-                <w:lang w:val="es-MX"/>
-              </w:rPr>
-              <w:t>}</w:t>
+              <w:t>{añoTaller3}</w:t>
             </w:r>
           </w:p>
         </w:tc>
@@ -8329,31 +7659,39 @@
                 <w:szCs w:val="26"/>
                 <w:lang w:val="en-US"/>
               </w:rPr>
-              <w:t>{academia_</w:t>
-            </w:r>
-            <w:r>
+              <w:t>{academia_4}</w:t>
+            </w:r>
+          </w:p>
+        </w:tc>
+        <w:tc>
+          <w:tcPr>
+            <w:tcW w:w="2978" w:type="dxa"/>
+            <w:vAlign w:val="center"/>
+          </w:tcPr>
+          <w:p>
+            <w:pPr>
+              <w:jc w:val="center"/>
               <w:rPr>
                 <w:rFonts w:ascii="Trebuchet MS" w:hAnsi="Trebuchet MS"/>
                 <w:sz w:val="26"/>
                 <w:szCs w:val="26"/>
-                <w:lang w:val="en-US"/>
-              </w:rPr>
-              <w:t>4</w:t>
-            </w:r>
+                <w:lang w:val="es-MX"/>
+              </w:rPr>
+            </w:pPr>
             <w:r>
               <w:rPr>
                 <w:rFonts w:ascii="Trebuchet MS" w:hAnsi="Trebuchet MS"/>
                 <w:sz w:val="26"/>
                 <w:szCs w:val="26"/>
-                <w:lang w:val="en-US"/>
-              </w:rPr>
-              <w:t>}</w:t>
-            </w:r>
-          </w:p>
-        </w:tc>
-        <w:tc>
-          <w:tcPr>
-            <w:tcW w:w="2978" w:type="dxa"/>
+                <w:lang w:val="es-MX"/>
+              </w:rPr>
+              <w:t>{titulo_obtenido4}</w:t>
+            </w:r>
+          </w:p>
+        </w:tc>
+        <w:tc>
+          <w:tcPr>
+            <w:tcW w:w="2872" w:type="dxa"/>
             <w:vAlign w:val="center"/>
           </w:tcPr>
           <w:p>
@@ -8373,17 +7711,25 @@
                 <w:szCs w:val="26"/>
                 <w:lang w:val="es-MX"/>
               </w:rPr>
-              <w:t>{titulo_obtenido</w:t>
-            </w:r>
-            <w:r>
+              <w:t>{intensidad_horaria4}</w:t>
+            </w:r>
+          </w:p>
+        </w:tc>
+        <w:tc>
+          <w:tcPr>
+            <w:tcW w:w="1646" w:type="dxa"/>
+            <w:vAlign w:val="center"/>
+          </w:tcPr>
+          <w:p>
+            <w:pPr>
+              <w:jc w:val="center"/>
               <w:rPr>
                 <w:rFonts w:ascii="Trebuchet MS" w:hAnsi="Trebuchet MS"/>
                 <w:sz w:val="26"/>
                 <w:szCs w:val="26"/>
                 <w:lang w:val="es-MX"/>
               </w:rPr>
-              <w:t>4</w:t>
-            </w:r>
+            </w:pPr>
             <w:r>
               <w:rPr>
                 <w:rFonts w:ascii="Trebuchet MS" w:hAnsi="Trebuchet MS"/>
@@ -8391,95 +7737,7 @@
                 <w:szCs w:val="26"/>
                 <w:lang w:val="es-MX"/>
               </w:rPr>
-              <w:t>}</w:t>
-            </w:r>
-          </w:p>
-        </w:tc>
-        <w:tc>
-          <w:tcPr>
-            <w:tcW w:w="2872" w:type="dxa"/>
-            <w:vAlign w:val="center"/>
-          </w:tcPr>
-          <w:p>
-            <w:pPr>
-              <w:jc w:val="center"/>
-              <w:rPr>
-                <w:rFonts w:ascii="Trebuchet MS" w:hAnsi="Trebuchet MS"/>
-                <w:sz w:val="26"/>
-                <w:szCs w:val="26"/>
-                <w:lang w:val="es-MX"/>
-              </w:rPr>
-            </w:pPr>
-            <w:r>
-              <w:rPr>
-                <w:rFonts w:ascii="Trebuchet MS" w:hAnsi="Trebuchet MS"/>
-                <w:sz w:val="26"/>
-                <w:szCs w:val="26"/>
-                <w:lang w:val="es-MX"/>
-              </w:rPr>
-              <w:t>{intensidad_horaria</w:t>
-            </w:r>
-            <w:r>
-              <w:rPr>
-                <w:rFonts w:ascii="Trebuchet MS" w:hAnsi="Trebuchet MS"/>
-                <w:sz w:val="26"/>
-                <w:szCs w:val="26"/>
-                <w:lang w:val="es-MX"/>
-              </w:rPr>
-              <w:t>4</w:t>
-            </w:r>
-            <w:r>
-              <w:rPr>
-                <w:rFonts w:ascii="Trebuchet MS" w:hAnsi="Trebuchet MS"/>
-                <w:sz w:val="26"/>
-                <w:szCs w:val="26"/>
-                <w:lang w:val="es-MX"/>
-              </w:rPr>
-              <w:t>}</w:t>
-            </w:r>
-          </w:p>
-        </w:tc>
-        <w:tc>
-          <w:tcPr>
-            <w:tcW w:w="1646" w:type="dxa"/>
-            <w:vAlign w:val="center"/>
-          </w:tcPr>
-          <w:p>
-            <w:pPr>
-              <w:jc w:val="center"/>
-              <w:rPr>
-                <w:rFonts w:ascii="Trebuchet MS" w:hAnsi="Trebuchet MS"/>
-                <w:sz w:val="26"/>
-                <w:szCs w:val="26"/>
-                <w:lang w:val="es-MX"/>
-              </w:rPr>
-            </w:pPr>
-            <w:r>
-              <w:rPr>
-                <w:rFonts w:ascii="Trebuchet MS" w:hAnsi="Trebuchet MS"/>
-                <w:sz w:val="26"/>
-                <w:szCs w:val="26"/>
-                <w:lang w:val="es-MX"/>
-              </w:rPr>
-              <w:t>{añoTaller</w:t>
-            </w:r>
-            <w:r>
-              <w:rPr>
-                <w:rFonts w:ascii="Trebuchet MS" w:hAnsi="Trebuchet MS"/>
-                <w:sz w:val="26"/>
-                <w:szCs w:val="26"/>
-                <w:lang w:val="es-MX"/>
-              </w:rPr>
-              <w:t>4</w:t>
-            </w:r>
-            <w:r>
-              <w:rPr>
-                <w:rFonts w:ascii="Trebuchet MS" w:hAnsi="Trebuchet MS"/>
-                <w:sz w:val="26"/>
-                <w:szCs w:val="26"/>
-                <w:lang w:val="es-MX"/>
-              </w:rPr>
-              <w:t>}</w:t>
+              <w:t>{añoTaller4}</w:t>
             </w:r>
           </w:p>
         </w:tc>
@@ -8708,31 +7966,39 @@
                 <w:szCs w:val="26"/>
                 <w:lang w:val="en-US"/>
               </w:rPr>
-              <w:t>{academia_</w:t>
-            </w:r>
-            <w:r>
+              <w:t>{academia_5}</w:t>
+            </w:r>
+          </w:p>
+        </w:tc>
+        <w:tc>
+          <w:tcPr>
+            <w:tcW w:w="3260" w:type="dxa"/>
+            <w:vAlign w:val="center"/>
+          </w:tcPr>
+          <w:p>
+            <w:pPr>
+              <w:jc w:val="center"/>
               <w:rPr>
                 <w:rFonts w:ascii="Trebuchet MS" w:hAnsi="Trebuchet MS"/>
                 <w:sz w:val="26"/>
                 <w:szCs w:val="26"/>
-                <w:lang w:val="en-US"/>
-              </w:rPr>
-              <w:t>5</w:t>
-            </w:r>
+                <w:lang w:val="es-MX"/>
+              </w:rPr>
+            </w:pPr>
             <w:r>
               <w:rPr>
                 <w:rFonts w:ascii="Trebuchet MS" w:hAnsi="Trebuchet MS"/>
                 <w:sz w:val="26"/>
                 <w:szCs w:val="26"/>
-                <w:lang w:val="en-US"/>
-              </w:rPr>
-              <w:t>}</w:t>
-            </w:r>
-          </w:p>
-        </w:tc>
-        <w:tc>
-          <w:tcPr>
-            <w:tcW w:w="3260" w:type="dxa"/>
+                <w:lang w:val="es-MX"/>
+              </w:rPr>
+              <w:t>{titulo_obtenido5}</w:t>
+            </w:r>
+          </w:p>
+        </w:tc>
+        <w:tc>
+          <w:tcPr>
+            <w:tcW w:w="2940" w:type="dxa"/>
             <w:vAlign w:val="center"/>
           </w:tcPr>
           <w:p>
@@ -8752,17 +8018,25 @@
                 <w:szCs w:val="26"/>
                 <w:lang w:val="es-MX"/>
               </w:rPr>
-              <w:t>{titulo_obtenido</w:t>
-            </w:r>
-            <w:r>
+              <w:t>{intensidad_horaria5}</w:t>
+            </w:r>
+          </w:p>
+        </w:tc>
+        <w:tc>
+          <w:tcPr>
+            <w:tcW w:w="887" w:type="dxa"/>
+            <w:vAlign w:val="center"/>
+          </w:tcPr>
+          <w:p>
+            <w:pPr>
+              <w:jc w:val="center"/>
               <w:rPr>
                 <w:rFonts w:ascii="Trebuchet MS" w:hAnsi="Trebuchet MS"/>
                 <w:sz w:val="26"/>
                 <w:szCs w:val="26"/>
                 <w:lang w:val="es-MX"/>
               </w:rPr>
-              <w:t>5</w:t>
-            </w:r>
+            </w:pPr>
             <w:r>
               <w:rPr>
                 <w:rFonts w:ascii="Trebuchet MS" w:hAnsi="Trebuchet MS"/>
@@ -8770,95 +8044,7 @@
                 <w:szCs w:val="26"/>
                 <w:lang w:val="es-MX"/>
               </w:rPr>
-              <w:t>}</w:t>
-            </w:r>
-          </w:p>
-        </w:tc>
-        <w:tc>
-          <w:tcPr>
-            <w:tcW w:w="2940" w:type="dxa"/>
-            <w:vAlign w:val="center"/>
-          </w:tcPr>
-          <w:p>
-            <w:pPr>
-              <w:jc w:val="center"/>
-              <w:rPr>
-                <w:rFonts w:ascii="Trebuchet MS" w:hAnsi="Trebuchet MS"/>
-                <w:sz w:val="26"/>
-                <w:szCs w:val="26"/>
-                <w:lang w:val="es-MX"/>
-              </w:rPr>
-            </w:pPr>
-            <w:r>
-              <w:rPr>
-                <w:rFonts w:ascii="Trebuchet MS" w:hAnsi="Trebuchet MS"/>
-                <w:sz w:val="26"/>
-                <w:szCs w:val="26"/>
-                <w:lang w:val="es-MX"/>
-              </w:rPr>
-              <w:t>{intensidad_horaria</w:t>
-            </w:r>
-            <w:r>
-              <w:rPr>
-                <w:rFonts w:ascii="Trebuchet MS" w:hAnsi="Trebuchet MS"/>
-                <w:sz w:val="26"/>
-                <w:szCs w:val="26"/>
-                <w:lang w:val="es-MX"/>
-              </w:rPr>
-              <w:t>5</w:t>
-            </w:r>
-            <w:r>
-              <w:rPr>
-                <w:rFonts w:ascii="Trebuchet MS" w:hAnsi="Trebuchet MS"/>
-                <w:sz w:val="26"/>
-                <w:szCs w:val="26"/>
-                <w:lang w:val="es-MX"/>
-              </w:rPr>
-              <w:t>}</w:t>
-            </w:r>
-          </w:p>
-        </w:tc>
-        <w:tc>
-          <w:tcPr>
-            <w:tcW w:w="887" w:type="dxa"/>
-            <w:vAlign w:val="center"/>
-          </w:tcPr>
-          <w:p>
-            <w:pPr>
-              <w:jc w:val="center"/>
-              <w:rPr>
-                <w:rFonts w:ascii="Trebuchet MS" w:hAnsi="Trebuchet MS"/>
-                <w:sz w:val="26"/>
-                <w:szCs w:val="26"/>
-                <w:lang w:val="es-MX"/>
-              </w:rPr>
-            </w:pPr>
-            <w:r>
-              <w:rPr>
-                <w:rFonts w:ascii="Trebuchet MS" w:hAnsi="Trebuchet MS"/>
-                <w:sz w:val="26"/>
-                <w:szCs w:val="26"/>
-                <w:lang w:val="es-MX"/>
-              </w:rPr>
-              <w:t>{añoTaller</w:t>
-            </w:r>
-            <w:r>
-              <w:rPr>
-                <w:rFonts w:ascii="Trebuchet MS" w:hAnsi="Trebuchet MS"/>
-                <w:sz w:val="26"/>
-                <w:szCs w:val="26"/>
-                <w:lang w:val="es-MX"/>
-              </w:rPr>
-              <w:t>5</w:t>
-            </w:r>
-            <w:r>
-              <w:rPr>
-                <w:rFonts w:ascii="Trebuchet MS" w:hAnsi="Trebuchet MS"/>
-                <w:sz w:val="26"/>
-                <w:szCs w:val="26"/>
-                <w:lang w:val="es-MX"/>
-              </w:rPr>
-              <w:t>}</w:t>
+              <w:t>{añoTaller5}</w:t>
             </w:r>
           </w:p>
         </w:tc>
@@ -8889,31 +8075,39 @@
                 <w:szCs w:val="26"/>
                 <w:lang w:val="en-US"/>
               </w:rPr>
-              <w:t>{academia_</w:t>
-            </w:r>
-            <w:r>
+              <w:t>{academia_6}</w:t>
+            </w:r>
+          </w:p>
+        </w:tc>
+        <w:tc>
+          <w:tcPr>
+            <w:tcW w:w="3260" w:type="dxa"/>
+            <w:vAlign w:val="center"/>
+          </w:tcPr>
+          <w:p>
+            <w:pPr>
+              <w:jc w:val="center"/>
               <w:rPr>
                 <w:rFonts w:ascii="Trebuchet MS" w:hAnsi="Trebuchet MS"/>
                 <w:sz w:val="26"/>
                 <w:szCs w:val="26"/>
-                <w:lang w:val="en-US"/>
-              </w:rPr>
-              <w:t>6</w:t>
-            </w:r>
+                <w:lang w:val="es-MX"/>
+              </w:rPr>
+            </w:pPr>
             <w:r>
               <w:rPr>
                 <w:rFonts w:ascii="Trebuchet MS" w:hAnsi="Trebuchet MS"/>
                 <w:sz w:val="26"/>
                 <w:szCs w:val="26"/>
-                <w:lang w:val="en-US"/>
-              </w:rPr>
-              <w:t>}</w:t>
-            </w:r>
-          </w:p>
-        </w:tc>
-        <w:tc>
-          <w:tcPr>
-            <w:tcW w:w="3260" w:type="dxa"/>
+                <w:lang w:val="es-MX"/>
+              </w:rPr>
+              <w:t>{titulo_obtenido6}</w:t>
+            </w:r>
+          </w:p>
+        </w:tc>
+        <w:tc>
+          <w:tcPr>
+            <w:tcW w:w="2940" w:type="dxa"/>
             <w:vAlign w:val="center"/>
           </w:tcPr>
           <w:p>
@@ -8933,17 +8127,25 @@
                 <w:szCs w:val="26"/>
                 <w:lang w:val="es-MX"/>
               </w:rPr>
-              <w:t>{titulo_obtenido</w:t>
-            </w:r>
-            <w:r>
+              <w:t>{intensidad_horaria6}</w:t>
+            </w:r>
+          </w:p>
+        </w:tc>
+        <w:tc>
+          <w:tcPr>
+            <w:tcW w:w="887" w:type="dxa"/>
+            <w:vAlign w:val="center"/>
+          </w:tcPr>
+          <w:p>
+            <w:pPr>
+              <w:jc w:val="center"/>
               <w:rPr>
                 <w:rFonts w:ascii="Trebuchet MS" w:hAnsi="Trebuchet MS"/>
                 <w:sz w:val="26"/>
                 <w:szCs w:val="26"/>
                 <w:lang w:val="es-MX"/>
               </w:rPr>
-              <w:t>6</w:t>
-            </w:r>
+            </w:pPr>
             <w:r>
               <w:rPr>
                 <w:rFonts w:ascii="Trebuchet MS" w:hAnsi="Trebuchet MS"/>
@@ -8951,95 +8153,7 @@
                 <w:szCs w:val="26"/>
                 <w:lang w:val="es-MX"/>
               </w:rPr>
-              <w:t>}</w:t>
-            </w:r>
-          </w:p>
-        </w:tc>
-        <w:tc>
-          <w:tcPr>
-            <w:tcW w:w="2940" w:type="dxa"/>
-            <w:vAlign w:val="center"/>
-          </w:tcPr>
-          <w:p>
-            <w:pPr>
-              <w:jc w:val="center"/>
-              <w:rPr>
-                <w:rFonts w:ascii="Trebuchet MS" w:hAnsi="Trebuchet MS"/>
-                <w:sz w:val="26"/>
-                <w:szCs w:val="26"/>
-                <w:lang w:val="es-MX"/>
-              </w:rPr>
-            </w:pPr>
-            <w:r>
-              <w:rPr>
-                <w:rFonts w:ascii="Trebuchet MS" w:hAnsi="Trebuchet MS"/>
-                <w:sz w:val="26"/>
-                <w:szCs w:val="26"/>
-                <w:lang w:val="es-MX"/>
-              </w:rPr>
-              <w:t>{intensidad_horaria</w:t>
-            </w:r>
-            <w:r>
-              <w:rPr>
-                <w:rFonts w:ascii="Trebuchet MS" w:hAnsi="Trebuchet MS"/>
-                <w:sz w:val="26"/>
-                <w:szCs w:val="26"/>
-                <w:lang w:val="es-MX"/>
-              </w:rPr>
-              <w:t>6</w:t>
-            </w:r>
-            <w:r>
-              <w:rPr>
-                <w:rFonts w:ascii="Trebuchet MS" w:hAnsi="Trebuchet MS"/>
-                <w:sz w:val="26"/>
-                <w:szCs w:val="26"/>
-                <w:lang w:val="es-MX"/>
-              </w:rPr>
-              <w:t>}</w:t>
-            </w:r>
-          </w:p>
-        </w:tc>
-        <w:tc>
-          <w:tcPr>
-            <w:tcW w:w="887" w:type="dxa"/>
-            <w:vAlign w:val="center"/>
-          </w:tcPr>
-          <w:p>
-            <w:pPr>
-              <w:jc w:val="center"/>
-              <w:rPr>
-                <w:rFonts w:ascii="Trebuchet MS" w:hAnsi="Trebuchet MS"/>
-                <w:sz w:val="26"/>
-                <w:szCs w:val="26"/>
-                <w:lang w:val="es-MX"/>
-              </w:rPr>
-            </w:pPr>
-            <w:r>
-              <w:rPr>
-                <w:rFonts w:ascii="Trebuchet MS" w:hAnsi="Trebuchet MS"/>
-                <w:sz w:val="26"/>
-                <w:szCs w:val="26"/>
-                <w:lang w:val="es-MX"/>
-              </w:rPr>
-              <w:t>{añoTaller</w:t>
-            </w:r>
-            <w:r>
-              <w:rPr>
-                <w:rFonts w:ascii="Trebuchet MS" w:hAnsi="Trebuchet MS"/>
-                <w:sz w:val="26"/>
-                <w:szCs w:val="26"/>
-                <w:lang w:val="es-MX"/>
-              </w:rPr>
-              <w:t>6</w:t>
-            </w:r>
-            <w:r>
-              <w:rPr>
-                <w:rFonts w:ascii="Trebuchet MS" w:hAnsi="Trebuchet MS"/>
-                <w:sz w:val="26"/>
-                <w:szCs w:val="26"/>
-                <w:lang w:val="es-MX"/>
-              </w:rPr>
-              <w:t>}</w:t>
+              <w:t>{añoTaller6}</w:t>
             </w:r>
           </w:p>
         </w:tc>
@@ -9070,31 +8184,39 @@
                 <w:szCs w:val="26"/>
                 <w:lang w:val="en-US"/>
               </w:rPr>
-              <w:t>{academia_</w:t>
-            </w:r>
-            <w:r>
+              <w:t>{academia_7}</w:t>
+            </w:r>
+          </w:p>
+        </w:tc>
+        <w:tc>
+          <w:tcPr>
+            <w:tcW w:w="3260" w:type="dxa"/>
+            <w:vAlign w:val="center"/>
+          </w:tcPr>
+          <w:p>
+            <w:pPr>
+              <w:jc w:val="center"/>
               <w:rPr>
                 <w:rFonts w:ascii="Trebuchet MS" w:hAnsi="Trebuchet MS"/>
                 <w:sz w:val="26"/>
                 <w:szCs w:val="26"/>
-                <w:lang w:val="en-US"/>
-              </w:rPr>
-              <w:t>7</w:t>
-            </w:r>
+                <w:lang w:val="es-MX"/>
+              </w:rPr>
+            </w:pPr>
             <w:r>
               <w:rPr>
                 <w:rFonts w:ascii="Trebuchet MS" w:hAnsi="Trebuchet MS"/>
                 <w:sz w:val="26"/>
                 <w:szCs w:val="26"/>
-                <w:lang w:val="en-US"/>
-              </w:rPr>
-              <w:t>}</w:t>
-            </w:r>
-          </w:p>
-        </w:tc>
-        <w:tc>
-          <w:tcPr>
-            <w:tcW w:w="3260" w:type="dxa"/>
+                <w:lang w:val="es-MX"/>
+              </w:rPr>
+              <w:t>{titulo_obtenido7}</w:t>
+            </w:r>
+          </w:p>
+        </w:tc>
+        <w:tc>
+          <w:tcPr>
+            <w:tcW w:w="2940" w:type="dxa"/>
             <w:vAlign w:val="center"/>
           </w:tcPr>
           <w:p>
@@ -9114,17 +8236,25 @@
                 <w:szCs w:val="26"/>
                 <w:lang w:val="es-MX"/>
               </w:rPr>
-              <w:t>{titulo_obtenido</w:t>
-            </w:r>
-            <w:r>
+              <w:t>{intensidad_horaria7}</w:t>
+            </w:r>
+          </w:p>
+        </w:tc>
+        <w:tc>
+          <w:tcPr>
+            <w:tcW w:w="887" w:type="dxa"/>
+            <w:vAlign w:val="center"/>
+          </w:tcPr>
+          <w:p>
+            <w:pPr>
+              <w:jc w:val="center"/>
               <w:rPr>
                 <w:rFonts w:ascii="Trebuchet MS" w:hAnsi="Trebuchet MS"/>
                 <w:sz w:val="26"/>
                 <w:szCs w:val="26"/>
                 <w:lang w:val="es-MX"/>
               </w:rPr>
-              <w:t>7</w:t>
-            </w:r>
+            </w:pPr>
             <w:r>
               <w:rPr>
                 <w:rFonts w:ascii="Trebuchet MS" w:hAnsi="Trebuchet MS"/>
@@ -9132,95 +8262,7 @@
                 <w:szCs w:val="26"/>
                 <w:lang w:val="es-MX"/>
               </w:rPr>
-              <w:t>}</w:t>
-            </w:r>
-          </w:p>
-        </w:tc>
-        <w:tc>
-          <w:tcPr>
-            <w:tcW w:w="2940" w:type="dxa"/>
-            <w:vAlign w:val="center"/>
-          </w:tcPr>
-          <w:p>
-            <w:pPr>
-              <w:jc w:val="center"/>
-              <w:rPr>
-                <w:rFonts w:ascii="Trebuchet MS" w:hAnsi="Trebuchet MS"/>
-                <w:sz w:val="26"/>
-                <w:szCs w:val="26"/>
-                <w:lang w:val="es-MX"/>
-              </w:rPr>
-            </w:pPr>
-            <w:r>
-              <w:rPr>
-                <w:rFonts w:ascii="Trebuchet MS" w:hAnsi="Trebuchet MS"/>
-                <w:sz w:val="26"/>
-                <w:szCs w:val="26"/>
-                <w:lang w:val="es-MX"/>
-              </w:rPr>
-              <w:t>{intensidad_horaria</w:t>
-            </w:r>
-            <w:r>
-              <w:rPr>
-                <w:rFonts w:ascii="Trebuchet MS" w:hAnsi="Trebuchet MS"/>
-                <w:sz w:val="26"/>
-                <w:szCs w:val="26"/>
-                <w:lang w:val="es-MX"/>
-              </w:rPr>
-              <w:t>7</w:t>
-            </w:r>
-            <w:r>
-              <w:rPr>
-                <w:rFonts w:ascii="Trebuchet MS" w:hAnsi="Trebuchet MS"/>
-                <w:sz w:val="26"/>
-                <w:szCs w:val="26"/>
-                <w:lang w:val="es-MX"/>
-              </w:rPr>
-              <w:t>}</w:t>
-            </w:r>
-          </w:p>
-        </w:tc>
-        <w:tc>
-          <w:tcPr>
-            <w:tcW w:w="887" w:type="dxa"/>
-            <w:vAlign w:val="center"/>
-          </w:tcPr>
-          <w:p>
-            <w:pPr>
-              <w:jc w:val="center"/>
-              <w:rPr>
-                <w:rFonts w:ascii="Trebuchet MS" w:hAnsi="Trebuchet MS"/>
-                <w:sz w:val="26"/>
-                <w:szCs w:val="26"/>
-                <w:lang w:val="es-MX"/>
-              </w:rPr>
-            </w:pPr>
-            <w:r>
-              <w:rPr>
-                <w:rFonts w:ascii="Trebuchet MS" w:hAnsi="Trebuchet MS"/>
-                <w:sz w:val="26"/>
-                <w:szCs w:val="26"/>
-                <w:lang w:val="es-MX"/>
-              </w:rPr>
-              <w:t>{añoTaller</w:t>
-            </w:r>
-            <w:r>
-              <w:rPr>
-                <w:rFonts w:ascii="Trebuchet MS" w:hAnsi="Trebuchet MS"/>
-                <w:sz w:val="26"/>
-                <w:szCs w:val="26"/>
-                <w:lang w:val="es-MX"/>
-              </w:rPr>
-              <w:t>7</w:t>
-            </w:r>
-            <w:r>
-              <w:rPr>
-                <w:rFonts w:ascii="Trebuchet MS" w:hAnsi="Trebuchet MS"/>
-                <w:sz w:val="26"/>
-                <w:szCs w:val="26"/>
-                <w:lang w:val="es-MX"/>
-              </w:rPr>
-              <w:t>}</w:t>
+              <w:t>{añoTaller7}</w:t>
             </w:r>
           </w:p>
         </w:tc>
@@ -9251,31 +8293,39 @@
                 <w:szCs w:val="26"/>
                 <w:lang w:val="en-US"/>
               </w:rPr>
-              <w:t>{academia_</w:t>
-            </w:r>
-            <w:r>
+              <w:t>{academia_8}</w:t>
+            </w:r>
+          </w:p>
+        </w:tc>
+        <w:tc>
+          <w:tcPr>
+            <w:tcW w:w="3260" w:type="dxa"/>
+            <w:vAlign w:val="center"/>
+          </w:tcPr>
+          <w:p>
+            <w:pPr>
+              <w:jc w:val="center"/>
               <w:rPr>
                 <w:rFonts w:ascii="Trebuchet MS" w:hAnsi="Trebuchet MS"/>
                 <w:sz w:val="26"/>
                 <w:szCs w:val="26"/>
-                <w:lang w:val="en-US"/>
-              </w:rPr>
-              <w:t>8</w:t>
-            </w:r>
+                <w:lang w:val="es-MX"/>
+              </w:rPr>
+            </w:pPr>
             <w:r>
               <w:rPr>
                 <w:rFonts w:ascii="Trebuchet MS" w:hAnsi="Trebuchet MS"/>
                 <w:sz w:val="26"/>
                 <w:szCs w:val="26"/>
-                <w:lang w:val="en-US"/>
-              </w:rPr>
-              <w:t>}</w:t>
-            </w:r>
-          </w:p>
-        </w:tc>
-        <w:tc>
-          <w:tcPr>
-            <w:tcW w:w="3260" w:type="dxa"/>
+                <w:lang w:val="es-MX"/>
+              </w:rPr>
+              <w:t>{titulo_obtenido8}</w:t>
+            </w:r>
+          </w:p>
+        </w:tc>
+        <w:tc>
+          <w:tcPr>
+            <w:tcW w:w="2940" w:type="dxa"/>
             <w:vAlign w:val="center"/>
           </w:tcPr>
           <w:p>
@@ -9295,17 +8345,25 @@
                 <w:szCs w:val="26"/>
                 <w:lang w:val="es-MX"/>
               </w:rPr>
-              <w:t>{titulo_obtenido</w:t>
-            </w:r>
-            <w:r>
+              <w:t>{intensidad_horaria8}</w:t>
+            </w:r>
+          </w:p>
+        </w:tc>
+        <w:tc>
+          <w:tcPr>
+            <w:tcW w:w="887" w:type="dxa"/>
+            <w:vAlign w:val="center"/>
+          </w:tcPr>
+          <w:p>
+            <w:pPr>
+              <w:jc w:val="center"/>
               <w:rPr>
                 <w:rFonts w:ascii="Trebuchet MS" w:hAnsi="Trebuchet MS"/>
                 <w:sz w:val="26"/>
                 <w:szCs w:val="26"/>
                 <w:lang w:val="es-MX"/>
               </w:rPr>
-              <w:t>8</w:t>
-            </w:r>
+            </w:pPr>
             <w:r>
               <w:rPr>
                 <w:rFonts w:ascii="Trebuchet MS" w:hAnsi="Trebuchet MS"/>
@@ -9313,95 +8371,7 @@
                 <w:szCs w:val="26"/>
                 <w:lang w:val="es-MX"/>
               </w:rPr>
-              <w:t>}</w:t>
-            </w:r>
-          </w:p>
-        </w:tc>
-        <w:tc>
-          <w:tcPr>
-            <w:tcW w:w="2940" w:type="dxa"/>
-            <w:vAlign w:val="center"/>
-          </w:tcPr>
-          <w:p>
-            <w:pPr>
-              <w:jc w:val="center"/>
-              <w:rPr>
-                <w:rFonts w:ascii="Trebuchet MS" w:hAnsi="Trebuchet MS"/>
-                <w:sz w:val="26"/>
-                <w:szCs w:val="26"/>
-                <w:lang w:val="es-MX"/>
-              </w:rPr>
-            </w:pPr>
-            <w:r>
-              <w:rPr>
-                <w:rFonts w:ascii="Trebuchet MS" w:hAnsi="Trebuchet MS"/>
-                <w:sz w:val="26"/>
-                <w:szCs w:val="26"/>
-                <w:lang w:val="es-MX"/>
-              </w:rPr>
-              <w:t>{intensidad_horaria</w:t>
-            </w:r>
-            <w:r>
-              <w:rPr>
-                <w:rFonts w:ascii="Trebuchet MS" w:hAnsi="Trebuchet MS"/>
-                <w:sz w:val="26"/>
-                <w:szCs w:val="26"/>
-                <w:lang w:val="es-MX"/>
-              </w:rPr>
-              <w:t>8</w:t>
-            </w:r>
-            <w:r>
-              <w:rPr>
-                <w:rFonts w:ascii="Trebuchet MS" w:hAnsi="Trebuchet MS"/>
-                <w:sz w:val="26"/>
-                <w:szCs w:val="26"/>
-                <w:lang w:val="es-MX"/>
-              </w:rPr>
-              <w:t>}</w:t>
-            </w:r>
-          </w:p>
-        </w:tc>
-        <w:tc>
-          <w:tcPr>
-            <w:tcW w:w="887" w:type="dxa"/>
-            <w:vAlign w:val="center"/>
-          </w:tcPr>
-          <w:p>
-            <w:pPr>
-              <w:jc w:val="center"/>
-              <w:rPr>
-                <w:rFonts w:ascii="Trebuchet MS" w:hAnsi="Trebuchet MS"/>
-                <w:sz w:val="26"/>
-                <w:szCs w:val="26"/>
-                <w:lang w:val="es-MX"/>
-              </w:rPr>
-            </w:pPr>
-            <w:r>
-              <w:rPr>
-                <w:rFonts w:ascii="Trebuchet MS" w:hAnsi="Trebuchet MS"/>
-                <w:sz w:val="26"/>
-                <w:szCs w:val="26"/>
-                <w:lang w:val="es-MX"/>
-              </w:rPr>
-              <w:t>{añoTaller</w:t>
-            </w:r>
-            <w:r>
-              <w:rPr>
-                <w:rFonts w:ascii="Trebuchet MS" w:hAnsi="Trebuchet MS"/>
-                <w:sz w:val="26"/>
-                <w:szCs w:val="26"/>
-                <w:lang w:val="es-MX"/>
-              </w:rPr>
-              <w:t>8</w:t>
-            </w:r>
-            <w:r>
-              <w:rPr>
-                <w:rFonts w:ascii="Trebuchet MS" w:hAnsi="Trebuchet MS"/>
-                <w:sz w:val="26"/>
-                <w:szCs w:val="26"/>
-                <w:lang w:val="es-MX"/>
-              </w:rPr>
-              <w:t>}</w:t>
+              <w:t>{añoTaller8}</w:t>
             </w:r>
           </w:p>
         </w:tc>
@@ -9775,23 +8745,7 @@
                 <w:szCs w:val="26"/>
                 <w:lang w:val="es-CO"/>
               </w:rPr>
-              <w:t>{idioma_</w:t>
-            </w:r>
-            <w:r>
-              <w:rPr>
-                <w:rFonts w:asciiTheme="majorHAnsi" w:eastAsia="Batang" w:hAnsiTheme="majorHAnsi" w:cs="Arabic Typesetting"/>
-                <w:szCs w:val="26"/>
-                <w:lang w:val="es-CO"/>
-              </w:rPr>
-              <w:t>2</w:t>
-            </w:r>
-            <w:r>
-              <w:rPr>
-                <w:rFonts w:asciiTheme="majorHAnsi" w:eastAsia="Batang" w:hAnsiTheme="majorHAnsi" w:cs="Arabic Typesetting"/>
-                <w:szCs w:val="26"/>
-                <w:lang w:val="es-CO"/>
-              </w:rPr>
-              <w:t>}</w:t>
+              <w:t>{idioma_2}</w:t>
             </w:r>
           </w:p>
         </w:tc>
@@ -9817,23 +8771,7 @@
                 <w:szCs w:val="26"/>
                 <w:lang w:val="es-CO"/>
               </w:rPr>
-              <w:t>{habla_</w:t>
-            </w:r>
-            <w:r>
-              <w:rPr>
-                <w:rFonts w:asciiTheme="majorHAnsi" w:eastAsia="Batang" w:hAnsiTheme="majorHAnsi" w:cs="Arabic Typesetting"/>
-                <w:szCs w:val="26"/>
-                <w:lang w:val="es-CO"/>
-              </w:rPr>
-              <w:t>2</w:t>
-            </w:r>
-            <w:r>
-              <w:rPr>
-                <w:rFonts w:asciiTheme="majorHAnsi" w:eastAsia="Batang" w:hAnsiTheme="majorHAnsi" w:cs="Arabic Typesetting"/>
-                <w:szCs w:val="26"/>
-                <w:lang w:val="es-CO"/>
-              </w:rPr>
-              <w:t>}</w:t>
+              <w:t>{habla_2}</w:t>
             </w:r>
           </w:p>
         </w:tc>
@@ -9859,23 +8797,7 @@
                 <w:szCs w:val="26"/>
                 <w:lang w:val="es-CO"/>
               </w:rPr>
-              <w:t>{lee_</w:t>
-            </w:r>
-            <w:r>
-              <w:rPr>
-                <w:rFonts w:asciiTheme="majorHAnsi" w:eastAsia="Batang" w:hAnsiTheme="majorHAnsi" w:cs="Arabic Typesetting"/>
-                <w:szCs w:val="26"/>
-                <w:lang w:val="es-CO"/>
-              </w:rPr>
-              <w:t>2</w:t>
-            </w:r>
-            <w:r>
-              <w:rPr>
-                <w:rFonts w:asciiTheme="majorHAnsi" w:eastAsia="Batang" w:hAnsiTheme="majorHAnsi" w:cs="Arabic Typesetting"/>
-                <w:szCs w:val="26"/>
-                <w:lang w:val="es-CO"/>
-              </w:rPr>
-              <w:t>}</w:t>
+              <w:t>{lee_2}</w:t>
             </w:r>
           </w:p>
         </w:tc>
@@ -9900,23 +8822,7 @@
                 <w:szCs w:val="26"/>
                 <w:lang w:val="es-CO"/>
               </w:rPr>
-              <w:t>{escribe_</w:t>
-            </w:r>
-            <w:r>
-              <w:rPr>
-                <w:rFonts w:asciiTheme="majorHAnsi" w:eastAsia="Batang" w:hAnsiTheme="majorHAnsi" w:cs="Arabic Typesetting"/>
-                <w:szCs w:val="26"/>
-                <w:lang w:val="es-CO"/>
-              </w:rPr>
-              <w:t>2</w:t>
-            </w:r>
-            <w:r>
-              <w:rPr>
-                <w:rFonts w:asciiTheme="majorHAnsi" w:eastAsia="Batang" w:hAnsiTheme="majorHAnsi" w:cs="Arabic Typesetting"/>
-                <w:szCs w:val="26"/>
-                <w:lang w:val="es-CO"/>
-              </w:rPr>
-              <w:t>}</w:t>
+              <w:t>{escribe_2}</w:t>
             </w:r>
           </w:p>
         </w:tc>
@@ -9943,23 +8849,7 @@
                 <w:szCs w:val="26"/>
                 <w:lang w:val="es-CO"/>
               </w:rPr>
-              <w:t>{idioma_</w:t>
-            </w:r>
-            <w:r>
-              <w:rPr>
-                <w:rFonts w:asciiTheme="majorHAnsi" w:eastAsia="Batang" w:hAnsiTheme="majorHAnsi" w:cs="Arabic Typesetting"/>
-                <w:szCs w:val="26"/>
-                <w:lang w:val="es-CO"/>
-              </w:rPr>
-              <w:t>3</w:t>
-            </w:r>
-            <w:r>
-              <w:rPr>
-                <w:rFonts w:asciiTheme="majorHAnsi" w:eastAsia="Batang" w:hAnsiTheme="majorHAnsi" w:cs="Arabic Typesetting"/>
-                <w:szCs w:val="26"/>
-                <w:lang w:val="es-CO"/>
-              </w:rPr>
-              <w:t>}</w:t>
+              <w:t>{idioma_3}</w:t>
             </w:r>
           </w:p>
         </w:tc>
@@ -9985,23 +8875,7 @@
                 <w:szCs w:val="26"/>
                 <w:lang w:val="es-CO"/>
               </w:rPr>
-              <w:t>{habla_</w:t>
-            </w:r>
-            <w:r>
-              <w:rPr>
-                <w:rFonts w:asciiTheme="majorHAnsi" w:eastAsia="Batang" w:hAnsiTheme="majorHAnsi" w:cs="Arabic Typesetting"/>
-                <w:szCs w:val="26"/>
-                <w:lang w:val="es-CO"/>
-              </w:rPr>
-              <w:t>3</w:t>
-            </w:r>
-            <w:r>
-              <w:rPr>
-                <w:rFonts w:asciiTheme="majorHAnsi" w:eastAsia="Batang" w:hAnsiTheme="majorHAnsi" w:cs="Arabic Typesetting"/>
-                <w:szCs w:val="26"/>
-                <w:lang w:val="es-CO"/>
-              </w:rPr>
-              <w:t>}</w:t>
+              <w:t>{habla_3}</w:t>
             </w:r>
           </w:p>
         </w:tc>
@@ -10027,23 +8901,7 @@
                 <w:szCs w:val="26"/>
                 <w:lang w:val="es-CO"/>
               </w:rPr>
-              <w:t>{lee_</w:t>
-            </w:r>
-            <w:r>
-              <w:rPr>
-                <w:rFonts w:asciiTheme="majorHAnsi" w:eastAsia="Batang" w:hAnsiTheme="majorHAnsi" w:cs="Arabic Typesetting"/>
-                <w:szCs w:val="26"/>
-                <w:lang w:val="es-CO"/>
-              </w:rPr>
-              <w:t>3</w:t>
-            </w:r>
-            <w:r>
-              <w:rPr>
-                <w:rFonts w:asciiTheme="majorHAnsi" w:eastAsia="Batang" w:hAnsiTheme="majorHAnsi" w:cs="Arabic Typesetting"/>
-                <w:szCs w:val="26"/>
-                <w:lang w:val="es-CO"/>
-              </w:rPr>
-              <w:t>}</w:t>
+              <w:t>{lee_3}</w:t>
             </w:r>
           </w:p>
         </w:tc>
@@ -10068,23 +8926,7 @@
                 <w:szCs w:val="26"/>
                 <w:lang w:val="es-CO"/>
               </w:rPr>
-              <w:t>{escribe_</w:t>
-            </w:r>
-            <w:r>
-              <w:rPr>
-                <w:rFonts w:asciiTheme="majorHAnsi" w:eastAsia="Batang" w:hAnsiTheme="majorHAnsi" w:cs="Arabic Typesetting"/>
-                <w:szCs w:val="26"/>
-                <w:lang w:val="es-CO"/>
-              </w:rPr>
-              <w:t>3</w:t>
-            </w:r>
-            <w:r>
-              <w:rPr>
-                <w:rFonts w:asciiTheme="majorHAnsi" w:eastAsia="Batang" w:hAnsiTheme="majorHAnsi" w:cs="Arabic Typesetting"/>
-                <w:szCs w:val="26"/>
-                <w:lang w:val="es-CO"/>
-              </w:rPr>
-              <w:t>}</w:t>
+              <w:t>{escribe_3}</w:t>
             </w:r>
           </w:p>
         </w:tc>
@@ -10407,25 +9249,7 @@
                 <w:sz w:val="28"/>
                 <w:szCs w:val="26"/>
               </w:rPr>
-              <w:t>{</w:t>
-            </w:r>
-            <w:r>
-              <w:rPr>
-                <w:rFonts w:ascii="Trebuchet MS" w:hAnsi="Trebuchet MS" w:cs="Arial"/>
-                <w:noProof/>
-                <w:sz w:val="28"/>
-                <w:szCs w:val="26"/>
-              </w:rPr>
-              <w:t>parentezco</w:t>
-            </w:r>
-            <w:r>
-              <w:rPr>
-                <w:rFonts w:ascii="Trebuchet MS" w:hAnsi="Trebuchet MS" w:cs="Arial"/>
-                <w:noProof/>
-                <w:sz w:val="28"/>
-                <w:szCs w:val="26"/>
-              </w:rPr>
-              <w:t>_1}</w:t>
+              <w:t>{parentezco_1}</w:t>
             </w:r>
           </w:p>
         </w:tc>
@@ -10511,25 +9335,7 @@
                 <w:sz w:val="28"/>
                 <w:szCs w:val="26"/>
               </w:rPr>
-              <w:t>{nombre_familia_</w:t>
-            </w:r>
-            <w:r>
-              <w:rPr>
-                <w:rFonts w:ascii="Trebuchet MS" w:hAnsi="Trebuchet MS" w:cs="Arial"/>
-                <w:noProof/>
-                <w:sz w:val="28"/>
-                <w:szCs w:val="26"/>
-              </w:rPr>
-              <w:t>2</w:t>
-            </w:r>
-            <w:r>
-              <w:rPr>
-                <w:rFonts w:ascii="Trebuchet MS" w:hAnsi="Trebuchet MS" w:cs="Arial"/>
-                <w:noProof/>
-                <w:sz w:val="28"/>
-                <w:szCs w:val="26"/>
-              </w:rPr>
-              <w:t>}</w:t>
+              <w:t>{nombre_familia_2}</w:t>
             </w:r>
           </w:p>
         </w:tc>
@@ -10558,25 +9364,7 @@
                 <w:sz w:val="28"/>
                 <w:szCs w:val="26"/>
               </w:rPr>
-              <w:t>{parentezco_</w:t>
-            </w:r>
-            <w:r>
-              <w:rPr>
-                <w:rFonts w:ascii="Trebuchet MS" w:hAnsi="Trebuchet MS" w:cs="Arial"/>
-                <w:noProof/>
-                <w:sz w:val="28"/>
-                <w:szCs w:val="26"/>
-              </w:rPr>
-              <w:t>2</w:t>
-            </w:r>
-            <w:r>
-              <w:rPr>
-                <w:rFonts w:ascii="Trebuchet MS" w:hAnsi="Trebuchet MS" w:cs="Arial"/>
-                <w:noProof/>
-                <w:sz w:val="28"/>
-                <w:szCs w:val="26"/>
-              </w:rPr>
-              <w:t>}</w:t>
+              <w:t>{parentezco_2}</w:t>
             </w:r>
           </w:p>
         </w:tc>
@@ -10604,25 +9392,7 @@
                 <w:sz w:val="28"/>
                 <w:szCs w:val="26"/>
               </w:rPr>
-              <w:t>{profesion_</w:t>
-            </w:r>
-            <w:r>
-              <w:rPr>
-                <w:rFonts w:ascii="Trebuchet MS" w:hAnsi="Trebuchet MS" w:cs="Arial"/>
-                <w:noProof/>
-                <w:sz w:val="28"/>
-                <w:szCs w:val="26"/>
-              </w:rPr>
-              <w:t>2</w:t>
-            </w:r>
-            <w:r>
-              <w:rPr>
-                <w:rFonts w:ascii="Trebuchet MS" w:hAnsi="Trebuchet MS" w:cs="Arial"/>
-                <w:noProof/>
-                <w:sz w:val="28"/>
-                <w:szCs w:val="26"/>
-              </w:rPr>
-              <w:t>}</w:t>
+              <w:t>{profesion_2}</w:t>
             </w:r>
           </w:p>
         </w:tc>
@@ -10650,25 +9420,7 @@
                 <w:sz w:val="28"/>
                 <w:szCs w:val="26"/>
               </w:rPr>
-              <w:t>{telefonofam_</w:t>
-            </w:r>
-            <w:r>
-              <w:rPr>
-                <w:rFonts w:ascii="Trebuchet MS" w:hAnsi="Trebuchet MS" w:cs="Arial"/>
-                <w:noProof/>
-                <w:sz w:val="28"/>
-                <w:szCs w:val="26"/>
-              </w:rPr>
-              <w:t>2</w:t>
-            </w:r>
-            <w:r>
-              <w:rPr>
-                <w:rFonts w:ascii="Trebuchet MS" w:hAnsi="Trebuchet MS" w:cs="Arial"/>
-                <w:noProof/>
-                <w:sz w:val="28"/>
-                <w:szCs w:val="26"/>
-              </w:rPr>
-              <w:t>}</w:t>
+              <w:t>{telefonofam_2}</w:t>
             </w:r>
           </w:p>
         </w:tc>
@@ -10698,25 +9450,7 @@
                 <w:sz w:val="28"/>
                 <w:szCs w:val="26"/>
               </w:rPr>
-              <w:t>{nombre_familia_</w:t>
-            </w:r>
-            <w:r>
-              <w:rPr>
-                <w:rFonts w:ascii="Trebuchet MS" w:hAnsi="Trebuchet MS" w:cs="Arial"/>
-                <w:noProof/>
-                <w:sz w:val="28"/>
-                <w:szCs w:val="26"/>
-              </w:rPr>
-              <w:t>3</w:t>
-            </w:r>
-            <w:r>
-              <w:rPr>
-                <w:rFonts w:ascii="Trebuchet MS" w:hAnsi="Trebuchet MS" w:cs="Arial"/>
-                <w:noProof/>
-                <w:sz w:val="28"/>
-                <w:szCs w:val="26"/>
-              </w:rPr>
-              <w:t>}</w:t>
+              <w:t>{nombre_familia_3}</w:t>
             </w:r>
           </w:p>
         </w:tc>
@@ -10744,25 +9478,7 @@
                 <w:sz w:val="28"/>
                 <w:szCs w:val="26"/>
               </w:rPr>
-              <w:t>{parentezco_</w:t>
-            </w:r>
-            <w:r>
-              <w:rPr>
-                <w:rFonts w:ascii="Trebuchet MS" w:hAnsi="Trebuchet MS" w:cs="Arial"/>
-                <w:noProof/>
-                <w:sz w:val="28"/>
-                <w:szCs w:val="26"/>
-              </w:rPr>
-              <w:t>3</w:t>
-            </w:r>
-            <w:r>
-              <w:rPr>
-                <w:rFonts w:ascii="Trebuchet MS" w:hAnsi="Trebuchet MS" w:cs="Arial"/>
-                <w:noProof/>
-                <w:sz w:val="28"/>
-                <w:szCs w:val="26"/>
-              </w:rPr>
-              <w:t>}</w:t>
+              <w:t>{parentezco_3}</w:t>
             </w:r>
           </w:p>
         </w:tc>
@@ -10790,25 +9506,7 @@
                 <w:sz w:val="28"/>
                 <w:szCs w:val="26"/>
               </w:rPr>
-              <w:t>{profesion_</w:t>
-            </w:r>
-            <w:r>
-              <w:rPr>
-                <w:rFonts w:ascii="Trebuchet MS" w:hAnsi="Trebuchet MS" w:cs="Arial"/>
-                <w:noProof/>
-                <w:sz w:val="28"/>
-                <w:szCs w:val="26"/>
-              </w:rPr>
-              <w:t>3</w:t>
-            </w:r>
-            <w:r>
-              <w:rPr>
-                <w:rFonts w:ascii="Trebuchet MS" w:hAnsi="Trebuchet MS" w:cs="Arial"/>
-                <w:noProof/>
-                <w:sz w:val="28"/>
-                <w:szCs w:val="26"/>
-              </w:rPr>
-              <w:t>}</w:t>
+              <w:t>{profesion_3}</w:t>
             </w:r>
           </w:p>
         </w:tc>
@@ -10836,25 +9534,7 @@
                 <w:sz w:val="28"/>
                 <w:szCs w:val="26"/>
               </w:rPr>
-              <w:t>{telefonofam_</w:t>
-            </w:r>
-            <w:r>
-              <w:rPr>
-                <w:rFonts w:ascii="Trebuchet MS" w:hAnsi="Trebuchet MS" w:cs="Arial"/>
-                <w:noProof/>
-                <w:sz w:val="28"/>
-                <w:szCs w:val="26"/>
-              </w:rPr>
-              <w:t>3</w:t>
-            </w:r>
-            <w:r>
-              <w:rPr>
-                <w:rFonts w:ascii="Trebuchet MS" w:hAnsi="Trebuchet MS" w:cs="Arial"/>
-                <w:noProof/>
-                <w:sz w:val="28"/>
-                <w:szCs w:val="26"/>
-              </w:rPr>
-              <w:t>}</w:t>
+              <w:t>{telefonofam_3}</w:t>
             </w:r>
           </w:p>
         </w:tc>
@@ -11016,25 +9696,7 @@
                 <w:sz w:val="28"/>
                 <w:szCs w:val="26"/>
               </w:rPr>
-              <w:t>{nombre_</w:t>
-            </w:r>
-            <w:r>
-              <w:rPr>
-                <w:rFonts w:ascii="Trebuchet MS" w:hAnsi="Trebuchet MS" w:cs="Arial"/>
-                <w:noProof/>
-                <w:sz w:val="28"/>
-                <w:szCs w:val="26"/>
-              </w:rPr>
-              <w:t>personales</w:t>
-            </w:r>
-            <w:r>
-              <w:rPr>
-                <w:rFonts w:ascii="Trebuchet MS" w:hAnsi="Trebuchet MS" w:cs="Arial"/>
-                <w:noProof/>
-                <w:sz w:val="28"/>
-                <w:szCs w:val="26"/>
-              </w:rPr>
-              <w:t>_1}</w:t>
+              <w:t>{nombre_personales_1}</w:t>
             </w:r>
           </w:p>
         </w:tc>
@@ -11062,25 +9724,7 @@
                 <w:sz w:val="28"/>
                 <w:szCs w:val="26"/>
               </w:rPr>
-              <w:t>{profesion</w:t>
-            </w:r>
-            <w:r>
-              <w:rPr>
-                <w:rFonts w:ascii="Trebuchet MS" w:hAnsi="Trebuchet MS" w:cs="Arial"/>
-                <w:noProof/>
-                <w:sz w:val="28"/>
-                <w:szCs w:val="26"/>
-              </w:rPr>
-              <w:t>_personal</w:t>
-            </w:r>
-            <w:r>
-              <w:rPr>
-                <w:rFonts w:ascii="Trebuchet MS" w:hAnsi="Trebuchet MS" w:cs="Arial"/>
-                <w:noProof/>
-                <w:sz w:val="28"/>
-                <w:szCs w:val="26"/>
-              </w:rPr>
-              <w:t>_1}</w:t>
+              <w:t>{profesion_personal_1}</w:t>
             </w:r>
           </w:p>
         </w:tc>
@@ -11108,25 +9752,7 @@
                 <w:sz w:val="28"/>
                 <w:szCs w:val="26"/>
               </w:rPr>
-              <w:t>{telefono</w:t>
-            </w:r>
-            <w:r>
-              <w:rPr>
-                <w:rFonts w:ascii="Trebuchet MS" w:hAnsi="Trebuchet MS" w:cs="Arial"/>
-                <w:noProof/>
-                <w:sz w:val="28"/>
-                <w:szCs w:val="26"/>
-              </w:rPr>
-              <w:t>pers</w:t>
-            </w:r>
-            <w:r>
-              <w:rPr>
-                <w:rFonts w:ascii="Trebuchet MS" w:hAnsi="Trebuchet MS" w:cs="Arial"/>
-                <w:noProof/>
-                <w:sz w:val="28"/>
-                <w:szCs w:val="26"/>
-              </w:rPr>
-              <w:t>_1}</w:t>
+              <w:t>{telefonopers_1}</w:t>
             </w:r>
           </w:p>
         </w:tc>
@@ -11156,25 +9782,7 @@
                 <w:sz w:val="28"/>
                 <w:szCs w:val="26"/>
               </w:rPr>
-              <w:t>{nombre_</w:t>
-            </w:r>
-            <w:r>
-              <w:rPr>
-                <w:rFonts w:ascii="Trebuchet MS" w:hAnsi="Trebuchet MS" w:cs="Arial"/>
-                <w:noProof/>
-                <w:sz w:val="28"/>
-                <w:szCs w:val="26"/>
-              </w:rPr>
-              <w:t>personales</w:t>
-            </w:r>
-            <w:r>
-              <w:rPr>
-                <w:rFonts w:ascii="Trebuchet MS" w:hAnsi="Trebuchet MS" w:cs="Arial"/>
-                <w:noProof/>
-                <w:sz w:val="28"/>
-                <w:szCs w:val="26"/>
-              </w:rPr>
-              <w:t>_2}</w:t>
+              <w:t>{nombre_personales_2}</w:t>
             </w:r>
           </w:p>
         </w:tc>
@@ -11202,25 +9810,7 @@
                 <w:sz w:val="28"/>
                 <w:szCs w:val="26"/>
               </w:rPr>
-              <w:t>{profesion_personal</w:t>
-            </w:r>
-            <w:r>
-              <w:rPr>
-                <w:rFonts w:ascii="Trebuchet MS" w:hAnsi="Trebuchet MS" w:cs="Arial"/>
-                <w:noProof/>
-                <w:sz w:val="28"/>
-                <w:szCs w:val="26"/>
-              </w:rPr>
-              <w:t xml:space="preserve"> </w:t>
-            </w:r>
-            <w:r>
-              <w:rPr>
-                <w:rFonts w:ascii="Trebuchet MS" w:hAnsi="Trebuchet MS" w:cs="Arial"/>
-                <w:noProof/>
-                <w:sz w:val="28"/>
-                <w:szCs w:val="26"/>
-              </w:rPr>
-              <w:t>_2}</w:t>
+              <w:t>{profesion_personal _2}</w:t>
             </w:r>
           </w:p>
         </w:tc>
@@ -11248,25 +9838,7 @@
                 <w:sz w:val="28"/>
                 <w:szCs w:val="26"/>
               </w:rPr>
-              <w:t>{telefonopers_</w:t>
-            </w:r>
-            <w:r>
-              <w:rPr>
-                <w:rFonts w:ascii="Trebuchet MS" w:hAnsi="Trebuchet MS" w:cs="Arial"/>
-                <w:noProof/>
-                <w:sz w:val="28"/>
-                <w:szCs w:val="26"/>
-              </w:rPr>
-              <w:t>2</w:t>
-            </w:r>
-            <w:r>
-              <w:rPr>
-                <w:rFonts w:ascii="Trebuchet MS" w:hAnsi="Trebuchet MS" w:cs="Arial"/>
-                <w:noProof/>
-                <w:sz w:val="28"/>
-                <w:szCs w:val="26"/>
-              </w:rPr>
-              <w:t>}</w:t>
+              <w:t>{telefonopers_2}</w:t>
             </w:r>
           </w:p>
         </w:tc>
@@ -11296,25 +9868,7 @@
                 <w:sz w:val="28"/>
                 <w:szCs w:val="26"/>
               </w:rPr>
-              <w:t>{nombre_</w:t>
-            </w:r>
-            <w:r>
-              <w:rPr>
-                <w:rFonts w:ascii="Trebuchet MS" w:hAnsi="Trebuchet MS" w:cs="Arial"/>
-                <w:noProof/>
-                <w:sz w:val="28"/>
-                <w:szCs w:val="26"/>
-              </w:rPr>
-              <w:t>personales</w:t>
-            </w:r>
-            <w:r>
-              <w:rPr>
-                <w:rFonts w:ascii="Trebuchet MS" w:hAnsi="Trebuchet MS" w:cs="Arial"/>
-                <w:noProof/>
-                <w:sz w:val="28"/>
-                <w:szCs w:val="26"/>
-              </w:rPr>
-              <w:t>_3}</w:t>
+              <w:t>{nombre_personales_3}</w:t>
             </w:r>
           </w:p>
         </w:tc>
@@ -11342,25 +9896,7 @@
                 <w:sz w:val="28"/>
                 <w:szCs w:val="26"/>
               </w:rPr>
-              <w:t>{profesion_personal</w:t>
-            </w:r>
-            <w:r>
-              <w:rPr>
-                <w:rFonts w:ascii="Trebuchet MS" w:hAnsi="Trebuchet MS" w:cs="Arial"/>
-                <w:noProof/>
-                <w:sz w:val="28"/>
-                <w:szCs w:val="26"/>
-              </w:rPr>
-              <w:t xml:space="preserve"> </w:t>
-            </w:r>
-            <w:r>
-              <w:rPr>
-                <w:rFonts w:ascii="Trebuchet MS" w:hAnsi="Trebuchet MS" w:cs="Arial"/>
-                <w:noProof/>
-                <w:sz w:val="28"/>
-                <w:szCs w:val="26"/>
-              </w:rPr>
-              <w:t>_3}</w:t>
+              <w:t>{profesion_personal _3}</w:t>
             </w:r>
           </w:p>
         </w:tc>
@@ -11388,25 +9924,7 @@
                 <w:sz w:val="28"/>
                 <w:szCs w:val="26"/>
               </w:rPr>
-              <w:t>{telefonopers_</w:t>
-            </w:r>
-            <w:r>
-              <w:rPr>
-                <w:rFonts w:ascii="Trebuchet MS" w:hAnsi="Trebuchet MS" w:cs="Arial"/>
-                <w:noProof/>
-                <w:sz w:val="28"/>
-                <w:szCs w:val="26"/>
-              </w:rPr>
-              <w:t>3</w:t>
-            </w:r>
-            <w:r>
-              <w:rPr>
-                <w:rFonts w:ascii="Trebuchet MS" w:hAnsi="Trebuchet MS" w:cs="Arial"/>
-                <w:noProof/>
-                <w:sz w:val="28"/>
-                <w:szCs w:val="26"/>
-              </w:rPr>
-              <w:t>}</w:t>
+              <w:t>{telefonopers_3}</w:t>
             </w:r>
           </w:p>
         </w:tc>
@@ -13370,6 +11888,12 @@
                               </w:rPr>
                               <w:t>{</w:t>
                             </w:r>
+                            <w:r>
+                              <w:rPr>
+                                <w:lang w:val="es-AR"/>
+                              </w:rPr>
+                              <w:t>%</w:t>
+                            </w:r>
                             <w:proofErr w:type="spellStart"/>
                             <w:r>
                               <w:rPr>
@@ -13421,6 +11945,12 @@
                           <w:lang w:val="es-AR"/>
                         </w:rPr>
                         <w:t>{</w:t>
+                      </w:r>
+                      <w:r>
+                        <w:rPr>
+                          <w:lang w:val="es-AR"/>
+                        </w:rPr>
+                        <w:t>%</w:t>
                       </w:r>
                       <w:proofErr w:type="spellStart"/>
                       <w:r>
@@ -14142,7 +12672,7 @@
                       <a:effectLst/>
                       <a:extLst>
                         <a:ext uri="{C572A759-6A51-4108-AA02-DFA0A04FC94B}">
-                          <ma14:wrappingTextBoxFlag xmlns:arto="http://schemas.microsoft.com/office/word/2006/arto" xmlns="" xmlns:mo="http://schemas.microsoft.com/office/mac/office/2008/main" xmlns:mv="urn:schemas-microsoft-com:mac:vml" xmlns:o="urn:schemas-microsoft-com:office:office" xmlns:v="urn:schemas-microsoft-com:vml" xmlns:w10="urn:schemas-microsoft-com:office:word" xmlns:w="http://schemas.openxmlformats.org/wordprocessingml/2006/main" xmlns:ma14="http://schemas.microsoft.com/office/mac/drawingml/2011/main"/>
+                          <ma14:wrappingTextBoxFlag xmlns:ma14="http://schemas.microsoft.com/office/mac/drawingml/2011/main" xmlns:w="http://schemas.openxmlformats.org/wordprocessingml/2006/main" xmlns:w10="urn:schemas-microsoft-com:office:word" xmlns:v="urn:schemas-microsoft-com:vml" xmlns:o="urn:schemas-microsoft-com:office:office" xmlns:mv="urn:schemas-microsoft-com:mac:vml" xmlns:mo="http://schemas.microsoft.com/office/mac/office/2008/main" xmlns="" xmlns:arto="http://schemas.microsoft.com/office/word/2006/arto"/>
                         </a:ext>
                       </a:extLst>
                     </wps:spPr>

</xml_diff>

<commit_message>
fix: corrección definitiva de campos undefined, documento_num e imágenes
</commit_message>
<xml_diff>
--- a/public/templates/hoja_de_vida_template.docx
+++ b/public/templates/hoja_de_vida_template.docx
@@ -3701,9 +3701,9 @@
         <w:gridCol w:w="2594"/>
         <w:gridCol w:w="662"/>
         <w:gridCol w:w="484"/>
-        <w:gridCol w:w="518"/>
+        <w:gridCol w:w="2130"/>
         <w:gridCol w:w="1182"/>
-        <w:gridCol w:w="567"/>
+        <w:gridCol w:w="2166"/>
       </w:tblGrid>
       <w:tr>
         <w:trPr>
@@ -3842,7 +3842,33 @@
                 <w:szCs w:val="26"/>
                 <w:lang w:val="es-CO"/>
               </w:rPr>
-              <w:t>{x}</w:t>
+              <w:t>{</w:t>
+            </w:r>
+            <w:proofErr w:type="spellStart"/>
+            <w:r>
+              <w:rPr>
+                <w:rFonts w:asciiTheme="majorHAnsi" w:hAnsiTheme="majorHAnsi" w:cs="Arial"/>
+                <w:szCs w:val="26"/>
+                <w:lang w:val="es-CO"/>
+              </w:rPr>
+              <w:t>empresa_p</w:t>
+            </w:r>
+            <w:r>
+              <w:rPr>
+                <w:rFonts w:asciiTheme="majorHAnsi" w:hAnsiTheme="majorHAnsi" w:cs="Arial"/>
+                <w:szCs w:val="26"/>
+                <w:lang w:val="es-CO"/>
+              </w:rPr>
+              <w:t>ublica</w:t>
+            </w:r>
+            <w:proofErr w:type="spellEnd"/>
+            <w:r>
+              <w:rPr>
+                <w:rFonts w:asciiTheme="majorHAnsi" w:hAnsiTheme="majorHAnsi" w:cs="Arial"/>
+                <w:szCs w:val="26"/>
+                <w:lang w:val="es-CO"/>
+              </w:rPr>
+              <w:t>}</w:t>
             </w:r>
           </w:p>
         </w:tc>
@@ -3886,9 +3912,29 @@
             </w:pPr>
             <w:r>
               <w:rPr>
-                <w:lang w:val="es-CO"/>
-              </w:rPr>
-              <w:t>{x}</w:t>
+                <w:rFonts w:asciiTheme="majorHAnsi" w:hAnsiTheme="majorHAnsi" w:cs="Arial"/>
+                <w:szCs w:val="26"/>
+                <w:lang w:val="es-CO"/>
+              </w:rPr>
+              <w:t>{</w:t>
+            </w:r>
+            <w:proofErr w:type="spellStart"/>
+            <w:r>
+              <w:rPr>
+                <w:rFonts w:asciiTheme="majorHAnsi" w:hAnsiTheme="majorHAnsi" w:cs="Arial"/>
+                <w:szCs w:val="26"/>
+                <w:lang w:val="es-CO"/>
+              </w:rPr>
+              <w:t>empresa_privada</w:t>
+            </w:r>
+            <w:proofErr w:type="spellEnd"/>
+            <w:r>
+              <w:rPr>
+                <w:rFonts w:asciiTheme="majorHAnsi" w:hAnsiTheme="majorHAnsi" w:cs="Arial"/>
+                <w:szCs w:val="26"/>
+                <w:lang w:val="es-CO"/>
+              </w:rPr>
+              <w:t>}</w:t>
             </w:r>
           </w:p>
         </w:tc>
@@ -4255,6 +4301,7 @@
                 <w:lang w:val="es-CO"/>
               </w:rPr>
             </w:pPr>
+            <w:proofErr w:type="gramStart"/>
             <w:r>
               <w:rPr>
                 <w:rFonts w:asciiTheme="majorHAnsi" w:hAnsiTheme="majorHAnsi" w:cs="Arial"/>
@@ -4274,6 +4321,7 @@
               <w:t>{</w:t>
             </w:r>
             <w:proofErr w:type="spellStart"/>
+            <w:proofErr w:type="gramEnd"/>
             <w:r>
               <w:rPr>
                 <w:rFonts w:asciiTheme="majorHAnsi" w:hAnsiTheme="majorHAnsi" w:cs="Arial"/>
@@ -4458,6 +4506,7 @@
                 <w:lang w:val="es-CO"/>
               </w:rPr>
             </w:pPr>
+            <w:proofErr w:type="gramStart"/>
             <w:r>
               <w:rPr>
                 <w:rFonts w:asciiTheme="majorHAnsi" w:hAnsiTheme="majorHAnsi" w:cs="Arial"/>
@@ -4477,6 +4526,7 @@
               <w:t>{</w:t>
             </w:r>
             <w:proofErr w:type="spellStart"/>
+            <w:proofErr w:type="gramEnd"/>
             <w:r>
               <w:rPr>
                 <w:rFonts w:asciiTheme="majorHAnsi" w:hAnsiTheme="majorHAnsi" w:cs="Arial"/>
@@ -5317,6 +5367,7 @@
                 <w:lang w:val="es-CO"/>
               </w:rPr>
             </w:pPr>
+            <w:proofErr w:type="gramStart"/>
             <w:r>
               <w:rPr>
                 <w:rFonts w:asciiTheme="majorHAnsi" w:hAnsiTheme="majorHAnsi" w:cs="Arial"/>
@@ -5333,7 +5384,17 @@
                 <w:szCs w:val="26"/>
                 <w:lang w:val="es-CO"/>
               </w:rPr>
-              <w:t>{dia_inicio2}</w:t>
+              <w:t>{</w:t>
+            </w:r>
+            <w:proofErr w:type="gramEnd"/>
+            <w:r>
+              <w:rPr>
+                <w:rFonts w:asciiTheme="majorHAnsi" w:hAnsiTheme="majorHAnsi" w:cs="Arial"/>
+                <w:sz w:val="20"/>
+                <w:szCs w:val="26"/>
+                <w:lang w:val="es-CO"/>
+              </w:rPr>
+              <w:t>dia_inicio2}</w:t>
             </w:r>
             <w:r>
               <w:rPr>
@@ -5424,6 +5485,7 @@
                 <w:lang w:val="es-CO"/>
               </w:rPr>
             </w:pPr>
+            <w:proofErr w:type="gramStart"/>
             <w:r>
               <w:rPr>
                 <w:rFonts w:asciiTheme="majorHAnsi" w:hAnsiTheme="majorHAnsi" w:cs="Arial"/>
@@ -5440,7 +5502,17 @@
                 <w:szCs w:val="26"/>
                 <w:lang w:val="es-CO"/>
               </w:rPr>
-              <w:t>{dia_fin2}</w:t>
+              <w:t>{</w:t>
+            </w:r>
+            <w:proofErr w:type="gramEnd"/>
+            <w:r>
+              <w:rPr>
+                <w:rFonts w:asciiTheme="majorHAnsi" w:hAnsiTheme="majorHAnsi" w:cs="Arial"/>
+                <w:sz w:val="20"/>
+                <w:szCs w:val="26"/>
+                <w:lang w:val="es-CO"/>
+              </w:rPr>
+              <w:t>dia_fin2}</w:t>
             </w:r>
             <w:r>
               <w:rPr>
@@ -6144,6 +6216,7 @@
                 <w:lang w:val="es-CO"/>
               </w:rPr>
             </w:pPr>
+            <w:proofErr w:type="gramStart"/>
             <w:r>
               <w:rPr>
                 <w:rFonts w:asciiTheme="majorHAnsi" w:hAnsiTheme="majorHAnsi" w:cs="Arial"/>
@@ -6160,7 +6233,17 @@
                 <w:szCs w:val="26"/>
                 <w:lang w:val="es-CO"/>
               </w:rPr>
-              <w:t>{dia_inicio3}</w:t>
+              <w:t>{</w:t>
+            </w:r>
+            <w:proofErr w:type="gramEnd"/>
+            <w:r>
+              <w:rPr>
+                <w:rFonts w:asciiTheme="majorHAnsi" w:hAnsiTheme="majorHAnsi" w:cs="Arial"/>
+                <w:sz w:val="20"/>
+                <w:szCs w:val="26"/>
+                <w:lang w:val="es-CO"/>
+              </w:rPr>
+              <w:t>dia_inicio3}</w:t>
             </w:r>
             <w:r>
               <w:rPr>
@@ -6251,6 +6334,7 @@
                 <w:lang w:val="es-CO"/>
               </w:rPr>
             </w:pPr>
+            <w:proofErr w:type="gramStart"/>
             <w:r>
               <w:rPr>
                 <w:rFonts w:asciiTheme="majorHAnsi" w:hAnsiTheme="majorHAnsi" w:cs="Arial"/>
@@ -6267,7 +6351,17 @@
                 <w:szCs w:val="26"/>
                 <w:lang w:val="es-CO"/>
               </w:rPr>
-              <w:t>{dia_fin3}</w:t>
+              <w:t>{</w:t>
+            </w:r>
+            <w:proofErr w:type="gramEnd"/>
+            <w:r>
+              <w:rPr>
+                <w:rFonts w:asciiTheme="majorHAnsi" w:hAnsiTheme="majorHAnsi" w:cs="Arial"/>
+                <w:sz w:val="20"/>
+                <w:szCs w:val="26"/>
+                <w:lang w:val="es-CO"/>
+              </w:rPr>
+              <w:t>dia_fin3}</w:t>
             </w:r>
             <w:r>
               <w:rPr>
@@ -12672,7 +12766,7 @@
                       <a:effectLst/>
                       <a:extLst>
                         <a:ext uri="{C572A759-6A51-4108-AA02-DFA0A04FC94B}">
-                          <ma14:wrappingTextBoxFlag xmlns:ma14="http://schemas.microsoft.com/office/mac/drawingml/2011/main" xmlns:w="http://schemas.openxmlformats.org/wordprocessingml/2006/main" xmlns:w10="urn:schemas-microsoft-com:office:word" xmlns:v="urn:schemas-microsoft-com:vml" xmlns:o="urn:schemas-microsoft-com:office:office" xmlns:mv="urn:schemas-microsoft-com:mac:vml" xmlns:mo="http://schemas.microsoft.com/office/mac/office/2008/main" xmlns="" xmlns:arto="http://schemas.microsoft.com/office/word/2006/arto"/>
+                          <ma14:wrappingTextBoxFlag xmlns:arto="http://schemas.microsoft.com/office/word/2006/arto" xmlns="" xmlns:mo="http://schemas.microsoft.com/office/mac/office/2008/main" xmlns:mv="urn:schemas-microsoft-com:mac:vml" xmlns:o="urn:schemas-microsoft-com:office:office" xmlns:v="urn:schemas-microsoft-com:vml" xmlns:w10="urn:schemas-microsoft-com:office:word" xmlns:w="http://schemas.openxmlformats.org/wordprocessingml/2006/main" xmlns:ma14="http://schemas.microsoft.com/office/mac/drawingml/2011/main"/>
                         </a:ext>
                       </a:extLst>
                     </wps:spPr>

</xml_diff>

<commit_message>
fix: corrección definitiva de ortografía (identificadora) y ajustes de hoja de vida
</commit_message>
<xml_diff>
--- a/public/templates/hoja_de_vida_template.docx
+++ b/public/templates/hoja_de_vida_template.docx
@@ -3851,15 +3851,7 @@
                 <w:szCs w:val="26"/>
                 <w:lang w:val="es-CO"/>
               </w:rPr>
-              <w:t>empresa_p</w:t>
-            </w:r>
-            <w:r>
-              <w:rPr>
-                <w:rFonts w:asciiTheme="majorHAnsi" w:hAnsiTheme="majorHAnsi" w:cs="Arial"/>
-                <w:szCs w:val="26"/>
-                <w:lang w:val="es-CO"/>
-              </w:rPr>
-              <w:t>ublica</w:t>
+              <w:t>empresa_publica</w:t>
             </w:r>
             <w:proofErr w:type="spellEnd"/>
             <w:r>
@@ -4301,7 +4293,6 @@
                 <w:lang w:val="es-CO"/>
               </w:rPr>
             </w:pPr>
-            <w:proofErr w:type="gramStart"/>
             <w:r>
               <w:rPr>
                 <w:rFonts w:asciiTheme="majorHAnsi" w:hAnsiTheme="majorHAnsi" w:cs="Arial"/>
@@ -4321,7 +4312,6 @@
               <w:t>{</w:t>
             </w:r>
             <w:proofErr w:type="spellStart"/>
-            <w:proofErr w:type="gramEnd"/>
             <w:r>
               <w:rPr>
                 <w:rFonts w:asciiTheme="majorHAnsi" w:hAnsiTheme="majorHAnsi" w:cs="Arial"/>
@@ -4506,7 +4496,6 @@
                 <w:lang w:val="es-CO"/>
               </w:rPr>
             </w:pPr>
-            <w:proofErr w:type="gramStart"/>
             <w:r>
               <w:rPr>
                 <w:rFonts w:asciiTheme="majorHAnsi" w:hAnsiTheme="majorHAnsi" w:cs="Arial"/>
@@ -4526,7 +4515,6 @@
               <w:t>{</w:t>
             </w:r>
             <w:proofErr w:type="spellStart"/>
-            <w:proofErr w:type="gramEnd"/>
             <w:r>
               <w:rPr>
                 <w:rFonts w:asciiTheme="majorHAnsi" w:hAnsiTheme="majorHAnsi" w:cs="Arial"/>
@@ -5367,7 +5355,6 @@
                 <w:lang w:val="es-CO"/>
               </w:rPr>
             </w:pPr>
-            <w:proofErr w:type="gramStart"/>
             <w:r>
               <w:rPr>
                 <w:rFonts w:asciiTheme="majorHAnsi" w:hAnsiTheme="majorHAnsi" w:cs="Arial"/>
@@ -5384,17 +5371,7 @@
                 <w:szCs w:val="26"/>
                 <w:lang w:val="es-CO"/>
               </w:rPr>
-              <w:t>{</w:t>
-            </w:r>
-            <w:proofErr w:type="gramEnd"/>
-            <w:r>
-              <w:rPr>
-                <w:rFonts w:asciiTheme="majorHAnsi" w:hAnsiTheme="majorHAnsi" w:cs="Arial"/>
-                <w:sz w:val="20"/>
-                <w:szCs w:val="26"/>
-                <w:lang w:val="es-CO"/>
-              </w:rPr>
-              <w:t>dia_inicio2}</w:t>
+              <w:t>{dia_inicio2}</w:t>
             </w:r>
             <w:r>
               <w:rPr>
@@ -5485,7 +5462,6 @@
                 <w:lang w:val="es-CO"/>
               </w:rPr>
             </w:pPr>
-            <w:proofErr w:type="gramStart"/>
             <w:r>
               <w:rPr>
                 <w:rFonts w:asciiTheme="majorHAnsi" w:hAnsiTheme="majorHAnsi" w:cs="Arial"/>
@@ -5502,17 +5478,7 @@
                 <w:szCs w:val="26"/>
                 <w:lang w:val="es-CO"/>
               </w:rPr>
-              <w:t>{</w:t>
-            </w:r>
-            <w:proofErr w:type="gramEnd"/>
-            <w:r>
-              <w:rPr>
-                <w:rFonts w:asciiTheme="majorHAnsi" w:hAnsiTheme="majorHAnsi" w:cs="Arial"/>
-                <w:sz w:val="20"/>
-                <w:szCs w:val="26"/>
-                <w:lang w:val="es-CO"/>
-              </w:rPr>
-              <w:t>dia_fin2}</w:t>
+              <w:t>{dia_fin2}</w:t>
             </w:r>
             <w:r>
               <w:rPr>
@@ -6216,7 +6182,6 @@
                 <w:lang w:val="es-CO"/>
               </w:rPr>
             </w:pPr>
-            <w:proofErr w:type="gramStart"/>
             <w:r>
               <w:rPr>
                 <w:rFonts w:asciiTheme="majorHAnsi" w:hAnsiTheme="majorHAnsi" w:cs="Arial"/>
@@ -6233,17 +6198,7 @@
                 <w:szCs w:val="26"/>
                 <w:lang w:val="es-CO"/>
               </w:rPr>
-              <w:t>{</w:t>
-            </w:r>
-            <w:proofErr w:type="gramEnd"/>
-            <w:r>
-              <w:rPr>
-                <w:rFonts w:asciiTheme="majorHAnsi" w:hAnsiTheme="majorHAnsi" w:cs="Arial"/>
-                <w:sz w:val="20"/>
-                <w:szCs w:val="26"/>
-                <w:lang w:val="es-CO"/>
-              </w:rPr>
-              <w:t>dia_inicio3}</w:t>
+              <w:t>{dia_inicio3}</w:t>
             </w:r>
             <w:r>
               <w:rPr>
@@ -6334,7 +6289,6 @@
                 <w:lang w:val="es-CO"/>
               </w:rPr>
             </w:pPr>
-            <w:proofErr w:type="gramStart"/>
             <w:r>
               <w:rPr>
                 <w:rFonts w:asciiTheme="majorHAnsi" w:hAnsiTheme="majorHAnsi" w:cs="Arial"/>
@@ -6351,17 +6305,7 @@
                 <w:szCs w:val="26"/>
                 <w:lang w:val="es-CO"/>
               </w:rPr>
-              <w:t>{</w:t>
-            </w:r>
-            <w:proofErr w:type="gramEnd"/>
-            <w:r>
-              <w:rPr>
-                <w:rFonts w:asciiTheme="majorHAnsi" w:hAnsiTheme="majorHAnsi" w:cs="Arial"/>
-                <w:sz w:val="20"/>
-                <w:szCs w:val="26"/>
-                <w:lang w:val="es-CO"/>
-              </w:rPr>
-              <w:t>dia_fin3}</w:t>
+              <w:t>{dia_fin3}</w:t>
             </w:r>
             <w:r>
               <w:rPr>
@@ -12108,8 +12052,12 @@
       </w:r>
     </w:p>
     <w:sectPr>
-      <w:headerReference w:type="default" r:id="rId8"/>
-      <w:footerReference w:type="default" r:id="rId9"/>
+      <w:headerReference w:type="even" r:id="rId8"/>
+      <w:headerReference w:type="default" r:id="rId9"/>
+      <w:footerReference w:type="even" r:id="rId10"/>
+      <w:footerReference w:type="default" r:id="rId11"/>
+      <w:headerReference w:type="first" r:id="rId12"/>
+      <w:footerReference w:type="first" r:id="rId13"/>
       <w:pgSz w:w="12240" w:h="15840"/>
       <w:pgMar w:top="1702" w:right="1701" w:bottom="993" w:left="1701" w:header="426" w:footer="708" w:gutter="0"/>
       <w:cols w:space="708"/>
@@ -12139,6 +12087,16 @@
 </file>
 
 <file path=word/footer1.xml><?xml version="1.0" encoding="utf-8"?>
+<w:ftr xmlns:wpc="http://schemas.microsoft.com/office/word/2010/wordprocessingCanvas" xmlns:cx="http://schemas.microsoft.com/office/drawing/2014/chartex" xmlns:cx1="http://schemas.microsoft.com/office/drawing/2015/9/8/chartex" xmlns:cx2="http://schemas.microsoft.com/office/drawing/2015/10/21/chartex" xmlns:cx3="http://schemas.microsoft.com/office/drawing/2016/5/9/chartex" xmlns:cx4="http://schemas.microsoft.com/office/drawing/2016/5/10/chartex" xmlns:cx5="http://schemas.microsoft.com/office/drawing/2016/5/11/chartex" xmlns:cx6="http://schemas.microsoft.com/office/drawing/2016/5/12/chartex" xmlns:cx7="http://schemas.microsoft.com/office/drawing/2016/5/13/chartex" xmlns:cx8="http://schemas.microsoft.com/office/drawing/2016/5/14/chartex" xmlns:mc="http://schemas.openxmlformats.org/markup-compatibility/2006" xmlns:aink="http://schemas.microsoft.com/office/drawing/2016/ink" xmlns:am3d="http://schemas.microsoft.com/office/drawing/2017/model3d" xmlns:o="urn:schemas-microsoft-com:office:office" xmlns:oel="http://schemas.microsoft.com/office/2019/extlst" xmlns:r="http://schemas.openxmlformats.org/officeDocument/2006/relationships" xmlns:m="http://schemas.openxmlformats.org/officeDocument/2006/math" xmlns:v="urn:schemas-microsoft-com:vml" xmlns:wp14="http://schemas.microsoft.com/office/word/2010/wordprocessingDrawing" xmlns:wp="http://schemas.openxmlformats.org/drawingml/2006/wordprocessingDrawing" xmlns:w10="urn:schemas-microsoft-com:office:word" xmlns:w="http://schemas.openxmlformats.org/wordprocessingml/2006/main" xmlns:w14="http://schemas.microsoft.com/office/word/2010/wordml" xmlns:w15="http://schemas.microsoft.com/office/word/2012/wordml" xmlns:w16cex="http://schemas.microsoft.com/office/word/2018/wordml/cex" xmlns:w16cid="http://schemas.microsoft.com/office/word/2016/wordml/cid" xmlns:w16="http://schemas.microsoft.com/office/word/2018/wordml" xmlns:w16sdtdh="http://schemas.microsoft.com/office/word/2020/wordml/sdtdatahash" xmlns:w16se="http://schemas.microsoft.com/office/word/2015/wordml/symex" xmlns:wpg="http://schemas.microsoft.com/office/word/2010/wordprocessingGroup" xmlns:wpi="http://schemas.microsoft.com/office/word/2010/wordprocessingInk" xmlns:wne="http://schemas.microsoft.com/office/word/2006/wordml" xmlns:wps="http://schemas.microsoft.com/office/word/2010/wordprocessingShape" mc:Ignorable="w14 w15 w16se w16cid w16 w16cex w16sdtdh wp14">
+  <w:p>
+    <w:pPr>
+      <w:pStyle w:val="Piedepgina"/>
+    </w:pPr>
+  </w:p>
+</w:ftr>
+</file>
+
+<file path=word/footer2.xml><?xml version="1.0" encoding="utf-8"?>
 <w:ftr xmlns:wpc="http://schemas.microsoft.com/office/word/2010/wordprocessingCanvas" xmlns:cx="http://schemas.microsoft.com/office/drawing/2014/chartex" xmlns:cx1="http://schemas.microsoft.com/office/drawing/2015/9/8/chartex" xmlns:cx2="http://schemas.microsoft.com/office/drawing/2015/10/21/chartex" xmlns:cx3="http://schemas.microsoft.com/office/drawing/2016/5/9/chartex" xmlns:cx4="http://schemas.microsoft.com/office/drawing/2016/5/10/chartex" xmlns:cx5="http://schemas.microsoft.com/office/drawing/2016/5/11/chartex" xmlns:cx6="http://schemas.microsoft.com/office/drawing/2016/5/12/chartex" xmlns:cx7="http://schemas.microsoft.com/office/drawing/2016/5/13/chartex" xmlns:cx8="http://schemas.microsoft.com/office/drawing/2016/5/14/chartex" xmlns:mc="http://schemas.openxmlformats.org/markup-compatibility/2006" xmlns:aink="http://schemas.microsoft.com/office/drawing/2016/ink" xmlns:am3d="http://schemas.microsoft.com/office/drawing/2017/model3d" xmlns:o="urn:schemas-microsoft-com:office:office" xmlns:oel="http://schemas.microsoft.com/office/2019/extlst" xmlns:r="http://schemas.openxmlformats.org/officeDocument/2006/relationships" xmlns:m="http://schemas.openxmlformats.org/officeDocument/2006/math" xmlns:v="urn:schemas-microsoft-com:vml" xmlns:wp14="http://schemas.microsoft.com/office/word/2010/wordprocessingDrawing" xmlns:wp="http://schemas.openxmlformats.org/drawingml/2006/wordprocessingDrawing" xmlns:w10="urn:schemas-microsoft-com:office:word" xmlns:w="http://schemas.openxmlformats.org/wordprocessingml/2006/main" xmlns:w14="http://schemas.microsoft.com/office/word/2010/wordml" xmlns:w15="http://schemas.microsoft.com/office/word/2012/wordml" xmlns:w16cex="http://schemas.microsoft.com/office/word/2018/wordml/cex" xmlns:w16cid="http://schemas.microsoft.com/office/word/2016/wordml/cid" xmlns:w16="http://schemas.microsoft.com/office/word/2018/wordml" xmlns:w16sdtdh="http://schemas.microsoft.com/office/word/2020/wordml/sdtdatahash" xmlns:w16se="http://schemas.microsoft.com/office/word/2015/wordml/symex" xmlns:wpg="http://schemas.microsoft.com/office/word/2010/wordprocessingGroup" xmlns:wpi="http://schemas.microsoft.com/office/word/2010/wordprocessingInk" xmlns:wne="http://schemas.microsoft.com/office/word/2006/wordml" xmlns:wps="http://schemas.microsoft.com/office/word/2010/wordprocessingShape" mc:Ignorable="w14 w15 w16se w16cid w16 w16cex w16sdtdh wp14">
   <w:p>
     <w:pPr>
@@ -12213,6 +12171,16 @@
 </w:ftr>
 </file>
 
+<file path=word/footer3.xml><?xml version="1.0" encoding="utf-8"?>
+<w:ftr xmlns:wpc="http://schemas.microsoft.com/office/word/2010/wordprocessingCanvas" xmlns:cx="http://schemas.microsoft.com/office/drawing/2014/chartex" xmlns:cx1="http://schemas.microsoft.com/office/drawing/2015/9/8/chartex" xmlns:cx2="http://schemas.microsoft.com/office/drawing/2015/10/21/chartex" xmlns:cx3="http://schemas.microsoft.com/office/drawing/2016/5/9/chartex" xmlns:cx4="http://schemas.microsoft.com/office/drawing/2016/5/10/chartex" xmlns:cx5="http://schemas.microsoft.com/office/drawing/2016/5/11/chartex" xmlns:cx6="http://schemas.microsoft.com/office/drawing/2016/5/12/chartex" xmlns:cx7="http://schemas.microsoft.com/office/drawing/2016/5/13/chartex" xmlns:cx8="http://schemas.microsoft.com/office/drawing/2016/5/14/chartex" xmlns:mc="http://schemas.openxmlformats.org/markup-compatibility/2006" xmlns:aink="http://schemas.microsoft.com/office/drawing/2016/ink" xmlns:am3d="http://schemas.microsoft.com/office/drawing/2017/model3d" xmlns:o="urn:schemas-microsoft-com:office:office" xmlns:oel="http://schemas.microsoft.com/office/2019/extlst" xmlns:r="http://schemas.openxmlformats.org/officeDocument/2006/relationships" xmlns:m="http://schemas.openxmlformats.org/officeDocument/2006/math" xmlns:v="urn:schemas-microsoft-com:vml" xmlns:wp14="http://schemas.microsoft.com/office/word/2010/wordprocessingDrawing" xmlns:wp="http://schemas.openxmlformats.org/drawingml/2006/wordprocessingDrawing" xmlns:w10="urn:schemas-microsoft-com:office:word" xmlns:w="http://schemas.openxmlformats.org/wordprocessingml/2006/main" xmlns:w14="http://schemas.microsoft.com/office/word/2010/wordml" xmlns:w15="http://schemas.microsoft.com/office/word/2012/wordml" xmlns:w16cex="http://schemas.microsoft.com/office/word/2018/wordml/cex" xmlns:w16cid="http://schemas.microsoft.com/office/word/2016/wordml/cid" xmlns:w16="http://schemas.microsoft.com/office/word/2018/wordml" xmlns:w16sdtdh="http://schemas.microsoft.com/office/word/2020/wordml/sdtdatahash" xmlns:w16se="http://schemas.microsoft.com/office/word/2015/wordml/symex" xmlns:wpg="http://schemas.microsoft.com/office/word/2010/wordprocessingGroup" xmlns:wpi="http://schemas.microsoft.com/office/word/2010/wordprocessingInk" xmlns:wne="http://schemas.microsoft.com/office/word/2006/wordml" xmlns:wps="http://schemas.microsoft.com/office/word/2010/wordprocessingShape" mc:Ignorable="w14 w15 w16se w16cid w16 w16cex w16sdtdh wp14">
+  <w:p>
+    <w:pPr>
+      <w:pStyle w:val="Piedepgina"/>
+    </w:pPr>
+  </w:p>
+</w:ftr>
+</file>
+
 <file path=word/footnotes.xml><?xml version="1.0" encoding="utf-8"?>
 <w:footnotes xmlns:wpc="http://schemas.microsoft.com/office/word/2010/wordprocessingCanvas" xmlns:cx="http://schemas.microsoft.com/office/drawing/2014/chartex" xmlns:cx1="http://schemas.microsoft.com/office/drawing/2015/9/8/chartex" xmlns:cx2="http://schemas.microsoft.com/office/drawing/2015/10/21/chartex" xmlns:cx3="http://schemas.microsoft.com/office/drawing/2016/5/9/chartex" xmlns:cx4="http://schemas.microsoft.com/office/drawing/2016/5/10/chartex" xmlns:cx5="http://schemas.microsoft.com/office/drawing/2016/5/11/chartex" xmlns:cx6="http://schemas.microsoft.com/office/drawing/2016/5/12/chartex" xmlns:cx7="http://schemas.microsoft.com/office/drawing/2016/5/13/chartex" xmlns:cx8="http://schemas.microsoft.com/office/drawing/2016/5/14/chartex" xmlns:mc="http://schemas.openxmlformats.org/markup-compatibility/2006" xmlns:aink="http://schemas.microsoft.com/office/drawing/2016/ink" xmlns:am3d="http://schemas.microsoft.com/office/drawing/2017/model3d" xmlns:o="urn:schemas-microsoft-com:office:office" xmlns:oel="http://schemas.microsoft.com/office/2019/extlst" xmlns:r="http://schemas.openxmlformats.org/officeDocument/2006/relationships" xmlns:m="http://schemas.openxmlformats.org/officeDocument/2006/math" xmlns:v="urn:schemas-microsoft-com:vml" xmlns:wp14="http://schemas.microsoft.com/office/word/2010/wordprocessingDrawing" xmlns:wp="http://schemas.openxmlformats.org/drawingml/2006/wordprocessingDrawing" xmlns:w10="urn:schemas-microsoft-com:office:word" xmlns:w="http://schemas.openxmlformats.org/wordprocessingml/2006/main" xmlns:w14="http://schemas.microsoft.com/office/word/2010/wordml" xmlns:w15="http://schemas.microsoft.com/office/word/2012/wordml" xmlns:w16cex="http://schemas.microsoft.com/office/word/2018/wordml/cex" xmlns:w16cid="http://schemas.microsoft.com/office/word/2016/wordml/cid" xmlns:w16="http://schemas.microsoft.com/office/word/2018/wordml" xmlns:w16sdtdh="http://schemas.microsoft.com/office/word/2020/wordml/sdtdatahash" xmlns:w16se="http://schemas.microsoft.com/office/word/2015/wordml/symex" xmlns:wpg="http://schemas.microsoft.com/office/word/2010/wordprocessingGroup" xmlns:wpi="http://schemas.microsoft.com/office/word/2010/wordprocessingInk" xmlns:wne="http://schemas.microsoft.com/office/word/2006/wordml" xmlns:wps="http://schemas.microsoft.com/office/word/2010/wordprocessingShape" mc:Ignorable="w14 w15 w16se w16cid w16 w16cex w16sdtdh wp14">
   <w:footnote w:type="separator" w:id="-1">
@@ -12233,6 +12201,16 @@
 </file>
 
 <file path=word/header1.xml><?xml version="1.0" encoding="utf-8"?>
+<w:hdr xmlns:wpc="http://schemas.microsoft.com/office/word/2010/wordprocessingCanvas" xmlns:cx="http://schemas.microsoft.com/office/drawing/2014/chartex" xmlns:cx1="http://schemas.microsoft.com/office/drawing/2015/9/8/chartex" xmlns:cx2="http://schemas.microsoft.com/office/drawing/2015/10/21/chartex" xmlns:cx3="http://schemas.microsoft.com/office/drawing/2016/5/9/chartex" xmlns:cx4="http://schemas.microsoft.com/office/drawing/2016/5/10/chartex" xmlns:cx5="http://schemas.microsoft.com/office/drawing/2016/5/11/chartex" xmlns:cx6="http://schemas.microsoft.com/office/drawing/2016/5/12/chartex" xmlns:cx7="http://schemas.microsoft.com/office/drawing/2016/5/13/chartex" xmlns:cx8="http://schemas.microsoft.com/office/drawing/2016/5/14/chartex" xmlns:mc="http://schemas.openxmlformats.org/markup-compatibility/2006" xmlns:aink="http://schemas.microsoft.com/office/drawing/2016/ink" xmlns:am3d="http://schemas.microsoft.com/office/drawing/2017/model3d" xmlns:o="urn:schemas-microsoft-com:office:office" xmlns:oel="http://schemas.microsoft.com/office/2019/extlst" xmlns:r="http://schemas.openxmlformats.org/officeDocument/2006/relationships" xmlns:m="http://schemas.openxmlformats.org/officeDocument/2006/math" xmlns:v="urn:schemas-microsoft-com:vml" xmlns:wp14="http://schemas.microsoft.com/office/word/2010/wordprocessingDrawing" xmlns:wp="http://schemas.openxmlformats.org/drawingml/2006/wordprocessingDrawing" xmlns:w10="urn:schemas-microsoft-com:office:word" xmlns:w="http://schemas.openxmlformats.org/wordprocessingml/2006/main" xmlns:w14="http://schemas.microsoft.com/office/word/2010/wordml" xmlns:w15="http://schemas.microsoft.com/office/word/2012/wordml" xmlns:w16cex="http://schemas.microsoft.com/office/word/2018/wordml/cex" xmlns:w16cid="http://schemas.microsoft.com/office/word/2016/wordml/cid" xmlns:w16="http://schemas.microsoft.com/office/word/2018/wordml" xmlns:w16sdtdh="http://schemas.microsoft.com/office/word/2020/wordml/sdtdatahash" xmlns:w16se="http://schemas.microsoft.com/office/word/2015/wordml/symex" xmlns:wpg="http://schemas.microsoft.com/office/word/2010/wordprocessingGroup" xmlns:wpi="http://schemas.microsoft.com/office/word/2010/wordprocessingInk" xmlns:wne="http://schemas.microsoft.com/office/word/2006/wordml" xmlns:wps="http://schemas.microsoft.com/office/word/2010/wordprocessingShape" mc:Ignorable="w14 w15 w16se w16cid w16 w16cex w16sdtdh wp14">
+  <w:p>
+    <w:pPr>
+      <w:pStyle w:val="Encabezado"/>
+    </w:pPr>
+  </w:p>
+</w:hdr>
+</file>
+
+<file path=word/header2.xml><?xml version="1.0" encoding="utf-8"?>
 <w:hdr xmlns:wpc="http://schemas.microsoft.com/office/word/2010/wordprocessingCanvas" xmlns:cx="http://schemas.microsoft.com/office/drawing/2014/chartex" xmlns:cx1="http://schemas.microsoft.com/office/drawing/2015/9/8/chartex" xmlns:cx2="http://schemas.microsoft.com/office/drawing/2015/10/21/chartex" xmlns:cx3="http://schemas.microsoft.com/office/drawing/2016/5/9/chartex" xmlns:cx4="http://schemas.microsoft.com/office/drawing/2016/5/10/chartex" xmlns:cx5="http://schemas.microsoft.com/office/drawing/2016/5/11/chartex" xmlns:cx6="http://schemas.microsoft.com/office/drawing/2016/5/12/chartex" xmlns:cx7="http://schemas.microsoft.com/office/drawing/2016/5/13/chartex" xmlns:cx8="http://schemas.microsoft.com/office/drawing/2016/5/14/chartex" xmlns:mc="http://schemas.openxmlformats.org/markup-compatibility/2006" xmlns:aink="http://schemas.microsoft.com/office/drawing/2016/ink" xmlns:am3d="http://schemas.microsoft.com/office/drawing/2017/model3d" xmlns:o="urn:schemas-microsoft-com:office:office" xmlns:oel="http://schemas.microsoft.com/office/2019/extlst" xmlns:r="http://schemas.openxmlformats.org/officeDocument/2006/relationships" xmlns:m="http://schemas.openxmlformats.org/officeDocument/2006/math" xmlns:v="urn:schemas-microsoft-com:vml" xmlns:wp14="http://schemas.microsoft.com/office/word/2010/wordprocessingDrawing" xmlns:wp="http://schemas.openxmlformats.org/drawingml/2006/wordprocessingDrawing" xmlns:w10="urn:schemas-microsoft-com:office:word" xmlns:w="http://schemas.openxmlformats.org/wordprocessingml/2006/main" xmlns:w14="http://schemas.microsoft.com/office/word/2010/wordml" xmlns:w15="http://schemas.microsoft.com/office/word/2012/wordml" xmlns:w16cex="http://schemas.microsoft.com/office/word/2018/wordml/cex" xmlns:w16cid="http://schemas.microsoft.com/office/word/2016/wordml/cid" xmlns:w16="http://schemas.microsoft.com/office/word/2018/wordml" xmlns:w16sdtdh="http://schemas.microsoft.com/office/word/2020/wordml/sdtdatahash" xmlns:w16se="http://schemas.microsoft.com/office/word/2015/wordml/symex" xmlns:wpg="http://schemas.microsoft.com/office/word/2010/wordprocessingGroup" xmlns:wpi="http://schemas.microsoft.com/office/word/2010/wordprocessingInk" xmlns:wne="http://schemas.microsoft.com/office/word/2006/wordml" xmlns:wps="http://schemas.microsoft.com/office/word/2010/wordprocessingShape" mc:Ignorable="w14 w15 w16se w16cid w16 w16cex w16sdtdh wp14">
   <w:p>
     <w:pPr>
@@ -12316,7 +12294,35 @@
                               <w:rFonts w:ascii="Lucida Calligraphy" w:hAnsi="Lucida Calligraphy" w:cs="Segoe UI"/>
                               <w:lang w:val="es-CO"/>
                             </w:rPr>
-                            <w:t>frase_indentificadora</w:t>
+                            <w:t>frase_ident</w:t>
+                          </w:r>
+                          <w:r>
+                            <w:rPr>
+                              <w:rFonts w:ascii="Lucida Calligraphy" w:hAnsi="Lucida Calligraphy" w:cs="Segoe UI"/>
+                              <w:lang w:val="es-CO"/>
+                            </w:rPr>
+                            <w:t>i</w:t>
+                          </w:r>
+                          <w:r>
+                            <w:rPr>
+                              <w:rFonts w:ascii="Lucida Calligraphy" w:hAnsi="Lucida Calligraphy" w:cs="Segoe UI"/>
+                              <w:lang w:val="es-CO"/>
+                            </w:rPr>
+                            <w:t>f</w:t>
+                          </w:r>
+                          <w:r>
+                            <w:rPr>
+                              <w:rFonts w:ascii="Lucida Calligraphy" w:hAnsi="Lucida Calligraphy" w:cs="Segoe UI"/>
+                              <w:lang w:val="es-CO"/>
+                            </w:rPr>
+                            <w:t>i</w:t>
+                          </w:r>
+                          <w:r>
+                            <w:rPr>
+                              <w:rFonts w:ascii="Lucida Calligraphy" w:hAnsi="Lucida Calligraphy" w:cs="Segoe UI"/>
+                              <w:lang w:val="es-CO"/>
+                            </w:rPr>
+                            <w:t>cadora</w:t>
                           </w:r>
                           <w:proofErr w:type="spellEnd"/>
                           <w:r>
@@ -12373,7 +12379,35 @@
                         <w:rFonts w:ascii="Lucida Calligraphy" w:hAnsi="Lucida Calligraphy" w:cs="Segoe UI"/>
                         <w:lang w:val="es-CO"/>
                       </w:rPr>
-                      <w:t>frase_indentificadora</w:t>
+                      <w:t>frase_ident</w:t>
+                    </w:r>
+                    <w:r>
+                      <w:rPr>
+                        <w:rFonts w:ascii="Lucida Calligraphy" w:hAnsi="Lucida Calligraphy" w:cs="Segoe UI"/>
+                        <w:lang w:val="es-CO"/>
+                      </w:rPr>
+                      <w:t>i</w:t>
+                    </w:r>
+                    <w:r>
+                      <w:rPr>
+                        <w:rFonts w:ascii="Lucida Calligraphy" w:hAnsi="Lucida Calligraphy" w:cs="Segoe UI"/>
+                        <w:lang w:val="es-CO"/>
+                      </w:rPr>
+                      <w:t>f</w:t>
+                    </w:r>
+                    <w:r>
+                      <w:rPr>
+                        <w:rFonts w:ascii="Lucida Calligraphy" w:hAnsi="Lucida Calligraphy" w:cs="Segoe UI"/>
+                        <w:lang w:val="es-CO"/>
+                      </w:rPr>
+                      <w:t>i</w:t>
+                    </w:r>
+                    <w:r>
+                      <w:rPr>
+                        <w:rFonts w:ascii="Lucida Calligraphy" w:hAnsi="Lucida Calligraphy" w:cs="Segoe UI"/>
+                        <w:lang w:val="es-CO"/>
+                      </w:rPr>
+                      <w:t>cadora</w:t>
                     </w:r>
                     <w:proofErr w:type="spellEnd"/>
                     <w:r>
@@ -12766,7 +12800,7 @@
                       <a:effectLst/>
                       <a:extLst>
                         <a:ext uri="{C572A759-6A51-4108-AA02-DFA0A04FC94B}">
-                          <ma14:wrappingTextBoxFlag xmlns:arto="http://schemas.microsoft.com/office/word/2006/arto" xmlns="" xmlns:mo="http://schemas.microsoft.com/office/mac/office/2008/main" xmlns:mv="urn:schemas-microsoft-com:mac:vml" xmlns:o="urn:schemas-microsoft-com:office:office" xmlns:v="urn:schemas-microsoft-com:vml" xmlns:w10="urn:schemas-microsoft-com:office:word" xmlns:w="http://schemas.openxmlformats.org/wordprocessingml/2006/main" xmlns:ma14="http://schemas.microsoft.com/office/mac/drawingml/2011/main"/>
+                          <ma14:wrappingTextBoxFlag xmlns:ma14="http://schemas.microsoft.com/office/mac/drawingml/2011/main" xmlns:w="http://schemas.openxmlformats.org/wordprocessingml/2006/main" xmlns:w10="urn:schemas-microsoft-com:office:word" xmlns:v="urn:schemas-microsoft-com:vml" xmlns:o="urn:schemas-microsoft-com:office:office" xmlns:mv="urn:schemas-microsoft-com:mac:vml" xmlns:mo="http://schemas.microsoft.com/office/mac/office/2008/main" xmlns="" xmlns:arto="http://schemas.microsoft.com/office/word/2006/arto"/>
                         </a:ext>
                       </a:extLst>
                     </wps:spPr>
@@ -12946,6 +12980,16 @@
         </mc:Fallback>
       </mc:AlternateContent>
     </w:r>
+  </w:p>
+</w:hdr>
+</file>
+
+<file path=word/header3.xml><?xml version="1.0" encoding="utf-8"?>
+<w:hdr xmlns:wpc="http://schemas.microsoft.com/office/word/2010/wordprocessingCanvas" xmlns:cx="http://schemas.microsoft.com/office/drawing/2014/chartex" xmlns:cx1="http://schemas.microsoft.com/office/drawing/2015/9/8/chartex" xmlns:cx2="http://schemas.microsoft.com/office/drawing/2015/10/21/chartex" xmlns:cx3="http://schemas.microsoft.com/office/drawing/2016/5/9/chartex" xmlns:cx4="http://schemas.microsoft.com/office/drawing/2016/5/10/chartex" xmlns:cx5="http://schemas.microsoft.com/office/drawing/2016/5/11/chartex" xmlns:cx6="http://schemas.microsoft.com/office/drawing/2016/5/12/chartex" xmlns:cx7="http://schemas.microsoft.com/office/drawing/2016/5/13/chartex" xmlns:cx8="http://schemas.microsoft.com/office/drawing/2016/5/14/chartex" xmlns:mc="http://schemas.openxmlformats.org/markup-compatibility/2006" xmlns:aink="http://schemas.microsoft.com/office/drawing/2016/ink" xmlns:am3d="http://schemas.microsoft.com/office/drawing/2017/model3d" xmlns:o="urn:schemas-microsoft-com:office:office" xmlns:oel="http://schemas.microsoft.com/office/2019/extlst" xmlns:r="http://schemas.openxmlformats.org/officeDocument/2006/relationships" xmlns:m="http://schemas.openxmlformats.org/officeDocument/2006/math" xmlns:v="urn:schemas-microsoft-com:vml" xmlns:wp14="http://schemas.microsoft.com/office/word/2010/wordprocessingDrawing" xmlns:wp="http://schemas.openxmlformats.org/drawingml/2006/wordprocessingDrawing" xmlns:w10="urn:schemas-microsoft-com:office:word" xmlns:w="http://schemas.openxmlformats.org/wordprocessingml/2006/main" xmlns:w14="http://schemas.microsoft.com/office/word/2010/wordml" xmlns:w15="http://schemas.microsoft.com/office/word/2012/wordml" xmlns:w16cex="http://schemas.microsoft.com/office/word/2018/wordml/cex" xmlns:w16cid="http://schemas.microsoft.com/office/word/2016/wordml/cid" xmlns:w16="http://schemas.microsoft.com/office/word/2018/wordml" xmlns:w16sdtdh="http://schemas.microsoft.com/office/word/2020/wordml/sdtdatahash" xmlns:w16se="http://schemas.microsoft.com/office/word/2015/wordml/symex" xmlns:wpg="http://schemas.microsoft.com/office/word/2010/wordprocessingGroup" xmlns:wpi="http://schemas.microsoft.com/office/word/2010/wordprocessingInk" xmlns:wne="http://schemas.microsoft.com/office/word/2006/wordml" xmlns:wps="http://schemas.microsoft.com/office/word/2010/wordprocessingShape" mc:Ignorable="w14 w15 w16se w16cid w16 w16cex w16sdtdh wp14">
+  <w:p>
+    <w:pPr>
+      <w:pStyle w:val="Encabezado"/>
+    </w:pPr>
   </w:p>
 </w:hdr>
 </file>

</xml_diff>